<commit_message>
Redesign the site, add seven diagrams, and tighten every claim after a source audit
- Report and Sources pages in the Task Board style: animated On this page menu, reading progress,
  page switch and back to top buttons, citation previews, red box on the cited source, source filter
- Seven SVG diagrams (wide and narrow), also in the PDF and Word file
- Copy buttons for the community summary, each X post and the whole thread
- Claims audit: self-serve scope (public permissionless) and Redbelly's credential-gated writing now stated,
  Fusion statements limited to the documented testnet list, 15 new quoted facts
- check.py: diagram SVG rules, diagram wording, both pages, no outside resources
</commit_message>
<xml_diff>
--- a/public/downloads/redbelly-overledger-feasibility-report.docx
+++ b/public/downloads/redbelly-overledger-feasibility-report.docx
@@ -15,17 +15,17 @@
         <w:rPr>
           <w:i/>
         </w:rPr>
-        <w:t>A feasibility report on interoperability between Redbelly Network and Quant's Overledger</w:t>
-      </w:r>
-    </w:p>
-    <w:p>
-      <w:r>
-        <w:t>Feasibility report, 15 October 2026</w:t>
-      </w:r>
-    </w:p>
-    <w:p>
-      <w:r>
-        <w:t>Feasibility research only. Redbelly and Quant have no announced partnership or talks [1], and nothing in this report suggests otherwise. Redbelly has not published an official position on bridging [1], so anything not found in a public source is marked Unknown.</w:t>
+        <w:t>A feasibility report on interoperability between Redbelly Network and Quant's Overledger.</w:t>
+      </w:r>
+    </w:p>
+    <w:p>
+      <w:r>
+        <w:t>Redbelly DAO community research. Feasibility report, sources last verified 15 Oct 2026. Web version: https://overledger.test-hub.xyz</w:t>
+      </w:r>
+    </w:p>
+    <w:p>
+      <w:r>
+        <w:t>Feasibility research only. Redbelly and Quant have no announced partnership or talks [S1], and nothing in this report suggests otherwise. Redbelly has not published an official position on bridging [S1], so any question that no public source answers is marked Unknown.</w:t>
       </w:r>
     </w:p>
     <w:p>
@@ -33,7 +33,7 @@
         <w:pStyle w:val="Heading1"/>
       </w:pPr>
       <w:r>
-        <w:t>How to read this report</w:t>
+        <w:t>How to read the labels</w:t>
       </w:r>
     </w:p>
     <w:p>
@@ -107,14 +107,15 @@
         <w:tblLook w:firstColumn="1" w:firstRow="1" w:lastColumn="0" w:lastRow="0" w:noHBand="0" w:noVBand="1" w:val="04A0"/>
       </w:tblPr>
       <w:tblGrid>
-        <w:gridCol w:w="2880"/>
-        <w:gridCol w:w="2880"/>
-        <w:gridCol w:w="2880"/>
+        <w:gridCol w:w="2493"/>
+        <w:gridCol w:w="2493"/>
+        <w:gridCol w:w="2493"/>
+        <w:gridCol w:w="2493"/>
       </w:tblGrid>
       <w:tr>
         <w:tc>
           <w:tcPr>
-            <w:tcW w:type="dxa" w:w="2880"/>
+            <w:tcW w:type="dxa" w:w="2493"/>
           </w:tcPr>
           <w:p>
             <w:r>
@@ -124,17 +125,27 @@
         </w:tc>
         <w:tc>
           <w:tcPr>
-            <w:tcW w:type="dxa" w:w="2880"/>
+            <w:tcW w:type="dxa" w:w="2493"/>
           </w:tcPr>
           <w:p>
             <w:r>
-              <w:t>Answer</w:t>
+              <w:t>Short answer</w:t>
             </w:r>
           </w:p>
         </w:tc>
         <w:tc>
           <w:tcPr>
-            <w:tcW w:type="dxa" w:w="2880"/>
+            <w:tcW w:type="dxa" w:w="2493"/>
+          </w:tcPr>
+          <w:p>
+            <w:r>
+              <w:t>Detail</w:t>
+            </w:r>
+          </w:p>
+        </w:tc>
+        <w:tc>
+          <w:tcPr>
+            <w:tcW w:type="dxa" w:w="2493"/>
           </w:tcPr>
           <w:p>
             <w:r>
@@ -146,27 +157,37 @@
       <w:tr>
         <w:tc>
           <w:tcPr>
-            <w:tcW w:type="dxa" w:w="2880"/>
+            <w:tcW w:type="dxa" w:w="2493"/>
           </w:tcPr>
           <w:p>
             <w:r>
-              <w:t>Can Redbelly reach Overledger's Gateway today, for reading data and sending signed transactions?</w:t>
+              <w:t>Could Overledger's Gateway reach Redbelly today, for reading data and sending signed transactions?</w:t>
             </w:r>
           </w:p>
         </w:tc>
         <w:tc>
           <w:tcPr>
-            <w:tcW w:type="dxa" w:w="2880"/>
+            <w:tcW w:type="dxa" w:w="2493"/>
           </w:tcPr>
           <w:p>
             <w:r>
-              <w:t>Possibly yes, as a self-serve EVM network, but nobody has shown it working. Four open points need a test with an Overledger account. [2, 3, 4]</w:t>
+              <w:t>Possibly</w:t>
             </w:r>
           </w:p>
         </w:tc>
         <w:tc>
           <w:tcPr>
-            <w:tcW w:type="dxa" w:w="2880"/>
+            <w:tcW w:type="dxa" w:w="2493"/>
+          </w:tcPr>
+          <w:p>
+            <w:r>
+              <w:t>Possibly, but unconfirmed. Redbelly is EVM compatible and its RPC fits Overledger's self-serve tests, but Overledger describes self-serve as for public permissionless networks, and writing to Redbelly needs a credential. Nobody has shown it working. [S2, S3, S4, S5]</w:t>
+            </w:r>
+          </w:p>
+        </w:tc>
+        <w:tc>
+          <w:tcPr>
+            <w:tcW w:type="dxa" w:w="2493"/>
           </w:tcPr>
           <w:p>
             <w:r>
@@ -178,7 +199,7 @@
       <w:tr>
         <w:tc>
           <w:tcPr>
-            <w:tcW w:type="dxa" w:w="2880"/>
+            <w:tcW w:type="dxa" w:w="2493"/>
           </w:tcPr>
           <w:p>
             <w:r>
@@ -188,49 +209,27 @@
         </w:tc>
         <w:tc>
           <w:tcPr>
-            <w:tcW w:type="dxa" w:w="2880"/>
+            <w:tcW w:type="dxa" w:w="2493"/>
           </w:tcPr>
           <w:p>
             <w:r>
-              <w:t>Not possible yet. Redbelly is not among the documented connected networks, and the docs describe no self-serve way to add one. [5]</w:t>
+              <w:t>Not yet</w:t>
             </w:r>
           </w:p>
         </w:tc>
         <w:tc>
           <w:tcPr>
-            <w:tcW w:type="dxa" w:w="2880"/>
+            <w:tcW w:type="dxa" w:w="2493"/>
           </w:tcPr>
           <w:p>
             <w:r>
-              <w:t>Confirmed</w:t>
-            </w:r>
-          </w:p>
-        </w:tc>
-      </w:tr>
-      <w:tr>
-        <w:tc>
-          <w:tcPr>
-            <w:tcW w:type="dxa" w:w="2880"/>
-          </w:tcPr>
-          <w:p>
-            <w:r>
-              <w:t>Would Receptor credentials and Tokeniser rules travel with an asset to another chain?</w:t>
+              <w:t>Not possible yet, as far as public sources show. Redbelly is not among the networks documented at testnet launch, and the docs describe no self-serve way to add one. [S6, S7]</w:t>
             </w:r>
           </w:p>
         </w:tc>
         <w:tc>
           <w:tcPr>
-            <w:tcW w:type="dxa" w:w="2880"/>
-          </w:tcPr>
-          <w:p>
-            <w:r>
-              <w:t>No, not by themselves. They are enforced on Redbelly. Another chain only applies the rules its own contracts and policies enforce. [6, 7, 8]</w:t>
-            </w:r>
-          </w:p>
-        </w:tc>
-        <w:tc>
-          <w:tcPr>
-            <w:tcW w:type="dxa" w:w="2880"/>
+            <w:tcW w:type="dxa" w:w="2493"/>
           </w:tcPr>
           <w:p>
             <w:r>
@@ -242,7 +241,49 @@
       <w:tr>
         <w:tc>
           <w:tcPr>
-            <w:tcW w:type="dxa" w:w="2880"/>
+            <w:tcW w:type="dxa" w:w="2493"/>
+          </w:tcPr>
+          <w:p>
+            <w:r>
+              <w:t>Would Receptor credentials and Tokeniser rules travel with an asset to another chain?</w:t>
+            </w:r>
+          </w:p>
+        </w:tc>
+        <w:tc>
+          <w:tcPr>
+            <w:tcW w:type="dxa" w:w="2493"/>
+          </w:tcPr>
+          <w:p>
+            <w:r>
+              <w:t>No</w:t>
+            </w:r>
+          </w:p>
+        </w:tc>
+        <w:tc>
+          <w:tcPr>
+            <w:tcW w:type="dxa" w:w="2493"/>
+          </w:tcPr>
+          <w:p>
+            <w:r>
+              <w:t>No, not by themselves. Redbelly's access credential and Proof by Query checks run on Redbelly, and Tokeniser enforces its rules at the point of transfer. A copy on another chain follows only that chain's own rules. [S5, S8, S9]</w:t>
+            </w:r>
+          </w:p>
+        </w:tc>
+        <w:tc>
+          <w:tcPr>
+            <w:tcW w:type="dxa" w:w="2493"/>
+          </w:tcPr>
+          <w:p>
+            <w:r>
+              <w:t>Analysis</w:t>
+            </w:r>
+          </w:p>
+        </w:tc>
+      </w:tr>
+      <w:tr>
+        <w:tc>
+          <w:tcPr>
+            <w:tcW w:type="dxa" w:w="2493"/>
           </w:tcPr>
           <w:p>
             <w:r>
@@ -252,17 +293,27 @@
         </w:tc>
         <w:tc>
           <w:tcPr>
-            <w:tcW w:type="dxa" w:w="2880"/>
+            <w:tcW w:type="dxa" w:w="2493"/>
           </w:tcPr>
           <w:p>
             <w:r>
-              <w:t>None has been announced. [1]</w:t>
+              <w:t>None</w:t>
             </w:r>
           </w:p>
         </w:tc>
         <w:tc>
           <w:tcPr>
-            <w:tcW w:type="dxa" w:w="2880"/>
+            <w:tcW w:type="dxa" w:w="2493"/>
+          </w:tcPr>
+          <w:p>
+            <w:r>
+              <w:t>None has been announced. [S1]</w:t>
+            </w:r>
+          </w:p>
+        </w:tc>
+        <w:tc>
+          <w:tcPr>
+            <w:tcW w:type="dxa" w:w="2493"/>
           </w:tcPr>
           <w:p>
             <w:r>
@@ -289,7 +340,7 @@
         <w:t xml:space="preserve">[Confirmed] </w:t>
       </w:r>
       <w:r>
-        <w:t>On 24 September 2026 The Clearing House said it selected Quant to power its On-Chain Money Initiative, a payments network for clearing and settling tokenised deposits between financial institutions [9]. Quant's technology is to provide the network's interoperability, orchestration and transaction management layer [9], with connectivity to existing payment systems such as RTP and CHIPS [9]. Quant's own release says the same [10].</w:t>
+        <w:t>On 24 September 2026 The Clearing House said it selected Quant to power its On-Chain Money Initiative, a payments network for clearing and settling tokenised deposits between financial institutions [S10]. Quant's technology is to provide the network's interoperability, orchestration and transaction management layer [S10], with connectivity to existing payment systems such as RTP and CHIPS [S10]. Quant's own release says The Clearing House will use Quant's technology to bring on-chain capabilities to its tokenised deposit network [S11].</w:t>
       </w:r>
     </w:p>
     <w:p>
@@ -301,7 +352,7 @@
         <w:t xml:space="preserve">[Confirmed] </w:t>
       </w:r>
       <w:r>
-        <w:t>The network is expected to be available to participating institutions in the first half of 2027, and details on participation and use cases are still to be announced [9].</w:t>
+        <w:t>The network is expected to be available to participating institutions in the first half of 2027, and details on participation and use cases are still to be announced [S10].</w:t>
       </w:r>
     </w:p>
     <w:p>
@@ -313,7 +364,7 @@
         <w:t xml:space="preserve">[Unknown] </w:t>
       </w:r>
       <w:r>
-        <w:t>Neither announcement says which blockchains the network will reach. Whether it will connect to any public chain, Redbelly included, is not public [9].</w:t>
+        <w:t>Neither announcement names any blockchain the network will use or connect to, and neither mentions Redbelly. No public source we found says whether it will connect to Redbelly or to any other specific chain [S10].</w:t>
       </w:r>
     </w:p>
     <w:p>
@@ -333,7 +384,54 @@
         <w:t xml:space="preserve">[Confirmed] </w:t>
       </w:r>
       <w:r>
-        <w:t>Overledger is Quant's platform for building applications that span more than one blockchain [11]. It has three foundations: a Gateway that authenticates clients and routes requests [12]; Connectors that hide the differences between each chain's interface behind one common interface [12]; and the Fusion Rollup, a shared layer that anchors to several chains at once and supports deposits, withdrawals and cross-chain messages between them [12].</w:t>
+        <w:t>Overledger is Quant's platform for building applications that span more than one blockchain [S12]. It has three foundations: a Gateway that authenticates clients and routes requests [S13]; Connectors that put each chain's own RPC protocol behind one common interface [S13]; and the Fusion Rollup, a shared layer that anchors to several chains at once and supports deposits, withdrawals and cross-chain messages between them [S13].</w:t>
+      </w:r>
+    </w:p>
+    <w:p>
+      <w:r>
+        <w:drawing>
+          <wp:inline xmlns:a="http://schemas.openxmlformats.org/drawingml/2006/main" xmlns:pic="http://schemas.openxmlformats.org/drawingml/2006/picture">
+            <wp:extent cx="6120000" cy="4577760"/>
+            <wp:docPr id="1" name="Picture 1"/>
+            <wp:cNvGraphicFramePr>
+              <a:graphicFrameLocks noChangeAspect="1"/>
+            </wp:cNvGraphicFramePr>
+            <a:graphic>
+              <a:graphicData uri="http://schemas.openxmlformats.org/drawingml/2006/picture">
+                <pic:pic>
+                  <pic:nvPicPr>
+                    <pic:cNvPr id="0" name="fig-stack.png"/>
+                    <pic:cNvPicPr/>
+                  </pic:nvPicPr>
+                  <pic:blipFill>
+                    <a:blip r:embed="rId9"/>
+                    <a:stretch>
+                      <a:fillRect/>
+                    </a:stretch>
+                  </pic:blipFill>
+                  <pic:spPr>
+                    <a:xfrm>
+                      <a:off x="0" y="0"/>
+                      <a:ext cx="6120000" cy="4577760"/>
+                    </a:xfrm>
+                    <a:prstGeom prst="rect"/>
+                  </pic:spPr>
+                </pic:pic>
+              </a:graphicData>
+            </a:graphic>
+          </wp:inline>
+        </w:drawing>
+      </w:r>
+    </w:p>
+    <w:p>
+      <w:r>
+        <w:rPr>
+          <w:b/>
+        </w:rPr>
+        <w:t xml:space="preserve">Figure 1. Overledger in one picture. </w:t>
+      </w:r>
+      <w:r>
+        <w:t>The Gateway, Connectors and Flow Apps are the switchboard [S12, S13]. The Fusion Rollup is a separate layer whose deposits, withdrawals and cross-chain messages run with the networks connected to it [S13], and Redbelly is not among the networks documented at testnet launch [S6].</w:t>
       </w:r>
     </w:p>
     <w:p>
@@ -345,7 +443,7 @@
         <w:t xml:space="preserve">[Analysis] </w:t>
       </w:r>
       <w:r>
-        <w:t>In plain terms, the Gateway and Connectors are a switchboard: one login and one interface to talk to many chains. The Fusion Rollup is different. It is a separate chain run by Quant's system that holds tokens deposited from the chains connected to it. A chain can be reachable through the switchboard without being connected to the Fusion Rollup [12].</w:t>
+        <w:t>In plain terms, the Gateway and Connectors are a switchboard: one login and one interface to talk to many chains [S13]. The Fusion Rollup is different. It is a separate EVM-compatible layer: tokens deposited from the chains connected to it appear as balances on the rollup and can be withdrawn back to those chains [S13]. The rollup connects to only a subset of the networks the Gateway reaches [S13], so a chain can be reachable through the switchboard without being connected to the Fusion Rollup.</w:t>
       </w:r>
     </w:p>
     <w:p>
@@ -357,7 +455,7 @@
         <w:t xml:space="preserve">[Confirmed] </w:t>
       </w:r>
       <w:r>
-        <w:t>Multi-step workflows such as signing or deploying a contract run as Flow Apps [12]. Signing can be done with the user's own keys [13], and the client never sees private key material [13].</w:t>
+        <w:t>Multi-step workflows such as signing or deploying a contract run as Flow Apps [S12]. Signing can be done with the user's own keys [S14], and the client never sees private key material [S14].</w:t>
       </w:r>
     </w:p>
     <w:p>
@@ -377,7 +475,54 @@
         <w:t xml:space="preserve">[Confirmed] </w:t>
       </w:r>
       <w:r>
-        <w:t>There are two routes. The self-serve route covers six chain families, including EVM, where an account can register a node and use the network without talking to Quant's account team [2]. The EVM family covers every EVM compatible chain [2]. The managed engagement route is for private or consortium networks, and for chain families Quant does not support yet [12].</w:t>
+        <w:t>There are two routes. The self-serve route covers six chain families, including EVM, where an account can register a node and use the network without talking to Quant's account team [S3]. The self-serve EVM family is described as covering every EVM-compatible chain [S3], but self-serve Connectors are for public, permissionless chain families [S3], and permissioned EVM networks such as permissioned Hyperledger Besu are on the engagement route [S3]. The managed engagement route is for private or consortium networks, and for chain families Quant does not support yet [S13].</w:t>
+      </w:r>
+    </w:p>
+    <w:p>
+      <w:r>
+        <w:drawing>
+          <wp:inline xmlns:a="http://schemas.openxmlformats.org/drawingml/2006/main" xmlns:pic="http://schemas.openxmlformats.org/drawingml/2006/picture">
+            <wp:extent cx="6120000" cy="5654880"/>
+            <wp:docPr id="2" name="Picture 2"/>
+            <wp:cNvGraphicFramePr>
+              <a:graphicFrameLocks noChangeAspect="1"/>
+            </wp:cNvGraphicFramePr>
+            <a:graphic>
+              <a:graphicData uri="http://schemas.openxmlformats.org/drawingml/2006/picture">
+                <pic:pic>
+                  <pic:nvPicPr>
+                    <pic:cNvPr id="0" name="fig-routes.png"/>
+                    <pic:cNvPicPr/>
+                  </pic:nvPicPr>
+                  <pic:blipFill>
+                    <a:blip r:embed="rId10"/>
+                    <a:stretch>
+                      <a:fillRect/>
+                    </a:stretch>
+                  </pic:blipFill>
+                  <pic:spPr>
+                    <a:xfrm>
+                      <a:off x="0" y="0"/>
+                      <a:ext cx="6120000" cy="5654880"/>
+                    </a:xfrm>
+                    <a:prstGeom prst="rect"/>
+                  </pic:spPr>
+                </pic:pic>
+              </a:graphicData>
+            </a:graphic>
+          </wp:inline>
+        </w:drawing>
+      </w:r>
+    </w:p>
+    <w:p>
+      <w:r>
+        <w:rPr>
+          <w:b/>
+        </w:rPr>
+        <w:t xml:space="preserve">Figure 2. Two ways a chain reaches Overledger. </w:t>
+      </w:r>
+      <w:r>
+        <w:t>Self-serve covers six chain families and needs no talk with Quant's account team: one API call or form registers a node and, for a new network, the network itself [S3]. Networks where node identity matters, and new chain families, go through an engagement [S3, S13].</w:t>
       </w:r>
     </w:p>
     <w:p>
@@ -389,7 +534,7 @@
         <w:t xml:space="preserve">[Confirmed] </w:t>
       </w:r>
       <w:r>
-        <w:t>A chain family qualifies for self-serve when its nodes offer an interface over HTTPS, need nothing beyond an API key, and it does not matter which node a client uses [2]. Networks where node identity matters, such as permissioned consortium chains and operator-gated public chains, are not self-serve today [2].</w:t>
+        <w:t>A chain family qualifies for self-serve when its nodes offer an interface over HTTPS, need nothing beyond an API key, and it does not matter which node a client uses [S3]. Networks where node identity matters, such as permissioned consortium chains and operator-gated public chains, are not self-serve today [S3].</w:t>
       </w:r>
     </w:p>
     <w:p>
@@ -401,7 +546,7 @@
         <w:t xml:space="preserve">[Confirmed] </w:t>
       </w:r>
       <w:r>
-        <w:t>A chain that is not listed yet, but belongs to a supported family, is added with the same registration call that adds a node. The first registration creates the network, and it then becomes available to other Overledger users [2].</w:t>
+        <w:t>A chain that is not listed yet, but belongs to one of the six self-serve families, is added with the same registration call that adds a node [S3]. The first registration creates the network, and it then becomes available to other Overledger users [S3].</w:t>
       </w:r>
     </w:p>
     <w:p>
@@ -413,7 +558,7 @@
         <w:t xml:space="preserve">[Confirmed] </w:t>
       </w:r>
       <w:r>
-        <w:t>Each node is registered as public or private. A public node is shared with all users and must come from an approved provider, and a private node can be any address but only its owner can use it [2]. The approved providers are Alchemy, Infura, QuickNode, Chainstack, GetBlock, Blockdaemon and Ankr [2], and a public node URL must carry the provider's API key [2]. A private node can be any reachable HTTPS address [2]. Every node must pass a health check before it is used [2].</w:t>
+        <w:t>Each node is registered as public or private. A public node must come from an approved provider and joins the shared pool for that network [S3], while a private node can be at any address but is scoped to the account that added it [S3]. The approved providers are Alchemy, Infura, QuickNode, Chainstack, GetBlock, Blockdaemon and Ankr [S3], and a public node URL must carry the provider's API key [S3]. A private node can be any reachable HTTPS address [S3]. Every node must pass a health check before it is used [S3].</w:t>
       </w:r>
     </w:p>
     <w:p>
@@ -425,7 +570,7 @@
         <w:t xml:space="preserve">[Confirmed] </w:t>
       </w:r>
       <w:r>
-        <w:t>When a brand-new chain family is needed, the documented effort is about 2 days for a health and chain identity checker, plus about 1 day for each app that needs to use it [2].</w:t>
+        <w:t>When a brand-new chain family is needed, the documented effort is about 2 days for a health and chain identity checker, plus about 1 day for each app that needs to use it [S3].</w:t>
       </w:r>
     </w:p>
     <w:p>
@@ -445,7 +590,7 @@
         <w:t xml:space="preserve">[Confirmed] </w:t>
       </w:r>
       <w:r>
-        <w:t>Redbelly is a layer 1 blockchain built for real world asset tokenisation [14]. It is compatible with the Ethereum Virtual Machine and runs smart contracts written for it [3]. Mainnet is chain ID 151 with a public RPC address [15], and Redbelly lists Ankr as a third-party public RPC provider for mainnet [15]. Testnet is chain ID 153 [15].</w:t>
+        <w:t>Redbelly is a layer 1 blockchain built for real world asset tokenisation [S15]. It is compatible with the Ethereum Virtual Machine and runs smart contracts written for it [S2]. Mainnet is chain ID 151 with a public RPC address [S16], and Redbelly lists Ankr as a third-party public RPC provider for mainnet [S16]. Testnet is chain ID 153 [S16].</w:t>
       </w:r>
     </w:p>
     <w:p>
@@ -457,7 +602,7 @@
         <w:t xml:space="preserve">[Tested] </w:t>
       </w:r>
       <w:r>
-        <w:t>On 15 October 2026 the official mainnet RPC and the Ankr RPC both answered with chain ID 151 (0x97) [4], and returned blocks [4]. The method net_version, which some older tools use to identify a network, returned "method does not exist" [4].</w:t>
+        <w:t>On 15 October 2026 the official mainnet RPC and the Ankr RPC both answered with chain ID 151 (0x97) [S4], and the official mainnet RPC returned the latest block [S4]. The method net_version, which gives a network ID to wallets and tools that predate eth_chainId [S6], returned "the method net_version does not exist/is not available" [S4].</w:t>
       </w:r>
     </w:p>
     <w:p>
@@ -469,7 +614,54 @@
         <w:t xml:space="preserve">[Confirmed] </w:t>
       </w:r>
       <w:r>
-        <w:t>Writing to Redbelly is gated by identity. Every user must claim an access credential from an accredited issuer before their account can write to the network [8], and all participants must prove who they are before gaining access [16]. Accredited issuers are listed in an on-chain registry [17]. Businesses can be verified as incorporated entities [18], and even node operators need network access for their accounts [19].</w:t>
+        <w:t>Writing to Redbelly is gated by identity. Every user must claim an access credential from an accredited issuer before their account can write to the network [S5], and all participants must prove who they are before gaining access [S17]. Accredited issuers are listed in an on-chain registry [S18]. Businesses can also be verified as incorporated entities [S17, S19], and even node operators need network access for their accounts [S20].</w:t>
+      </w:r>
+    </w:p>
+    <w:p>
+      <w:r>
+        <w:drawing>
+          <wp:inline xmlns:a="http://schemas.openxmlformats.org/drawingml/2006/main" xmlns:pic="http://schemas.openxmlformats.org/drawingml/2006/picture">
+            <wp:extent cx="6120000" cy="4002480"/>
+            <wp:docPr id="3" name="Picture 3"/>
+            <wp:cNvGraphicFramePr>
+              <a:graphicFrameLocks noChangeAspect="1"/>
+            </wp:cNvGraphicFramePr>
+            <a:graphic>
+              <a:graphicData uri="http://schemas.openxmlformats.org/drawingml/2006/picture">
+                <pic:pic>
+                  <pic:nvPicPr>
+                    <pic:cNvPr id="0" name="fig-access.png"/>
+                    <pic:cNvPicPr/>
+                  </pic:nvPicPr>
+                  <pic:blipFill>
+                    <a:blip r:embed="rId11"/>
+                    <a:stretch>
+                      <a:fillRect/>
+                    </a:stretch>
+                  </pic:blipFill>
+                  <pic:spPr>
+                    <a:xfrm>
+                      <a:off x="0" y="0"/>
+                      <a:ext cx="6120000" cy="4002480"/>
+                    </a:xfrm>
+                    <a:prstGeom prst="rect"/>
+                  </pic:spPr>
+                </pic:pic>
+              </a:graphicData>
+            </a:graphic>
+          </wp:inline>
+        </w:drawing>
+      </w:r>
+    </w:p>
+    <w:p>
+      <w:r>
+        <w:rPr>
+          <w:b/>
+        </w:rPr>
+        <w:t xml:space="preserve">Figure 3. Reading Redbelly is open, writing needs an access credential. </w:t>
+      </w:r>
+      <w:r>
+        <w:t>Every account must claim an access credential from an accredited issuer before it can write [S5, S18]. Reading through the public RPC needs no key, and both RPC addresses answered with chain ID 151 in our test [S4, S16]. Redbelly's developer portal lists three bridge routes [S21, S22, S23].</w:t>
       </w:r>
     </w:p>
     <w:p>
@@ -481,7 +673,7 @@
         <w:t xml:space="preserve">[Confirmed] </w:t>
       </w:r>
       <w:r>
-        <w:t>Receptor is Redbelly's identity and verifiable credential protocol [20], built on the W3C verifiable credential data model [20]. It supports two methods [21]. Proof by Query uses a zero knowledge verifier smart contract [7] and publishes identity state to the chain [7]. Selective Disclosure reveals chosen details to a verifier and can only be used off-chain [22]. The identifiers of Redbelly's accredited credential issuer are specific to Redbelly [23], and apps can use eligibility checks to control who may call their contract functions [24].</w:t>
+        <w:t>Receptor is Redbelly's identity and verifiable credential protocol [S24], built on the W3C verifiable credential data model [S24]. It supports two methods [S25]. Proof by Query uses a zero knowledge verifier smart contract [S8] and publishes identity state to the chain [S8]. Selective Disclosure uses BBS+ signatures [S26], reveals chosen details to a verifier, and can only be used off-chain [S26]. The documented issuer identifiers for Redbelly environments take the form did:receptor:redbelly [S27], and apps can use eligibility checks to control who may call their contract functions [S28].</w:t>
       </w:r>
     </w:p>
     <w:p>
@@ -493,7 +685,7 @@
         <w:t xml:space="preserve">[Confirmed] </w:t>
       </w:r>
       <w:r>
-        <w:t>Tokeniser runs on Redbelly [6] and enforces eligibility, identity and target market rules at the point of transfer, every time [6]. Before any trade proceeds, identity, eligibility and limits are checked [25]; transfers are recorded on the register in real time [26]; and pledged units stay locked until a loan is repaid [27]. Redbelly settles a transaction in a single round [6].</w:t>
+        <w:t>Tokeniser runs on Redbelly [S9] and enforces eligibility, identity and target market rules at the point of transfer, every time [S9]. Before any trade proceeds, identity, eligibility and limits are checked [S29]; transfers are recorded on the register in real time [S30]; and pledged units stay locked until a loan is repaid [S31]. Redbelly settles a transaction in a single round [S9].</w:t>
       </w:r>
     </w:p>
     <w:p>
@@ -505,7 +697,7 @@
         <w:t xml:space="preserve">[Confirmed] </w:t>
       </w:r>
       <w:r>
-        <w:t>Redbelly already has token bridges. Its developer portal lists routes through Celer cBridge [28], LayerZero with Stargate [29] and Lucid Labs [30]. Celer uses a pegged bridge method [31]. Redbelly announced Wrapped RBNT on Ethereum with the contract 0xb45f...bf13 [32], which the portal lists under Lucid Labs [30]. The portal lists a different Ethereum contract for the Celer route [28].</w:t>
+        <w:t>Redbelly already has token bridges. Its developer portal lists three routes: Celer cBridge [S21], LayerZero with Stargate [S22] and Lucid Labs [S23]. Celer uses a pegged bridge method [S32], and its RBNT route goes out from Redbelly but not back [S21]. Redbelly announced Wrapped RBNT on Ethereum with the contract 0xb45f...bf13 [S33], which the portal lists under Lucid Labs [S23]. The portal lists a different Ethereum contract for the Celer route [S21].</w:t>
       </w:r>
     </w:p>
     <w:p>
@@ -517,7 +709,7 @@
         <w:t xml:space="preserve">[Confirmed] </w:t>
       </w:r>
       <w:r>
-        <w:t>Community research for TASK-08 found LayerZero live on Redbelly mainnet [33] but no major interoperability protocol on Redbelly testnet [34], and built a lock-and-mint testnet bridge instead [33]. The TASK-16 playbook notes that the official bridges support only some routes [35].</w:t>
+        <w:t>Community research for TASK-08 found LayerZero live on Redbelly mainnet [S34]. A second TASK-08 entry found that, when it was written, no major interoperability protocol had deployed core messaging infrastructure to Redbelly testnet [S35], and the selected entry built a lock-and-mint testnet bridge [S34]. The TASK-16 playbook says the bridges it calls official, Reddex and Lucid, then supported only bridging USDC and USDT from BNB Chain [S36].</w:t>
       </w:r>
     </w:p>
     <w:p>
@@ -534,11 +726,58 @@
       </w:r>
     </w:p>
     <w:p>
+      <w:r>
+        <w:drawing>
+          <wp:inline xmlns:a="http://schemas.openxmlformats.org/drawingml/2006/main" xmlns:pic="http://schemas.openxmlformats.org/drawingml/2006/picture">
+            <wp:extent cx="6120000" cy="5055120"/>
+            <wp:docPr id="4" name="Picture 4"/>
+            <wp:cNvGraphicFramePr>
+              <a:graphicFrameLocks noChangeAspect="1"/>
+            </wp:cNvGraphicFramePr>
+            <a:graphic>
+              <a:graphicData uri="http://schemas.openxmlformats.org/drawingml/2006/picture">
+                <pic:pic>
+                  <pic:nvPicPr>
+                    <pic:cNvPr id="0" name="fig-levels.png"/>
+                    <pic:cNvPicPr/>
+                  </pic:nvPicPr>
+                  <pic:blipFill>
+                    <a:blip r:embed="rId12"/>
+                    <a:stretch>
+                      <a:fillRect/>
+                    </a:stretch>
+                  </pic:blipFill>
+                  <pic:spPr>
+                    <a:xfrm>
+                      <a:off x="0" y="0"/>
+                      <a:ext cx="6120000" cy="5055120"/>
+                    </a:xfrm>
+                    <a:prstGeom prst="rect"/>
+                  </pic:spPr>
+                </pic:pic>
+              </a:graphicData>
+            </a:graphic>
+          </wp:inline>
+        </w:drawing>
+      </w:r>
+    </w:p>
+    <w:p>
+      <w:r>
+        <w:rPr>
+          <w:b/>
+        </w:rPr>
+        <w:t xml:space="preserve">Figure 4. Three meanings of 'connect', three answers. </w:t>
+      </w:r>
+      <w:r>
+        <w:t>Level 1 rests on Redbelly's EVM compatibility and Overledger's self-serve EVM route [S2, S3], with open points: whether self-serve applies to a network where writing needs a credential, the health check, a keyed provider endpoint and the live lists [S3, S4, S7, S13]. Level 2 cannot be checked from public sources [S14]. Level 3 is not possible yet as far as public sources show [S5, S6, S37].</w:t>
+      </w:r>
+    </w:p>
+    <w:p>
       <w:pPr>
         <w:pStyle w:val="Heading2"/>
       </w:pPr>
       <w:r>
-        <w:t>Level 1: reaching Redbelly through the Overledger Gateway. Possibly yes, untested.</w:t>
+        <w:t>Level 1: reaching Redbelly through the Overledger Gateway. Possibly, unconfirmed.</w:t>
       </w:r>
     </w:p>
     <w:p>
@@ -550,7 +789,7 @@
         <w:t xml:space="preserve">[Analysis] </w:t>
       </w:r>
       <w:r>
-        <w:t>Redbelly is EVM compatible [3], and Overledger's EVM family covers every EVM compatible chain [2]. An unlisted network in a supported family can be added by the first node registration [2]. Redbelly appears to meet the three self-serve tests: its RPC works over HTTPS [4], reading needs no key [4], and Redbelly's access control applies to accounts, not to which node a client connects to [8]. Ankr, an approved provider [2], runs a Redbelly mainnet endpoint [15], and the official RPC could be added as a private node [2].</w:t>
+        <w:t>Redbelly is EVM compatible [S2], and Overledger's self-serve EVM family is described as covering EVM-compatible chains [S3]. An unlisted network in a self-serve family can be added by the first node registration [S3]. At the RPC level Redbelly appears to fit the self-serve tests [S3]: its RPC works over HTTPS and answered without a key, two different endpoints returned the same chain [S4], and its write rule is attached to accounts [S5], not to the node a client uses. Ankr, an approved provider [S3], runs a Redbelly mainnet endpoint [S16], and the official RPC could be added as a private node [S3].</w:t>
       </w:r>
     </w:p>
     <w:p>
@@ -562,7 +801,7 @@
         <w:t xml:space="preserve">[Analysis] </w:t>
       </w:r>
       <w:r>
-        <w:t>This level gives an institution one interface to read Redbelly data and send transactions it has signed itself. The Gateway forwards each request unchanged [2], so every Redbelly rule still applies. A transaction sent this way only succeeds if the sending account has Redbelly write access [8].</w:t>
+        <w:t>If it works, this level would give an institution one interface to read Redbelly data and send transactions it has signed itself. After its own access checks, the Gateway forwards the payload to a Redbelly node and passes back the native response unchanged [S3], so Redbelly's own rules still apply. A transaction sent this way only succeeds if the sending account has Redbelly write access [S5].</w:t>
       </w:r>
     </w:p>
     <w:p>
@@ -574,7 +813,7 @@
         <w:t xml:space="preserve">[Unknown] </w:t>
       </w:r>
       <w:r>
-        <w:t>Four points are open. First, the docs do not say which call the EVM health check uses [2]; if it relies on net_version, which Overledger still offers to older tools [5], Redbelly's answer [4] could fail the check. Second, a public node URL must carry a provider API key [2], and we did not confirm that Ankr's keyed service covers Redbelly. Third, the live network list [36] needs an Overledger login [37], so we could not see whether Redbelly is already listed. Fourth, Quant could still decide to treat Redbelly as an engagement network [2].</w:t>
+        <w:t>Four points are open. First, how Overledger would classify Redbelly. Self-serve is written for public, permissionless networks [S3], Overledger's own glossary calls a network where anyone can read but only allowlisted parties can write "public permissioned" [S13], and permissioned EVM networks are on the engagement route [S3]. Writing to Redbelly needs an access credential [S5], so Redbelly could be treated as an engagement network; the docs do not say. Second, the docs say only that the health check uses the chain's standard validation [S3] and that a checker does a chain identifier lookup [S3], not which call the EVM check uses. If it relies on net_version, Redbelly's answer [S4] could fail it. Third, a public node URL must carry a provider API key [S3], and we did not confirm that Ankr's keyed service covers Redbelly. Fourth, Overledger's live network list [S3] and the Fusion Rollup's list [S38] both answered "Missing authorization header" without an API key [S7], so we could not see whether Redbelly is already listed.</w:t>
       </w:r>
     </w:p>
     <w:p>
@@ -594,7 +833,7 @@
         <w:t xml:space="preserve">[Analysis] </w:t>
       </w:r>
       <w:r>
-        <w:t>Flow Apps run signing and other workflows [12]. The catalogue is not published [13] and every shipped app is built by Quant [13], so whether a given app accepts a self-serve EVM network such as Redbelly cannot be checked from public sources. If an app needs extra work for a new chain, the documented effort is about a day per app [2].</w:t>
+        <w:t>Flow Apps are multi-step workflows run through the Gateway [S12], and customers and partners can also host their own [S13]. The catalogue is not published [S14] and every shipped app is built by Quant [S14], so whether a given app accepts a self-serve EVM network such as Redbelly cannot be checked from public sources. The docs give an effort of about a day per app only for adding a brand-new chain family [S3]; they give no figure for a new network inside a family Overledger already supports.</w:t>
       </w:r>
     </w:p>
     <w:p>
@@ -602,7 +841,7 @@
         <w:pStyle w:val="Heading2"/>
       </w:pPr>
       <w:r>
-        <w:t>Level 3: joining the Fusion Rollup. Not possible yet.</w:t>
+        <w:t>Level 3: joining the Fusion Rollup.</w:t>
       </w:r>
     </w:p>
     <w:p>
@@ -614,7 +853,15 @@
         <w:t xml:space="preserve">[Confirmed] </w:t>
       </w:r>
       <w:r>
-        <w:t>The documented connected networks at testnet launch are Ethereum Sepolia, Polygon Amoy and Quant's permissioned Besu testnet [5]. Each connected chain carries the rollup's bridge and dispute contracts [5] and receives the rollup's state [5]. Token entries on the bridge are controlled by Quant's governance signers [38].</w:t>
+        <w:t>The networks documented as connected at testnet launch are Ethereum Sepolia, Polygon Amoy and Quant's permissioned Besu testnet [S6]. Each connected chain carries the rollup's bridge and dispute contracts [S6] and receives the rollup's state roots [S6]. Token entries on the bridge are controlled by Quant's governance signers [S37].</w:t>
+      </w:r>
+    </w:p>
+    <w:p>
+      <w:pPr>
+        <w:pStyle w:val="Heading2"/>
+      </w:pPr>
+      <w:r>
+        <w:t>Not possible yet, as far as public sources show.</w:t>
       </w:r>
     </w:p>
     <w:p>
@@ -626,7 +873,7 @@
         <w:t xml:space="preserve">[Analysis] </w:t>
       </w:r>
       <w:r>
-        <w:t>The documentation we read describes no self-serve way to add a chain to the Fusion Rollup. On Redbelly, every account that writes needs an access credential [8], so the accounts that deploy those contracts and post rollup state would each need Redbelly network access, and the organisation running them could be verified as a business [18]. This is the main missing piece for Level 3, and only Quant and Redbelly could resolve it.</w:t>
+        <w:t>Redbelly is not in the documented list, the live list could not be read without an API key [S7], and the documentation we read describes no self-serve way to add a chain to the Fusion Rollup. Joining would also have a Redbelly side: every account that writes needs an access credential [S5], so the accounts that deploy the rollup's contracts and post its state roots would each need Redbelly network access. No such work has been announced [S1].</w:t>
       </w:r>
     </w:p>
     <w:p>
@@ -639,7 +886,54 @@
     </w:p>
     <w:p>
       <w:r>
-        <w:t>Written for a non engineer. Steps marked Level 1 are small. Steps marked Level 3 need both Quant and Redbelly to take part, and no such work has been announced [1].</w:t>
+        <w:t>Written for a non engineer. Steps marked Level 1 are small. Steps marked Level 3 depend on Quant, because Redbelly is not among the documented Fusion Rollup networks [S6] and bridge tokens are added by Quant's governance [S37]; the accounts involved would also need Redbelly access [S5]. No such work has been announced [S1].</w:t>
+      </w:r>
+    </w:p>
+    <w:p>
+      <w:r>
+        <w:drawing>
+          <wp:inline xmlns:a="http://schemas.openxmlformats.org/drawingml/2006/main" xmlns:pic="http://schemas.openxmlformats.org/drawingml/2006/picture">
+            <wp:extent cx="6120000" cy="3647520"/>
+            <wp:docPr id="5" name="Picture 5"/>
+            <wp:cNvGraphicFramePr>
+              <a:graphicFrameLocks noChangeAspect="1"/>
+            </wp:cNvGraphicFramePr>
+            <a:graphic>
+              <a:graphicData uri="http://schemas.openxmlformats.org/drawingml/2006/picture">
+                <pic:pic>
+                  <pic:nvPicPr>
+                    <pic:cNvPr id="0" name="fig-work.png"/>
+                    <pic:cNvPicPr/>
+                  </pic:nvPicPr>
+                  <pic:blipFill>
+                    <a:blip r:embed="rId13"/>
+                    <a:stretch>
+                      <a:fillRect/>
+                    </a:stretch>
+                  </pic:blipFill>
+                  <pic:spPr>
+                    <a:xfrm>
+                      <a:off x="0" y="0"/>
+                      <a:ext cx="6120000" cy="3647520"/>
+                    </a:xfrm>
+                    <a:prstGeom prst="rect"/>
+                  </pic:spPr>
+                </pic:pic>
+              </a:graphicData>
+            </a:graphic>
+          </wp:inline>
+        </w:drawing>
+      </w:r>
+    </w:p>
+    <w:p>
+      <w:r>
+        <w:rPr>
+          <w:b/>
+        </w:rPr>
+        <w:t xml:space="preserve">Figure 5. The work, step by step. </w:t>
+      </w:r>
+      <w:r>
+        <w:t>Level 1 uses the self-serve route, with no account-team conversation, if Redbelly passes the health check [S3, S5]. Level 3 depends on Quant, and no such work has been announced [S1, S6, S9, S37].</w:t>
       </w:r>
     </w:p>
     <w:p>
@@ -653,66 +947,66 @@
     </w:p>
     <w:p>
       <w:pPr>
-        <w:pStyle w:val="ListBullet"/>
-      </w:pPr>
-      <w:r>
-        <w:t>Level 1, step 1: someone with an Overledger account registers a Redbelly node, either the official RPC as a private node or an approved provider's endpoint as a public node [2]. This is one form or one API call.</w:t>
-      </w:r>
-    </w:p>
-    <w:p>
-      <w:pPr>
-        <w:pStyle w:val="ListBullet"/>
-      </w:pPr>
-      <w:r>
-        <w:t>Level 1, step 2: the node has to pass Overledger's health check [2]. If the check fails on Redbelly, Quant would need to adjust its EVM checker; the documented effort for a full new checker is about 2 days [2].</w:t>
-      </w:r>
-    </w:p>
-    <w:p>
-      <w:pPr>
-        <w:pStyle w:val="ListBullet"/>
-      </w:pPr>
-      <w:r>
-        <w:t>Level 1, step 3: each institution that wants to send transactions needs a Redbelly access credential for every sending address [8], and business verification for the organisation [18]. They can sign with their own keys [13].</w:t>
-      </w:r>
-    </w:p>
-    <w:p>
-      <w:pPr>
-        <w:pStyle w:val="ListBullet"/>
-      </w:pPr>
-      <w:r>
-        <w:t>Level 3, step 1: the rollup's standard bridge and dispute contracts are deployed on Redbelly [5], from accounts that hold Redbelly access [8].</w:t>
-      </w:r>
-    </w:p>
-    <w:p>
-      <w:pPr>
-        <w:pStyle w:val="ListBullet"/>
-      </w:pPr>
-      <w:r>
-        <w:t>Level 3, step 2: the rollup's services start posting rollup state to Redbelly [5].</w:t>
-      </w:r>
-    </w:p>
-    <w:p>
-      <w:pPr>
-        <w:pStyle w:val="ListBullet"/>
-      </w:pPr>
-      <w:r>
-        <w:t>Level 3, step 3: each token that should move is added to the bridge token list by Quant's governance [38].</w:t>
-      </w:r>
-    </w:p>
-    <w:p>
-      <w:pPr>
-        <w:pStyle w:val="ListBullet"/>
-      </w:pPr>
-      <w:r>
-        <w:t>Level 3, step 4: issuers decide whether their asset contracts may hold or release tokens to the bridge contract, because Tokeniser checks eligibility on every transfer [6].</w:t>
-      </w:r>
-    </w:p>
-    <w:p>
-      <w:pPr>
-        <w:pStyle w:val="ListBullet"/>
-      </w:pPr>
-      <w:r>
-        <w:t>Level 3, step 5: someone has to keep Overledger's own allowlists [38] in step with Receptor credentials, because the two systems do not read each other.</w:t>
+        <w:pStyle w:val="ListNumber"/>
+      </w:pPr>
+      <w:r>
+        <w:t>Level 1, step 1: someone with an Overledger account registers a Redbelly node: the official RPC as a private node [S3] or, if an approved provider's keyed service covers Redbelly (not confirmed), that provider's endpoint as a public node [S3]. The first registration also adds the network [S3]. This is one form or one API call [S3].</w:t>
+      </w:r>
+    </w:p>
+    <w:p>
+      <w:pPr>
+        <w:pStyle w:val="ListNumber"/>
+      </w:pPr>
+      <w:r>
+        <w:t>Level 1, step 2: the node has to pass Overledger's health check [S3]. If the check fails, the node is not added, and the docs do not say what would happen next. For scale, a checker for a brand-new chain family is documented at about 2 days [S3].</w:t>
+      </w:r>
+    </w:p>
+    <w:p>
+      <w:pPr>
+        <w:pStyle w:val="ListNumber"/>
+      </w:pPr>
+      <w:r>
+        <w:t>Level 1, step 3: every address an institution sends from needs Redbelly write access, which its user enables after claiming an access credential from an accredited issuer [S5]. The organisation can also be verified as a business [S19]. They can sign with their own keys [S14].</w:t>
+      </w:r>
+    </w:p>
+    <w:p>
+      <w:pPr>
+        <w:pStyle w:val="ListNumber"/>
+      </w:pPr>
+      <w:r>
+        <w:t>Level 3, step 1: the rollup's standard bridge and dispute contracts are deployed on Redbelly [S6], from accounts that hold Redbelly access [S5].</w:t>
+      </w:r>
+    </w:p>
+    <w:p>
+      <w:pPr>
+        <w:pStyle w:val="ListNumber"/>
+      </w:pPr>
+      <w:r>
+        <w:t>Level 3, step 2: the rollup's services start posting rollup state roots to Redbelly for settlement [S6].</w:t>
+      </w:r>
+    </w:p>
+    <w:p>
+      <w:pPr>
+        <w:pStyle w:val="ListNumber"/>
+      </w:pPr>
+      <w:r>
+        <w:t>Level 3, step 3: each token that should move is added to the bridge token list by Quant's governance [S37].</w:t>
+      </w:r>
+    </w:p>
+    <w:p>
+      <w:pPr>
+        <w:pStyle w:val="ListNumber"/>
+      </w:pPr>
+      <w:r>
+        <w:t>Level 3, step 4: issuers decide whether their asset contracts may hold or release tokens to the bridge contract, because Tokeniser checks eligibility on every transfer [S9].</w:t>
+      </w:r>
+    </w:p>
+    <w:p>
+      <w:pPr>
+        <w:pStyle w:val="ListNumber"/>
+      </w:pPr>
+      <w:r>
+        <w:t>Level 3, step 5: someone would have to keep Overledger's own allowlists [S37] in step with Receptor credentials [S5], because neither system's documentation describes a link to the other.</w:t>
       </w:r>
     </w:p>
     <w:p>
@@ -724,7 +1018,7 @@
         <w:t xml:space="preserve">[Analysis] </w:t>
       </w:r>
       <w:r>
-        <w:t>Registering a node is a technical action any Overledger account can take [2]. It would not by itself mean any agreement between Redbelly and Quant.</w:t>
+        <w:t>Registering a node is a technical action any Overledger account can take [S3]. It would not by itself mean any agreement between Redbelly and Quant.</w:t>
       </w:r>
     </w:p>
     <w:p>
@@ -749,7 +1043,7 @@
         <w:pStyle w:val="ListBullet"/>
       </w:pPr>
       <w:r>
-        <w:t>One interface. An institution that already reaches other chains through Overledger [11] could read Redbelly and send its own signed transactions through the same Gateway, under the same firewall rules [38], without running its own Redbelly integration.</w:t>
+        <w:t>One interface. An institution that already reaches other chains through Overledger [S12] could read Redbelly and send its own signed transactions through the same Gateway and firewall checks [S13], without managing its own Redbelly RPC providers or node failover [S12], once a Redbelly node is registered [S3].</w:t>
       </w:r>
     </w:p>
     <w:p>
@@ -757,7 +1051,7 @@
         <w:pStyle w:val="ListBullet"/>
       </w:pPr>
       <w:r>
-        <w:t>Rules stay on Redbelly. At Level 1 the Gateway only forwards requests [2], so Receptor access and Tokeniser eligibility checks still apply to every transaction [6, 8].</w:t>
+        <w:t>Rules stay on Redbelly. At Level 1 the Gateway passes each payload to a Redbelly node and passes back the native response unchanged [S3], so Redbelly's access credential still applies to every sending account [S5], and Tokeniser's eligibility checks still apply to every transfer of a Tokeniser asset [S9].</w:t>
       </w:r>
     </w:p>
     <w:p>
@@ -765,7 +1059,7 @@
         <w:pStyle w:val="ListBullet"/>
       </w:pPr>
       <w:r>
-        <w:t>Key control. Institutions can keep and use their own keys in Overledger's model [13], which matches how a regulated holder would expect to operate.</w:t>
+        <w:t>Key control. Institutions can keep and use their own keys in Overledger's model [S14].</w:t>
       </w:r>
     </w:p>
     <w:p>
@@ -773,7 +1067,7 @@
         <w:pStyle w:val="ListBullet"/>
       </w:pPr>
       <w:r>
-        <w:t>Unified balances, only at Level 3. The Fusion Rollup can merge copies of the same token from several chains into one balance [5]. This is not available to Redbelly today [5].</w:t>
+        <w:t>Unified balances, only at Level 3. The Fusion Rollup can merge copies of the same token from several chains into one balance [S6]. Redbelly is not among the documented connected networks [S6], so as far as public sources show this is not available to Redbelly.</w:t>
       </w:r>
     </w:p>
     <w:p>
@@ -781,7 +1075,7 @@
         <w:pStyle w:val="ListBullet"/>
       </w:pPr>
       <w:r>
-        <w:t>A possible route to tokenised deposit networks. The Clearing House network will use Quant for interoperability [9]. Whether that network will ever reach Redbelly, or any public chain, is unknown [9].</w:t>
+        <w:t>No known route to tokenised deposit networks yet. The Clearing House network will use Quant's technology for its interoperability layer [S10], but the announcements do not say which chains it will use. Whether it will ever reach Redbelly, or any public chain, is unknown [S10].</w:t>
       </w:r>
     </w:p>
     <w:p>
@@ -793,7 +1087,7 @@
         <w:t xml:space="preserve">[Analysis] </w:t>
       </w:r>
       <w:r>
-        <w:t>Limits to weigh. Redbelly already connects to other chains through Celer, LayerZero and Lucid Labs [28, 29, 30], and Tokeniser points to EVM compatibility as its link to other networks [6]. Overledger would add an institutional access layer rather than a first route out. Level 3 would add another operator to the trust chain, and withdrawals from the rollup wait for a dispute window [5], unlike Redbelly's single round settlement [6].</w:t>
+        <w:t>Limits to weigh. Redbelly's developer portal already lists bridge routes through Celer, LayerZero and Lucid Labs [S21, S22, S23], and Tokeniser points to EVM compatibility as its link to other networks [S9]. Overledger would add an institutional access layer rather than a first route out. Level 3 would also put Quant's governance signers in the path, since they control which tokens may cross the Fusion bridge [S37], and withdrawals from the rollup wait for a dispute window [S6], unlike Redbelly's single round settlement [S9].</w:t>
       </w:r>
     </w:p>
     <w:p>
@@ -821,7 +1115,54 @@
         <w:t xml:space="preserve">[Analysis] </w:t>
       </w:r>
       <w:r>
-        <w:t>A Receptor credential is a W3C verifiable credential held by the user [20]. Its two uses travel differently. A Selective Disclosure proof is checked off-chain [22], so in principle any verifier could check it, including an externally hosted Overledger Flow App [12]; none exists today [13]. A Proof by Query check runs in a verifier contract against identity state published on Redbelly [7], so another chain cannot run the same check unless that setup is rebuilt there. The access credential that unlocks write access works only on Redbelly [8].</w:t>
+        <w:t>A Receptor credential is a W3C verifiable credential held by the user [S24]. Its two methods travel differently. A Selective Disclosure proof is checked off-chain [S26], so in principle any verifier could check it, including an externally hosted Overledger Flow App [S13]; we found no such app, and every shipped app is built by Quant [S14]. A Proof by Query check runs in a verifier contract against identity state published on Redbelly [S8], so another chain cannot run the same check unless that setup is rebuilt there. The access credential that unlocks write access applies to Redbelly only [S5].</w:t>
+      </w:r>
+    </w:p>
+    <w:p>
+      <w:r>
+        <w:drawing>
+          <wp:inline xmlns:a="http://schemas.openxmlformats.org/drawingml/2006/main" xmlns:pic="http://schemas.openxmlformats.org/drawingml/2006/picture">
+            <wp:extent cx="6120000" cy="4284000"/>
+            <wp:docPr id="6" name="Picture 6"/>
+            <wp:cNvGraphicFramePr>
+              <a:graphicFrameLocks noChangeAspect="1"/>
+            </wp:cNvGraphicFramePr>
+            <a:graphic>
+              <a:graphicData uri="http://schemas.openxmlformats.org/drawingml/2006/picture">
+                <pic:pic>
+                  <pic:nvPicPr>
+                    <pic:cNvPr id="0" name="fig-receptor.png"/>
+                    <pic:cNvPicPr/>
+                  </pic:nvPicPr>
+                  <pic:blipFill>
+                    <a:blip r:embed="rId14"/>
+                    <a:stretch>
+                      <a:fillRect/>
+                    </a:stretch>
+                  </pic:blipFill>
+                  <pic:spPr>
+                    <a:xfrm>
+                      <a:off x="0" y="0"/>
+                      <a:ext cx="6120000" cy="4284000"/>
+                    </a:xfrm>
+                    <a:prstGeom prst="rect"/>
+                  </pic:spPr>
+                </pic:pic>
+              </a:graphicData>
+            </a:graphic>
+          </wp:inline>
+        </w:drawing>
+      </w:r>
+    </w:p>
+    <w:p>
+      <w:r>
+        <w:rPr>
+          <w:b/>
+        </w:rPr>
+        <w:t xml:space="preserve">Figure 6. Which Receptor checks could work off Redbelly. </w:t>
+      </w:r>
+      <w:r>
+        <w:t>Receptor has two methods [S25]. Proof by Query runs in a verifier contract against identity state on Redbelly [S8]. Selective Disclosure uses BBS+ signatures and is checked off-chain [S26], so in principle it could be checked anywhere, but we found no Overledger app that does this; every shipped app is built by Quant [S13, S14]. The access credential applies to Redbelly only [S5].</w:t>
       </w:r>
     </w:p>
     <w:p>
@@ -841,7 +1182,54 @@
         <w:t xml:space="preserve">[Analysis] </w:t>
       </w:r>
       <w:r>
-        <w:t>A Tokeniser asset carries its rules in Redbelly contracts that check every transfer [6, 25]. A bridge moves an asset by locking it on one chain and issuing a copy on the other [33]. The copy obeys only the rules of the contract and policies on the other chain. Overledger's firewall decides access from its own list of users and their addresses [38], not from Receptor credentials.</w:t>
+        <w:t>Tokeniser enforces a Tokeniser asset's rules on Redbelly at every transfer [S9, S29]. A lock-and-mint bridge, the pattern of the TASK-08 testnet bridge [S34], locks the asset on one chain and issues a copy on the other. The copy obeys only the rules of the contracts and policies on the other chain. Overledger's firewall decides access from its own list of users and their addresses [S37], not from Receptor credentials.</w:t>
+      </w:r>
+    </w:p>
+    <w:p>
+      <w:r>
+        <w:drawing>
+          <wp:inline xmlns:a="http://schemas.openxmlformats.org/drawingml/2006/main" xmlns:pic="http://schemas.openxmlformats.org/drawingml/2006/picture">
+            <wp:extent cx="6120000" cy="4063680"/>
+            <wp:docPr id="7" name="Picture 7"/>
+            <wp:cNvGraphicFramePr>
+              <a:graphicFrameLocks noChangeAspect="1"/>
+            </wp:cNvGraphicFramePr>
+            <a:graphic>
+              <a:graphicData uri="http://schemas.openxmlformats.org/drawingml/2006/picture">
+                <pic:pic>
+                  <pic:nvPicPr>
+                    <pic:cNvPr id="0" name="fig-breaks.png"/>
+                    <pic:cNvPicPr/>
+                  </pic:nvPicPr>
+                  <pic:blipFill>
+                    <a:blip r:embed="rId15"/>
+                    <a:stretch>
+                      <a:fillRect/>
+                    </a:stretch>
+                  </pic:blipFill>
+                  <pic:spPr>
+                    <a:xfrm>
+                      <a:off x="0" y="0"/>
+                      <a:ext cx="6120000" cy="4063680"/>
+                    </a:xfrm>
+                    <a:prstGeom prst="rect"/>
+                  </pic:spPr>
+                </pic:pic>
+              </a:graphicData>
+            </a:graphic>
+          </wp:inline>
+        </w:drawing>
+      </w:r>
+    </w:p>
+    <w:p>
+      <w:r>
+        <w:rPr>
+          <w:b/>
+        </w:rPr>
+        <w:t xml:space="preserve">Figure 7. Where compliance could break. </w:t>
+      </w:r>
+      <w:r>
+        <w:t>Tokeniser enforces its rules on Redbelly at every transfer [S9, S29]. A bridge locks the asset and issues a copy elsewhere [S34], and the copy follows only the rules on that chain [S37]. The numbers match the list below [S6, S9, S30, S31, S37].</w:t>
       </w:r>
     </w:p>
     <w:p>
@@ -863,58 +1251,58 @@
     </w:p>
     <w:p>
       <w:pPr>
-        <w:pStyle w:val="ListBullet"/>
-      </w:pPr>
-      <w:r>
-        <w:t>A copy on another chain without eligibility checks could be passed to someone who never proved eligibility on Redbelly [6].</w:t>
-      </w:r>
-    </w:p>
-    <w:p>
-      <w:pPr>
-        <w:pStyle w:val="ListBullet"/>
-      </w:pPr>
-      <w:r>
-        <w:t>Two lists of who is allowed: Receptor credentials on Redbelly [8] and Overledger's allowlists [38]. If they drift apart, one system allows what the other refuses.</w:t>
-      </w:r>
-    </w:p>
-    <w:p>
-      <w:pPr>
-        <w:pStyle w:val="ListBullet"/>
-      </w:pPr>
-      <w:r>
-        <w:t>A revoked credential on Redbelly [8] does not reach a copy held elsewhere unless someone updates the other list [38].</w:t>
-      </w:r>
-    </w:p>
-    <w:p>
-      <w:pPr>
-        <w:pStyle w:val="ListBullet"/>
-      </w:pPr>
-      <w:r>
-        <w:t>Merged balances [5] could mix a restricted asset with an unrestricted copy of the same asset.</w:t>
-      </w:r>
-    </w:p>
-    <w:p>
-      <w:pPr>
-        <w:pStyle w:val="ListBullet"/>
-      </w:pPr>
-      <w:r>
-        <w:t>The list of tokens that may cross the Fusion bridge is set by Quant's governance [38], not by the issuer.</w:t>
-      </w:r>
-    </w:p>
-    <w:p>
-      <w:pPr>
-        <w:pStyle w:val="ListBullet"/>
-      </w:pPr>
-      <w:r>
-        <w:t>The register is kept on Redbelly in real time [26]. Units held on another chain, or locked in a bridge [27], need clear treatment in that register.</w:t>
-      </w:r>
-    </w:p>
-    <w:p>
-      <w:pPr>
-        <w:pStyle w:val="ListBullet"/>
-      </w:pPr>
-      <w:r>
-        <w:t>Settlement timing changes: rollup withdrawals wait for a dispute window [5], while Redbelly is final in one round [6].</w:t>
+        <w:pStyle w:val="ListNumber"/>
+      </w:pPr>
+      <w:r>
+        <w:t>A copy on another chain without eligibility checks could be passed to someone who never proved eligibility on Redbelly [S9].</w:t>
+      </w:r>
+    </w:p>
+    <w:p>
+      <w:pPr>
+        <w:pStyle w:val="ListNumber"/>
+      </w:pPr>
+      <w:r>
+        <w:t>Two lists of who is allowed: Receptor credentials on Redbelly [S5] and Overledger's allowlists [S37]. If they drift apart, one system allows what the other refuses.</w:t>
+      </w:r>
+    </w:p>
+    <w:p>
+      <w:pPr>
+        <w:pStyle w:val="ListNumber"/>
+      </w:pPr>
+      <w:r>
+        <w:t>A revoked credential on Redbelly [S5] does not reach a copy held elsewhere unless someone updates the other list [S37].</w:t>
+      </w:r>
+    </w:p>
+    <w:p>
+      <w:pPr>
+        <w:pStyle w:val="ListNumber"/>
+      </w:pPr>
+      <w:r>
+        <w:t>Merged balances [S6] could mix a restricted asset with an unrestricted copy of the same asset.</w:t>
+      </w:r>
+    </w:p>
+    <w:p>
+      <w:pPr>
+        <w:pStyle w:val="ListNumber"/>
+      </w:pPr>
+      <w:r>
+        <w:t>The list of tokens that may cross the Fusion bridge is set by Quant's governance [S37], not by the issuer.</w:t>
+      </w:r>
+    </w:p>
+    <w:p>
+      <w:pPr>
+        <w:pStyle w:val="ListNumber"/>
+      </w:pPr>
+      <w:r>
+        <w:t>The register is kept on Redbelly in real time [S30]. Units held on another chain, or locked in a bridge [S31], need clear treatment in that register.</w:t>
+      </w:r>
+    </w:p>
+    <w:p>
+      <w:pPr>
+        <w:pStyle w:val="ListNumber"/>
+      </w:pPr>
+      <w:r>
+        <w:t>Settlement timing changes: rollup withdrawals wait for a dispute window [S6], while Redbelly is final in one round [S9].</w:t>
       </w:r>
     </w:p>
     <w:p>
@@ -926,7 +1314,7 @@
         <w:t xml:space="preserve">[Analysis] </w:t>
       </w:r>
       <w:r>
-        <w:t>The lowest risk pattern is for regulated assets to stay on Redbelly and for Overledger to carry only instructions and data at Level 1, so that every transfer still meets Redbelly's checks [2, 6, 8].</w:t>
+        <w:t>The lowest risk pattern is for regulated assets to stay on Redbelly and for Overledger to carry only instructions and data at Level 1, so that every transfer still meets Redbelly's checks [S3, S5, S9].</w:t>
       </w:r>
     </w:p>
     <w:p>
@@ -944,13 +1332,13 @@
         <w:tblLook w:firstColumn="1" w:firstRow="1" w:lastColumn="0" w:lastRow="0" w:noHBand="0" w:noVBand="1" w:val="04A0"/>
       </w:tblPr>
       <w:tblGrid>
-        <w:gridCol w:w="4320"/>
-        <w:gridCol w:w="4320"/>
+        <w:gridCol w:w="4986"/>
+        <w:gridCol w:w="4986"/>
       </w:tblGrid>
       <w:tr>
         <w:tc>
           <w:tcPr>
-            <w:tcW w:type="dxa" w:w="4320"/>
+            <w:tcW w:type="dxa" w:w="4986"/>
           </w:tcPr>
           <w:p>
             <w:r>
@@ -960,7 +1348,7 @@
         </w:tc>
         <w:tc>
           <w:tcPr>
-            <w:tcW w:type="dxa" w:w="4320"/>
+            <w:tcW w:type="dxa" w:w="4986"/>
           </w:tcPr>
           <w:p>
             <w:r>
@@ -972,7 +1360,7 @@
       <w:tr>
         <w:tc>
           <w:tcPr>
-            <w:tcW w:type="dxa" w:w="4320"/>
+            <w:tcW w:type="dxa" w:w="4986"/>
           </w:tcPr>
           <w:p>
             <w:r>
@@ -982,11 +1370,11 @@
         </w:tc>
         <w:tc>
           <w:tcPr>
-            <w:tcW w:type="dxa" w:w="4320"/>
+            <w:tcW w:type="dxa" w:w="4986"/>
           </w:tcPr>
           <w:p>
             <w:r>
-              <w:t>Not possible yet [5]</w:t>
+              <w:t>Not possible yet, as far as public sources show [S6, S7]</w:t>
             </w:r>
           </w:p>
         </w:tc>
@@ -994,7 +1382,7 @@
       <w:tr>
         <w:tc>
           <w:tcPr>
-            <w:tcW w:type="dxa" w:w="4320"/>
+            <w:tcW w:type="dxa" w:w="4986"/>
           </w:tcPr>
           <w:p>
             <w:r>
@@ -1004,11 +1392,11 @@
         </w:tc>
         <w:tc>
           <w:tcPr>
-            <w:tcW w:type="dxa" w:w="4320"/>
+            <w:tcW w:type="dxa" w:w="4986"/>
           </w:tcPr>
           <w:p>
             <w:r>
-              <w:t>Not possible yet, no documented link [8, 38]</w:t>
+              <w:t>Not possible yet, no documented link [S5, S37]</w:t>
             </w:r>
           </w:p>
         </w:tc>
@@ -1016,7 +1404,7 @@
       <w:tr>
         <w:tc>
           <w:tcPr>
-            <w:tcW w:type="dxa" w:w="4320"/>
+            <w:tcW w:type="dxa" w:w="4986"/>
           </w:tcPr>
           <w:p>
             <w:r>
@@ -1026,11 +1414,11 @@
         </w:tc>
         <w:tc>
           <w:tcPr>
-            <w:tcW w:type="dxa" w:w="4320"/>
+            <w:tcW w:type="dxa" w:w="4986"/>
           </w:tcPr>
           <w:p>
             <w:r>
-              <w:t>Not possible yet, only the destination's rules apply [6, 33]</w:t>
+              <w:t>Not possible yet, only the destination's rules apply [S9, S34]</w:t>
             </w:r>
           </w:p>
         </w:tc>
@@ -1038,7 +1426,29 @@
       <w:tr>
         <w:tc>
           <w:tcPr>
-            <w:tcW w:type="dxa" w:w="4320"/>
+            <w:tcW w:type="dxa" w:w="4986"/>
+          </w:tcPr>
+          <w:p>
+            <w:r>
+              <w:t>Whether Overledger treats Redbelly as self-serve or engagement</w:t>
+            </w:r>
+          </w:p>
+        </w:tc>
+        <w:tc>
+          <w:tcPr>
+            <w:tcW w:type="dxa" w:w="4986"/>
+          </w:tcPr>
+          <w:p>
+            <w:r>
+              <w:t>Unknown, writing to Redbelly needs a credential [S3, S5, S13]</w:t>
+            </w:r>
+          </w:p>
+        </w:tc>
+      </w:tr>
+      <w:tr>
+        <w:tc>
+          <w:tcPr>
+            <w:tcW w:type="dxa" w:w="4986"/>
           </w:tcPr>
           <w:p>
             <w:r>
@@ -1048,11 +1458,11 @@
         </w:tc>
         <w:tc>
           <w:tcPr>
-            <w:tcW w:type="dxa" w:w="4320"/>
+            <w:tcW w:type="dxa" w:w="4986"/>
           </w:tcPr>
           <w:p>
             <w:r>
-              <w:t>Unknown, needs a test with an account [2, 4]</w:t>
+              <w:t>Unknown, needs a test with an account [S3, S4]</w:t>
             </w:r>
           </w:p>
         </w:tc>
@@ -1060,7 +1470,7 @@
       <w:tr>
         <w:tc>
           <w:tcPr>
-            <w:tcW w:type="dxa" w:w="4320"/>
+            <w:tcW w:type="dxa" w:w="4986"/>
           </w:tcPr>
           <w:p>
             <w:r>
@@ -1070,11 +1480,11 @@
         </w:tc>
         <w:tc>
           <w:tcPr>
-            <w:tcW w:type="dxa" w:w="4320"/>
+            <w:tcW w:type="dxa" w:w="4986"/>
           </w:tcPr>
           <w:p>
             <w:r>
-              <w:t>Unknown, the list needs a login [37]</w:t>
+              <w:t>Unknown, the lists need an API key [S7]</w:t>
             </w:r>
           </w:p>
         </w:tc>
@@ -1082,7 +1492,7 @@
       <w:tr>
         <w:tc>
           <w:tcPr>
-            <w:tcW w:type="dxa" w:w="4320"/>
+            <w:tcW w:type="dxa" w:w="4986"/>
           </w:tcPr>
           <w:p>
             <w:r>
@@ -1092,11 +1502,11 @@
         </w:tc>
         <w:tc>
           <w:tcPr>
-            <w:tcW w:type="dxa" w:w="4320"/>
+            <w:tcW w:type="dxa" w:w="4986"/>
           </w:tcPr>
           <w:p>
             <w:r>
-              <w:t>Unknown, catalogue not public [13]</w:t>
+              <w:t>Unknown, catalogue not public [S14]</w:t>
             </w:r>
           </w:p>
         </w:tc>
@@ -1104,7 +1514,7 @@
       <w:tr>
         <w:tc>
           <w:tcPr>
-            <w:tcW w:type="dxa" w:w="4320"/>
+            <w:tcW w:type="dxa" w:w="4986"/>
           </w:tcPr>
           <w:p>
             <w:r>
@@ -1114,11 +1524,11 @@
         </w:tc>
         <w:tc>
           <w:tcPr>
-            <w:tcW w:type="dxa" w:w="4320"/>
+            <w:tcW w:type="dxa" w:w="4986"/>
           </w:tcPr>
           <w:p>
             <w:r>
-              <w:t>Unknown [9]</w:t>
+              <w:t>Unknown [S10]</w:t>
             </w:r>
           </w:p>
         </w:tc>
@@ -1126,7 +1536,7 @@
       <w:tr>
         <w:tc>
           <w:tcPr>
-            <w:tcW w:type="dxa" w:w="4320"/>
+            <w:tcW w:type="dxa" w:w="4986"/>
           </w:tcPr>
           <w:p>
             <w:r>
@@ -1136,11 +1546,11 @@
         </w:tc>
         <w:tc>
           <w:tcPr>
-            <w:tcW w:type="dxa" w:w="4320"/>
+            <w:tcW w:type="dxa" w:w="4986"/>
           </w:tcPr>
           <w:p>
             <w:r>
-              <w:t>Unknown, nothing published [1]</w:t>
+              <w:t>Unknown, nothing published [S1]</w:t>
             </w:r>
           </w:p>
         </w:tc>
@@ -1148,7 +1558,7 @@
       <w:tr>
         <w:tc>
           <w:tcPr>
-            <w:tcW w:type="dxa" w:w="4320"/>
+            <w:tcW w:type="dxa" w:w="4986"/>
           </w:tcPr>
           <w:p>
             <w:r>
@@ -1158,11 +1568,11 @@
         </w:tc>
         <w:tc>
           <w:tcPr>
-            <w:tcW w:type="dxa" w:w="4320"/>
+            <w:tcW w:type="dxa" w:w="4986"/>
           </w:tcPr>
           <w:p>
             <w:r>
-              <w:t>None announced [1]</w:t>
+              <w:t>None announced [S1]</w:t>
             </w:r>
           </w:p>
         </w:tc>
@@ -1178,6 +1588,13 @@
     </w:p>
     <w:p>
       <w:r>
+        <w:rPr>
+          <w:b/>
+          <w:color w:val="C62828"/>
+        </w:rPr>
+        <w:t xml:space="preserve">[Method] </w:t>
+      </w:r>
+      <w:r>
         <w:t>Every source page was saved as a text snapshot on 15 October 2026, with its address, capture time and SHA-256 hash in evidence/manifest.json. Each factual claim cites a fact, and each fact quotes its source word for word. The script scripts/check.py confirms that every quote is in its snapshot, that every Confirmed paragraph cites a source, and that the text has no partnership wording, no investment language, no dashes and no emoji. We ran the RPC and API calls ourselves, and kept the full output in evidence/tests. We did not create an Overledger account, so nothing here was tested inside Overledger.</w:t>
       </w:r>
     </w:p>
@@ -1186,7 +1603,7 @@
         <w:pStyle w:val="Heading1"/>
       </w:pPr>
       <w:r>
-        <w:t>Community summary</w:t>
+        <w:t>11. Community summary</w:t>
       </w:r>
     </w:p>
     <w:p>
@@ -1196,12 +1613,12 @@
     </w:p>
     <w:p>
       <w:r>
-        <w:t>Overledger is Quant's platform for reaching many blockchains through one interface. It supports any EVM chain through a self-serve route, and Redbelly is EVM compatible. So a basic connection, reading Redbelly and sending transactions that the sender has signed, looks possible, but nobody has tested it yet. Every Redbelly rule would still apply, including the access credential that every sending account needs.</w:t>
-      </w:r>
-    </w:p>
-    <w:p>
-      <w:r>
-        <w:t>Overledger's Fusion Rollup, its shared layer for moving tokens between chains, does not include Redbelly, and there is no self-serve way to add a chain. That part is not possible today.</w:t>
+        <w:t>Overledger is Quant's platform for reaching many blockchains through one interface. Its self-serve route covers EVM chains, and Redbelly is EVM compatible, so a basic connection, reading Redbelly and sending transactions the sender has signed, looks possible. It is untested, and Overledger describes self-serve as for public permissionless networks, while writing to Redbelly needs a credential. Every Redbelly rule would still apply.</w:t>
+      </w:r>
+    </w:p>
+    <w:p>
+      <w:r>
+        <w:t>Overledger's Fusion Rollup, its shared layer for moving tokens between chains, does not list Redbelly among its connected networks, and the docs describe no self-serve way to add a chain. As far as public sources show, that part is not possible today.</w:t>
       </w:r>
     </w:p>
     <w:p>
@@ -1211,7 +1628,7 @@
     </w:p>
     <w:p>
       <w:r>
-        <w:t>Open questions: whether Redbelly passes Overledger's network check, which chains The Clearing House network will reach, and Redbelly's own position on bridging. The full report and every source are linked below.</w:t>
+        <w:t>Open questions: whether Overledger would treat Redbelly as self-serve, whether Redbelly passes its network check, which chains The Clearing House network will reach, and Redbelly's own position on bridging. The full report and every source are linked below.</w:t>
       </w:r>
     </w:p>
     <w:p>
@@ -1235,7 +1652,7 @@
         <w:pStyle w:val="ListNumber"/>
       </w:pPr>
       <w:r>
-        <w:t>2/ Overledger reaches many chains through one interface. Any EVM chain can be added through a self-serve route, and Redbelly is EVM compatible. A basic connection for reading data and sending signed transactions looks possible, but it is untested.</w:t>
+        <w:t>2/ Overledger reaches many chains through one interface. Its self-serve route covers EVM chains, and Redbelly is EVM compatible. A basic connection for reading data and sending signed transactions looks possible, but it is untested.</w:t>
       </w:r>
     </w:p>
     <w:p>
@@ -1251,7 +1668,7 @@
         <w:pStyle w:val="ListNumber"/>
       </w:pPr>
       <w:r>
-        <w:t>4/ Overledger's Fusion Rollup, which moves tokens between connected chains, does not include Redbelly and has no self-serve way to add a chain. Not possible today.</w:t>
+        <w:t>4/ Overledger's Fusion Rollup, which moves tokens between connected chains, does not list Redbelly, and the docs describe no self-serve way to add a chain. As far as public sources show, not possible today.</w:t>
       </w:r>
     </w:p>
     <w:p>
@@ -1267,7 +1684,7 @@
         <w:pStyle w:val="ListNumber"/>
       </w:pPr>
       <w:r>
-        <w:t>6/ Still unknown: whether Redbelly passes Overledger's network check, which chains The Clearing House network will reach, and Redbelly's position on bridging. Full report with a source for every claim: https://overledger.test-hub.xyz</w:t>
+        <w:t>6/ Still unknown: whether Overledger would treat Redbelly as self-serve, since writing needs a credential, which chains The Clearing House network will reach, and Redbelly's position on bridging. Full report with every source: https://overledger.test-hub.xyz</w:t>
       </w:r>
     </w:p>
     <w:p>
@@ -1280,7 +1697,7 @@
     </w:p>
     <w:p>
       <w:r>
-        <w:t>Every factual claim links to one of these sources. Under each source are the exact words the report relies on.</w:t>
+        <w:t>Every factual claim cites one of these sources. Under each source are the exact words the report relies on.</w:t>
       </w:r>
     </w:p>
     <w:p>
@@ -1288,7 +1705,7 @@
         <w:rPr>
           <w:b/>
         </w:rPr>
-        <w:t>[1] Redbelly DAO Task Board: TASK-29 brief: Quant Overledger and Redbelly Interoperability Research</w:t>
+        <w:t>S1  Redbelly DAO Task Board: TASK-29 brief: Quant Overledger and Redbelly Interoperability Research</w:t>
       </w:r>
     </w:p>
     <w:p>
@@ -1317,12 +1734,12 @@
         <w:rPr>
           <w:b/>
         </w:rPr>
-        <w:t>[2] Quant, Overledger documentation: Chapter 5: Connectors</w:t>
-      </w:r>
-    </w:p>
-    <w:p>
-      <w:r>
-        <w:t>https://docs.overledger.dev/docs/connectors</w:t>
+        <w:t>S2  Vine, Redbelly Network developer portal: EVM compatibility and version details</w:t>
+      </w:r>
+    </w:p>
+    <w:p>
+      <w:r>
+        <w:t>https://vine.redbelly.network/consensus/evm-compatibility/</w:t>
       </w:r>
     </w:p>
     <w:p>
@@ -1330,103 +1747,7 @@
         <w:pStyle w:val="ListBullet"/>
       </w:pPr>
       <w:r>
-        <w:t>“Six DLT families are available for self-serve onboarding today, you can register a node and call the network without an account-team conversation”</w:t>
-      </w:r>
-    </w:p>
-    <w:p>
-      <w:pPr>
-        <w:pStyle w:val="ListBullet"/>
-      </w:pPr>
-      <w:r>
-        <w:t>“Covers every EVM-compatible chain”</w:t>
-      </w:r>
-    </w:p>
-    <w:p>
-      <w:pPr>
-        <w:pStyle w:val="ListBullet"/>
-      </w:pPr>
-      <w:r>
-        <w:t>“A DLT family is considered eligible for self-serve if (a) its nodes expose RPC or REST over HTTPS, (b) the RPC requires no security factor beyond an API key, and (c) node identity does not matter to other tenants (so a pool of equivalent nodes can be load-balanced safely).”</w:t>
-      </w:r>
-    </w:p>
-    <w:p>
-      <w:pPr>
-        <w:pStyle w:val="ListBullet"/>
-      </w:pPr>
-      <w:r>
-        <w:t>“New network within a supported DLT family, the network is not yet listed by Overledger, but its DLT family is one Overledger already supports for self-serve (EVM, Solana, Cosmos, SUI, Hedera, Aptos). The first POST /nodes call registers both the network and your node for it. This new network will then be available for Overledger users.”</w:t>
-      </w:r>
-    </w:p>
-    <w:p>
-      <w:pPr>
-        <w:pStyle w:val="ListBullet"/>
-      </w:pPr>
-      <w:r>
-        <w:t>“If public is selected then the user can only add nodes from whitelisted providers. If private is selected then the user can add nodes from any domain.”</w:t>
-      </w:r>
-    </w:p>
-    <w:p>
-      <w:pPr>
-        <w:pStyle w:val="ListBullet"/>
-      </w:pPr>
-      <w:r>
-        <w:t>“alchemy.com, infura.io, quiknode.pro, chainstack.com, getblock.io, blockdaemon.com, ankr.com”</w:t>
-      </w:r>
-    </w:p>
-    <w:p>
-      <w:pPr>
-        <w:pStyle w:val="ListBullet"/>
-      </w:pPr>
-      <w:r>
-        <w:t>“Required, embedded in the URL path (the Gateway forwards the URL as-is), not a header.”</w:t>
-      </w:r>
-    </w:p>
-    <w:p>
-      <w:pPr>
-        <w:pStyle w:val="ListBullet"/>
-      </w:pPr>
-      <w:r>
-        <w:t>“Any reachable HTTPS URL, self-hosted, custom-provider, on your own infrastructure, anywhere.”</w:t>
-      </w:r>
-    </w:p>
-    <w:p>
-      <w:pPr>
-        <w:pStyle w:val="ListBullet"/>
-      </w:pPr>
-      <w:r>
-        <w:t>“The Gateway runs a health check using the DLT's standard validation from section 5.1 and, on success, adds the node to the network's load-balancing pool.”</w:t>
-      </w:r>
-    </w:p>
-    <w:p>
-      <w:pPr>
-        <w:pStyle w:val="ListBullet"/>
-      </w:pPr>
-      <w:r>
-        <w:t>“For networks where node identity matters, typically permissioned DLTs used by regulated consortia and operator-gated public chains, Overledger does not self-serve currently.”</w:t>
-      </w:r>
-    </w:p>
-    <w:p>
-      <w:pPr>
-        <w:pStyle w:val="ListBullet"/>
-      </w:pPr>
-      <w:r>
-        <w:t>“Implement a DLT checker (health validation + chain identifer lookup) ~2 days”</w:t>
-      </w:r>
-    </w:p>
-    <w:p>
-      <w:pPr>
-        <w:pStyle w:val="ListBullet"/>
-      </w:pPr>
-      <w:r>
-        <w:t>“Add per-DLT handling in any apps that need to consume it ~1 day per app”</w:t>
-      </w:r>
-    </w:p>
-    <w:p>
-      <w:pPr>
-        <w:pStyle w:val="ListBullet"/>
-      </w:pPr>
-      <w:r>
-        <w:t>“Forwards the payload, returns the native response unchanged.”</w:t>
+        <w:t>“Redbelly is compatible with the Ethereum Virtual Machine (EVM) and can execute smart contracts written for the EVM.”</w:t>
       </w:r>
     </w:p>
     <w:p>
@@ -1434,12 +1755,12 @@
         <w:rPr>
           <w:b/>
         </w:rPr>
-        <w:t>[3] Vine, Redbelly Network developer portal: EVM compatibility and version details</w:t>
-      </w:r>
-    </w:p>
-    <w:p>
-      <w:r>
-        <w:t>https://vine.redbelly.network/consensus/evm-compatibility/</w:t>
+        <w:t>S3  Quant, Overledger documentation: Chapter 5: Connectors</w:t>
+      </w:r>
+    </w:p>
+    <w:p>
+      <w:r>
+        <w:t>https://docs.overledger.dev/docs/connectors</w:t>
       </w:r>
     </w:p>
     <w:p>
@@ -1447,7 +1768,159 @@
         <w:pStyle w:val="ListBullet"/>
       </w:pPr>
       <w:r>
-        <w:t>“Redbelly is compatible with the Ethereum Virtual Machine (EVM) and can execute smart contracts written for the EVM.”</w:t>
+        <w:t>“Six DLT families are available for self-serve onboarding today, you can register a node and call the network without an account-team conversation”</w:t>
+      </w:r>
+    </w:p>
+    <w:p>
+      <w:pPr>
+        <w:pStyle w:val="ListBullet"/>
+      </w:pPr>
+      <w:r>
+        <w:t>“Covers every EVM-compatible chain”</w:t>
+      </w:r>
+    </w:p>
+    <w:p>
+      <w:pPr>
+        <w:pStyle w:val="ListBullet"/>
+      </w:pPr>
+      <w:r>
+        <w:t>“A DLT family is considered eligible for self-serve if (a) its nodes expose RPC or REST over HTTPS, (b) the RPC requires no security factor beyond an API key, and (c) node identity does not matter to other tenants (so a pool of equivalent nodes can be load-balanced safely).”</w:t>
+      </w:r>
+    </w:p>
+    <w:p>
+      <w:pPr>
+        <w:pStyle w:val="ListBullet"/>
+      </w:pPr>
+      <w:r>
+        <w:t>“New network within a supported DLT family, the network is not yet listed by Overledger, but its DLT family is one Overledger already supports for self-serve (EVM, Solana, Cosmos, SUI, Hedera, Aptos). The first POST /nodes call registers both the network and your node for it. This new network will then be available for Overledger users.”</w:t>
+      </w:r>
+    </w:p>
+    <w:p>
+      <w:pPr>
+        <w:pStyle w:val="ListBullet"/>
+      </w:pPr>
+      <w:r>
+        <w:t>“If public is selected then the user can only add nodes from whitelisted providers. If private is selected then the user can add nodes from any domain.”</w:t>
+      </w:r>
+    </w:p>
+    <w:p>
+      <w:pPr>
+        <w:pStyle w:val="ListBullet"/>
+      </w:pPr>
+      <w:r>
+        <w:t>“alchemy.com, infura.io, quiknode.pro, chainstack.com, getblock.io, blockdaemon.com, ankr.com”</w:t>
+      </w:r>
+    </w:p>
+    <w:p>
+      <w:pPr>
+        <w:pStyle w:val="ListBullet"/>
+      </w:pPr>
+      <w:r>
+        <w:t>“Required, embedded in the URL path (the Gateway forwards the URL as-is), not a header.”</w:t>
+      </w:r>
+    </w:p>
+    <w:p>
+      <w:pPr>
+        <w:pStyle w:val="ListBullet"/>
+      </w:pPr>
+      <w:r>
+        <w:t>“Any reachable HTTPS URL, self-hosted, custom-provider, on your own infrastructure, anywhere.”</w:t>
+      </w:r>
+    </w:p>
+    <w:p>
+      <w:pPr>
+        <w:pStyle w:val="ListBullet"/>
+      </w:pPr>
+      <w:r>
+        <w:t>“The Gateway runs a health check using the DLT's standard validation from section 5.1 and, on success, adds the node to the network's load-balancing pool.”</w:t>
+      </w:r>
+    </w:p>
+    <w:p>
+      <w:pPr>
+        <w:pStyle w:val="ListBullet"/>
+      </w:pPr>
+      <w:r>
+        <w:t>“For networks where node identity matters, typically permissioned DLTs used by regulated consortia and operator-gated public chains, Overledger does not self-serve currently.”</w:t>
+      </w:r>
+    </w:p>
+    <w:p>
+      <w:pPr>
+        <w:pStyle w:val="ListBullet"/>
+      </w:pPr>
+      <w:r>
+        <w:t>“Implement a DLT checker (health validation + chain identifer lookup) ~2 days”</w:t>
+      </w:r>
+    </w:p>
+    <w:p>
+      <w:pPr>
+        <w:pStyle w:val="ListBullet"/>
+      </w:pPr>
+      <w:r>
+        <w:t>“Add per-DLT handling in any apps that need to consume it ~1 day per app”</w:t>
+      </w:r>
+    </w:p>
+    <w:p>
+      <w:pPr>
+        <w:pStyle w:val="ListBullet"/>
+      </w:pPr>
+      <w:r>
+        <w:t>“Forwards the payload, returns the native response unchanged.”</w:t>
+      </w:r>
+    </w:p>
+    <w:p>
+      <w:pPr>
+        <w:pStyle w:val="ListBullet"/>
+      </w:pPr>
+      <w:r>
+        <w:t>“Self-serve Connectors for public, permissionless DLT families.”</w:t>
+      </w:r>
+    </w:p>
+    <w:p>
+      <w:pPr>
+        <w:pStyle w:val="ListBullet"/>
+      </w:pPr>
+      <w:r>
+        <w:t>“For networks where it does not matter which node a client connects to, i.e. public permissionless networks”</w:t>
+      </w:r>
+    </w:p>
+    <w:p>
+      <w:pPr>
+        <w:pStyle w:val="ListBullet"/>
+      </w:pPr>
+      <w:r>
+        <w:t>“Hyperledger Besu (permissioned) Permissioned EVM Used in regulated EVM deployments.”</w:t>
+      </w:r>
+    </w:p>
+    <w:p>
+      <w:pPr>
+        <w:pStyle w:val="ListBullet"/>
+      </w:pPr>
+      <w:r>
+        <w:t>“Run GET /networks to retrieve the live list.”</w:t>
+      </w:r>
+    </w:p>
+    <w:p>
+      <w:pPr>
+        <w:pStyle w:val="ListBullet"/>
+      </w:pPr>
+      <w:r>
+        <w:t>“Overledger lets you register a managed-provider node URL via a single API call. The network then becomes immediately reachable through the Overledger Gateway.”</w:t>
+      </w:r>
+    </w:p>
+    <w:p>
+      <w:pPr>
+        <w:pStyle w:val="ListBullet"/>
+      </w:pPr>
+      <w:r>
+        <w:t>“Any tenant with access to the network, the node joins the shared load-balancing pool for that network.”</w:t>
+      </w:r>
+    </w:p>
+    <w:p>
+      <w:pPr>
+        <w:pStyle w:val="ListBullet"/>
+      </w:pPr>
+      <w:r>
+        <w:t>“the node is scoped to your user identity”</w:t>
       </w:r>
     </w:p>
     <w:p>
@@ -1455,12 +1928,12 @@
         <w:rPr>
           <w:b/>
         </w:rPr>
-        <w:t>[4] Test run for this report: JSON-RPC calls to Redbelly mainnet and testnet endpoints, 15 October 2026</w:t>
-      </w:r>
-    </w:p>
-    <w:p>
-      <w:r>
-        <w:t>evidence/tests/rpc-check.txt (in the project repository)</w:t>
+        <w:t>S4  Test run for this report: JSON-RPC calls to Redbelly mainnet and testnet endpoints, 15 October 2026</w:t>
+      </w:r>
+    </w:p>
+    <w:p>
+      <w:r>
+        <w:t>evidence/tests/rpc-check.txt (project repository)</w:t>
       </w:r>
     </w:p>
     <w:p>
@@ -1500,12 +1973,12 @@
         <w:rPr>
           <w:b/>
         </w:rPr>
-        <w:t>[5] Quant, Overledger documentation: Chapter 8: Fusion Rollup</w:t>
-      </w:r>
-    </w:p>
-    <w:p>
-      <w:r>
-        <w:t>https://docs.overledger.dev/docs/fusion-rollup</w:t>
+        <w:t>S5  Vine, Redbelly Network developer portal: User access</w:t>
+      </w:r>
+    </w:p>
+    <w:p>
+      <w:r>
+        <w:t>https://vine.redbelly.network/identity/user-access/</w:t>
       </w:r>
     </w:p>
     <w:p>
@@ -1513,47 +1986,7 @@
         <w:pStyle w:val="ListBullet"/>
       </w:pPr>
       <w:r>
-        <w:t>“Connected DLT networks on testnet launch are: Ethereum Sepolia, Polygon Amoy, Quant's permissioned Besu testnet. The full live list comes from GET /networks/fusion.”</w:t>
-      </w:r>
-    </w:p>
-    <w:p>
-      <w:pPr>
-        <w:pStyle w:val="ListBullet"/>
-      </w:pPr>
-      <w:r>
-        <w:t>“The bridge and dispute contracts deployed on each connected DLT network. Standard OP Stack contracts, one deployment per chain.”</w:t>
-      </w:r>
-    </w:p>
-    <w:p>
-      <w:pPr>
-        <w:pStyle w:val="ListBullet"/>
-      </w:pPr>
-      <w:r>
-        <w:t>“Compute Fusion Rollup state roots and post them to all connected DLT networks for settlement”</w:t>
-      </w:r>
-    </w:p>
-    <w:p>
-      <w:pPr>
-        <w:pStyle w:val="ListBullet"/>
-      </w:pPr>
-      <w:r>
-        <w:t>“Because Fusion is an optimistic rollup, a withdrawal is not immediately final, there is a dispute window during which a challenger can prove the Fusion Rollup state root invalid.”</w:t>
-      </w:r>
-    </w:p>
-    <w:p>
-      <w:pPr>
-        <w:pStyle w:val="ListBullet"/>
-      </w:pPr>
-      <w:r>
-        <w:t>“Fusion can map several token contracts to a single rollup-side ERC-20, so deposits from any of those source chains land in one unified balance.”</w:t>
-      </w:r>
-    </w:p>
-    <w:p>
-      <w:pPr>
-        <w:pStyle w:val="ListBullet"/>
-      </w:pPr>
-      <w:r>
-        <w:t>“Network ID. Exposed for wallets and tools that predate eth_chainId.”</w:t>
+        <w:t>“Before being granted access to Redbelly Network, each user must claim their access credential from a network accredited issuer before they self enable their account with write access to the network through a specific network smart contract.”</w:t>
       </w:r>
     </w:p>
     <w:p>
@@ -1561,12 +1994,12 @@
         <w:rPr>
           <w:b/>
         </w:rPr>
-        <w:t>[6] Tokeniser: Technology</w:t>
-      </w:r>
-    </w:p>
-    <w:p>
-      <w:r>
-        <w:t>https://tokeniser.com/technology</w:t>
+        <w:t>S6  Quant, Overledger documentation: Chapter 8: Fusion Rollup</w:t>
+      </w:r>
+    </w:p>
+    <w:p>
+      <w:r>
+        <w:t>https://docs.overledger.dev/docs/fusion-rollup</w:t>
       </w:r>
     </w:p>
     <w:p>
@@ -1574,7 +2007,7 @@
         <w:pStyle w:val="ListBullet"/>
       </w:pPr>
       <w:r>
-        <w:t>“Eligibility, identity and your target market determination are enforced at the point of transfer, every time.”</w:t>
+        <w:t>“Connected DLT networks on testnet launch are: Ethereum Sepolia, Polygon Amoy, Quant's permissioned Besu testnet. The full live list comes from GET /networks/fusion.”</w:t>
       </w:r>
     </w:p>
     <w:p>
@@ -1582,7 +2015,7 @@
         <w:pStyle w:val="ListBullet"/>
       </w:pPr>
       <w:r>
-        <w:t>“Deterministic finality settles a transaction in a single round, final the moment it completes.”</w:t>
+        <w:t>“The bridge and dispute contracts deployed on each connected DLT network. Standard OP Stack contracts, one deployment per chain.”</w:t>
       </w:r>
     </w:p>
     <w:p>
@@ -1590,7 +2023,7 @@
         <w:pStyle w:val="ListBullet"/>
       </w:pPr>
       <w:r>
-        <w:t>“full EVM compatibility connects you to more than 150 networks out of the box”</w:t>
+        <w:t>“Compute Fusion Rollup state roots and post them to all connected DLT networks for settlement”</w:t>
       </w:r>
     </w:p>
     <w:p>
@@ -1598,7 +2031,23 @@
         <w:pStyle w:val="ListBullet"/>
       </w:pPr>
       <w:r>
-        <w:t>“Underneath it runs Redbelly Network”</w:t>
+        <w:t>“Because Fusion is an optimistic rollup, a withdrawal is not immediately final, there is a dispute window during which a challenger can prove the Fusion Rollup state root invalid.”</w:t>
+      </w:r>
+    </w:p>
+    <w:p>
+      <w:pPr>
+        <w:pStyle w:val="ListBullet"/>
+      </w:pPr>
+      <w:r>
+        <w:t>“Fusion can map several token contracts to a single rollup-side ERC-20, so deposits from any of those source chains land in one unified balance.”</w:t>
+      </w:r>
+    </w:p>
+    <w:p>
+      <w:pPr>
+        <w:pStyle w:val="ListBullet"/>
+      </w:pPr>
+      <w:r>
+        <w:t>“Network ID. Exposed for wallets and tools that predate eth_chainId.”</w:t>
       </w:r>
     </w:p>
     <w:p>
@@ -1606,12 +2055,12 @@
         <w:rPr>
           <w:b/>
         </w:rPr>
-        <w:t>[7] Redbelly Network technical documentation: Proof by Query</w:t>
-      </w:r>
-    </w:p>
-    <w:p>
-      <w:r>
-        <w:t>https://docs.redbelly.network/pages/methods/proof-by-query/</w:t>
+        <w:t>S7  Test run for this report: Calls to the public Overledger server API without an account, 15 October 2026</w:t>
+      </w:r>
+    </w:p>
+    <w:p>
+      <w:r>
+        <w:t>evidence/tests/overledger-api-check.txt (project repository)</w:t>
       </w:r>
     </w:p>
     <w:p>
@@ -1619,7 +2068,7 @@
         <w:pStyle w:val="ListBullet"/>
       </w:pPr>
       <w:r>
-        <w:t>“a zero knowledge proof based verifier smart contract”</w:t>
+        <w:t>“GET https://fusion-rollup.quant.dev/networks/fusion -&gt; HTTP 401 {"status":401,"error":"Missing authorization header."”</w:t>
       </w:r>
     </w:p>
     <w:p>
@@ -1627,7 +2076,7 @@
         <w:pStyle w:val="ListBullet"/>
       </w:pPr>
       <w:r>
-        <w:t>“State verification and transition, with subsequent publication to the blockchain.”</w:t>
+        <w:t>“GET https://fusion-rollup.quant.dev/networks -&gt; HTTP 401 {"status":401,"error":"Missing authorization header."”</w:t>
       </w:r>
     </w:p>
     <w:p>
@@ -1635,12 +2084,12 @@
         <w:rPr>
           <w:b/>
         </w:rPr>
-        <w:t>[8] Vine, Redbelly Network developer portal: User access</w:t>
-      </w:r>
-    </w:p>
-    <w:p>
-      <w:r>
-        <w:t>https://vine.redbelly.network/identity/user-access/</w:t>
+        <w:t>S8  Redbelly Network technical documentation: Proof by Query</w:t>
+      </w:r>
+    </w:p>
+    <w:p>
+      <w:r>
+        <w:t>https://docs.redbelly.network/pages/methods/proof-by-query/</w:t>
       </w:r>
     </w:p>
     <w:p>
@@ -1648,7 +2097,15 @@
         <w:pStyle w:val="ListBullet"/>
       </w:pPr>
       <w:r>
-        <w:t>“Before being granted access to Redbelly Network, each user must claim their access credential from a network accredited issuer before they self enable their account with write access to the network through a specific network smart contract.”</w:t>
+        <w:t>“a zero knowledge proof based verifier smart contract”</w:t>
+      </w:r>
+    </w:p>
+    <w:p>
+      <w:pPr>
+        <w:pStyle w:val="ListBullet"/>
+      </w:pPr>
+      <w:r>
+        <w:t>“State verification and transition, with subsequent publication to the blockchain.”</w:t>
       </w:r>
     </w:p>
     <w:p>
@@ -1656,12 +2113,12 @@
         <w:rPr>
           <w:b/>
         </w:rPr>
-        <w:t>[9] The Clearing House: The Clearing House Partners with Quant to Advance the On-Chain Money Initiative (24 September 2026)</w:t>
-      </w:r>
-    </w:p>
-    <w:p>
-      <w:r>
-        <w:t>https://www.theclearinghouse.org/payment-systems/Articles/2026/09/The-Clearing-House-Partners-with-Quant-to-Advance-the--On-Chain-Money-Initiative</w:t>
+        <w:t>S9  Tokeniser: Technology</w:t>
+      </w:r>
+    </w:p>
+    <w:p>
+      <w:r>
+        <w:t>https://tokeniser.com/technology</w:t>
       </w:r>
     </w:p>
     <w:p>
@@ -1669,7 +2126,7 @@
         <w:pStyle w:val="ListBullet"/>
       </w:pPr>
       <w:r>
-        <w:t>“The Clearing House announced the selection of Quant, a leading provider of programmable money infrastructure, to power its On-Chain Money Initiative, a new interoperable payments network that will enable financial institutions of all sizes to clear and settle tokenized deposit transactions.”</w:t>
+        <w:t>“Eligibility, identity and your target market determination are enforced at the point of transfer, every time.”</w:t>
       </w:r>
     </w:p>
     <w:p>
@@ -1677,7 +2134,7 @@
         <w:pStyle w:val="ListBullet"/>
       </w:pPr>
       <w:r>
-        <w:t>“Quant's technology will enable the network's interoperability, orchestration, and transaction-management layer that coordinates the clearing and settlement of tokenized deposit transactions”</w:t>
+        <w:t>“Deterministic finality settles a transaction in a single round, final the moment it completes.”</w:t>
       </w:r>
     </w:p>
     <w:p>
@@ -1685,7 +2142,7 @@
         <w:pStyle w:val="ListBullet"/>
       </w:pPr>
       <w:r>
-        <w:t>“providing connectivity to existing fiat payment systems that financial institutions and their customers use every day, including the RTP® and CHIPS® networks”</w:t>
+        <w:t>“full EVM compatibility connects you to more than 150 networks out of the box”</w:t>
       </w:r>
     </w:p>
     <w:p>
@@ -1693,7 +2150,7 @@
         <w:pStyle w:val="ListBullet"/>
       </w:pPr>
       <w:r>
-        <w:t>“The network is expected to become available to participating institutions in the first half of 2027, with additional details on participation and use cases to be announced as development progresses.”</w:t>
+        <w:t>“Underneath it runs Redbelly Network”</w:t>
       </w:r>
     </w:p>
     <w:p>
@@ -1701,12 +2158,12 @@
         <w:rPr>
           <w:b/>
         </w:rPr>
-        <w:t>[10] Quant: Press release: The Clearing House Partners with Quant to Advance the On-Chain Money Initiative</w:t>
-      </w:r>
-    </w:p>
-    <w:p>
-      <w:r>
-        <w:t>https://quant.network/press-releases/the-clearing-house-partners-with-quant-to-advance-the-on-chain-money-initiative/</w:t>
+        <w:t>S10  The Clearing House: The Clearing House Partners with Quant to Advance the On-Chain Money Initiative (24 September 2026)</w:t>
+      </w:r>
+    </w:p>
+    <w:p>
+      <w:r>
+        <w:t>https://www.theclearinghouse.org/payment-systems/Articles/2026/09/The-Clearing-House-Partners-with-Quant-to-Advance-the--On-Chain-Money-Initiative</w:t>
       </w:r>
     </w:p>
     <w:p>
@@ -1714,7 +2171,31 @@
         <w:pStyle w:val="ListBullet"/>
       </w:pPr>
       <w:r>
-        <w:t>“The Clearing House will use Quant's technology to bring on-chain capabilities to its tokenised deposit clearing and settlement network for financial institutions.”</w:t>
+        <w:t>“The Clearing House announced the selection of Quant, a leading provider of programmable money infrastructure, to power its On-Chain Money Initiative, a new interoperable payments network that will enable financial institutions of all sizes to clear and settle tokenized deposit transactions.”</w:t>
+      </w:r>
+    </w:p>
+    <w:p>
+      <w:pPr>
+        <w:pStyle w:val="ListBullet"/>
+      </w:pPr>
+      <w:r>
+        <w:t>“Quant's technology will enable the network's interoperability, orchestration, and transaction-management layer that coordinates the clearing and settlement of tokenized deposit transactions”</w:t>
+      </w:r>
+    </w:p>
+    <w:p>
+      <w:pPr>
+        <w:pStyle w:val="ListBullet"/>
+      </w:pPr>
+      <w:r>
+        <w:t>“providing connectivity to existing fiat payment systems that financial institutions and their customers use every day, including the RTP® and CHIPS® networks”</w:t>
+      </w:r>
+    </w:p>
+    <w:p>
+      <w:pPr>
+        <w:pStyle w:val="ListBullet"/>
+      </w:pPr>
+      <w:r>
+        <w:t>“The network is expected to become available to participating institutions in the first half of 2027, with additional details on participation and use cases to be announced as development progresses.”</w:t>
       </w:r>
     </w:p>
     <w:p>
@@ -1722,12 +2203,12 @@
         <w:rPr>
           <w:b/>
         </w:rPr>
-        <w:t>[11] Quant, Overledger documentation: Start Here</w:t>
-      </w:r>
-    </w:p>
-    <w:p>
-      <w:r>
-        <w:t>https://docs.overledger.dev/docs/start-here</w:t>
+        <w:t>S11  Quant: Press release: The Clearing House Partners with Quant to Advance the On-Chain Money Initiative</w:t>
+      </w:r>
+    </w:p>
+    <w:p>
+      <w:r>
+        <w:t>https://quant.network/press-releases/the-clearing-house-partners-with-quant-to-advance-the-on-chain-money-initiative/</w:t>
       </w:r>
     </w:p>
     <w:p>
@@ -1735,7 +2216,7 @@
         <w:pStyle w:val="ListBullet"/>
       </w:pPr>
       <w:r>
-        <w:t>“Overledger is Quant's multi-DLT platform for building applications that span more than one blockchain”</w:t>
+        <w:t>“The Clearing House will use Quant's technology to bring on-chain capabilities to its tokenised deposit clearing and settlement network for financial institutions.”</w:t>
       </w:r>
     </w:p>
     <w:p>
@@ -1743,12 +2224,12 @@
         <w:rPr>
           <w:b/>
         </w:rPr>
-        <w:t>[12] Quant, Overledger documentation: Chapter 1: Overview</w:t>
-      </w:r>
-    </w:p>
-    <w:p>
-      <w:r>
-        <w:t>https://docs.overledger.dev/docs/overview</w:t>
+        <w:t>S12  Quant, Overledger documentation: Start Here</w:t>
+      </w:r>
+    </w:p>
+    <w:p>
+      <w:r>
+        <w:t>https://docs.overledger.dev/docs/start-here</w:t>
       </w:r>
     </w:p>
     <w:p>
@@ -1756,7 +2237,7 @@
         <w:pStyle w:val="ListBullet"/>
       </w:pPr>
       <w:r>
-        <w:t>“A Gateway that authenticates clients, routes requests, and orchestrates higher-level workflows.”</w:t>
+        <w:t>“Overledger is Quant's multi-DLT platform for building applications that span more than one blockchain”</w:t>
       </w:r>
     </w:p>
     <w:p>
@@ -1764,7 +2245,7 @@
         <w:pStyle w:val="ListBullet"/>
       </w:pPr>
       <w:r>
-        <w:t>“A set of Connectors that abstract individual DLT RPC protocols behind a common interface.”</w:t>
+        <w:t>“Flow Applications turn multi-step business logic (signing, smart-contract deployment, compliance check, payment”</w:t>
       </w:r>
     </w:p>
     <w:p>
@@ -1772,23 +2253,7 @@
         <w:pStyle w:val="ListBullet"/>
       </w:pPr>
       <w:r>
-        <w:t>“A Multi-ledger rollup (the Fusion Rollup) that anchors to multiple blockchains simultaneously, providing one EVM-compatible execution environment with deposits, withdrawals, and cross-chain messaging across every connected L1.”</w:t>
-      </w:r>
-    </w:p>
-    <w:p>
-      <w:pPr>
-        <w:pStyle w:val="ListBullet"/>
-      </w:pPr>
-      <w:r>
-        <w:t>“Customers and partners can host their own Flow Apps externally, stand up an HTTPS service that implements the Flow App contract, register its URL with the Gateway, and your bespoke regulated workflow becomes a first-class app in Overledger.”</w:t>
-      </w:r>
-    </w:p>
-    <w:p>
-      <w:pPr>
-        <w:pStyle w:val="ListBullet"/>
-      </w:pPr>
-      <w:r>
-        <w:t>“Managed engagement: you work with Quant's team to onboard a private / consortium network (e.g. Corda, Canton, Fabric) or to add a brand-new DLT family Quant doesn't yet support.”</w:t>
+        <w:t>“You don't manage RPC providers, node failover, or chain-specific clients.”</w:t>
       </w:r>
     </w:p>
     <w:p>
@@ -1796,12 +2261,12 @@
         <w:rPr>
           <w:b/>
         </w:rPr>
-        <w:t>[13] Quant, Overledger documentation: Chapter 6: Flow Apps</w:t>
-      </w:r>
-    </w:p>
-    <w:p>
-      <w:r>
-        <w:t>https://docs.overledger.dev/docs/flow-apps</w:t>
+        <w:t>S13  Quant, Overledger documentation: Chapter 1: Overview</w:t>
+      </w:r>
+    </w:p>
+    <w:p>
+      <w:r>
+        <w:t>https://docs.overledger.dev/docs/overview</w:t>
       </w:r>
     </w:p>
     <w:p>
@@ -1809,7 +2274,7 @@
         <w:pStyle w:val="ListBullet"/>
       </w:pPr>
       <w:r>
-        <w:t>“today every shipped app is internal”</w:t>
+        <w:t>“A Gateway that authenticates clients, routes requests, and orchestrates higher-level workflows.”</w:t>
       </w:r>
     </w:p>
     <w:p>
@@ -1817,7 +2282,7 @@
         <w:pStyle w:val="ListBullet"/>
       </w:pPr>
       <w:r>
-        <w:t>“The Flow App catalogue is intentionally not enumerated in these docs”</w:t>
+        <w:t>“A set of Connectors that abstract individual DLT RPC protocols behind a common interface.”</w:t>
       </w:r>
     </w:p>
     <w:p>
@@ -1825,7 +2290,7 @@
         <w:pStyle w:val="ListBullet"/>
       </w:pPr>
       <w:r>
-        <w:t>“Three phases between Client, Gateway, Flow App, and Signer Flow App. The Sign phase hands off via a sub-flow; the Client never sees private-key material.”</w:t>
+        <w:t>“A Multi-ledger rollup (the Fusion Rollup) that anchors to multiple blockchains simultaneously, providing one EVM-compatible execution environment with deposits, withdrawals, and cross-chain messaging across every connected L1.”</w:t>
       </w:r>
     </w:p>
     <w:p>
@@ -1833,7 +2298,39 @@
         <w:pStyle w:val="ListBullet"/>
       </w:pPr>
       <w:r>
-        <w:t>“You hold the keys (BYO signing, see chapter 7.2).”</w:t>
+        <w:t>“Customers and partners can host their own Flow Apps externally, stand up an HTTPS service that implements the Flow App contract, register its URL with the Gateway, and your bespoke regulated workflow becomes a first-class app in Overledger.”</w:t>
+      </w:r>
+    </w:p>
+    <w:p>
+      <w:pPr>
+        <w:pStyle w:val="ListBullet"/>
+      </w:pPr>
+      <w:r>
+        <w:t>“Managed engagement: you work with Quant's team to onboard a private / consortium network (e.g. Corda, Canton, Fabric) or to add a brand-new DLT family Quant doesn't yet support.”</w:t>
+      </w:r>
+    </w:p>
+    <w:p>
+      <w:pPr>
+        <w:pStyle w:val="ListBullet"/>
+      </w:pPr>
+      <w:r>
+        <w:t>“A network with controlled write access; "public permissioned" means anyone can read but only allowlisted parties can write.”</w:t>
+      </w:r>
+    </w:p>
+    <w:p>
+      <w:pPr>
+        <w:pStyle w:val="ListBullet"/>
+      </w:pPr>
+      <w:r>
+        <w:t>“The Rollup connects to a subset of these networks.”</w:t>
+      </w:r>
+    </w:p>
+    <w:p>
+      <w:pPr>
+        <w:pStyle w:val="ListBullet"/>
+      </w:pPr>
+      <w:r>
+        <w:t>“It applies to every public or permissioned DLT network that the Gateway reaches”</w:t>
       </w:r>
     </w:p>
     <w:p>
@@ -1841,12 +2338,12 @@
         <w:rPr>
           <w:b/>
         </w:rPr>
-        <w:t>[14] Redbelly Network technical documentation: Home</w:t>
-      </w:r>
-    </w:p>
-    <w:p>
-      <w:r>
-        <w:t>https://docs.redbelly.network</w:t>
+        <w:t>S14  Quant, Overledger documentation: Chapter 6: Flow Apps</w:t>
+      </w:r>
+    </w:p>
+    <w:p>
+      <w:r>
+        <w:t>https://docs.overledger.dev/docs/flow-apps</w:t>
       </w:r>
     </w:p>
     <w:p>
@@ -1854,7 +2351,31 @@
         <w:pStyle w:val="ListBullet"/>
       </w:pPr>
       <w:r>
-        <w:t>“The Redbelly Network is a layer 1 blockchain, built and optimised for real world asset tokenisation.”</w:t>
+        <w:t>“today every shipped app is internal”</w:t>
+      </w:r>
+    </w:p>
+    <w:p>
+      <w:pPr>
+        <w:pStyle w:val="ListBullet"/>
+      </w:pPr>
+      <w:r>
+        <w:t>“The Flow App catalogue is intentionally not enumerated in these docs”</w:t>
+      </w:r>
+    </w:p>
+    <w:p>
+      <w:pPr>
+        <w:pStyle w:val="ListBullet"/>
+      </w:pPr>
+      <w:r>
+        <w:t>“Three phases between Client, Gateway, Flow App, and Signer Flow App. The Sign phase hands off via a sub-flow; the Client never sees private-key material.”</w:t>
+      </w:r>
+    </w:p>
+    <w:p>
+      <w:pPr>
+        <w:pStyle w:val="ListBullet"/>
+      </w:pPr>
+      <w:r>
+        <w:t>“You hold the keys (BYO signing, see chapter 7.2).”</w:t>
       </w:r>
     </w:p>
     <w:p>
@@ -1862,12 +2383,12 @@
         <w:rPr>
           <w:b/>
         </w:rPr>
-        <w:t>[15] Vine, Redbelly Network developer portal: Redbelly Network environments</w:t>
-      </w:r>
-    </w:p>
-    <w:p>
-      <w:r>
-        <w:t>https://vine.redbelly.network/environments/</w:t>
+        <w:t>S15  Redbelly Network technical documentation: Home</w:t>
+      </w:r>
+    </w:p>
+    <w:p>
+      <w:r>
+        <w:t>https://docs.redbelly.network</w:t>
       </w:r>
     </w:p>
     <w:p>
@@ -1875,23 +2396,7 @@
         <w:pStyle w:val="ListBullet"/>
       </w:pPr>
       <w:r>
-        <w:t>“Network name: Redbelly Network Mainnet RPC URL: https://governors.mainnet.redbelly.network Chain ID: 151”</w:t>
-      </w:r>
-    </w:p>
-    <w:p>
-      <w:pPr>
-        <w:pStyle w:val="ListBullet"/>
-      </w:pPr>
-      <w:r>
-        <w:t>“Ankr https://rpc.ankr.com/redbelly_mainnet”</w:t>
-      </w:r>
-    </w:p>
-    <w:p>
-      <w:pPr>
-        <w:pStyle w:val="ListBullet"/>
-      </w:pPr>
-      <w:r>
-        <w:t>“RPC URL: https://governors.testnet.redbelly.network Chain ID: 153”</w:t>
+        <w:t>“The Redbelly Network is a layer 1 blockchain, built and optimised for real world asset tokenisation.”</w:t>
       </w:r>
     </w:p>
     <w:p>
@@ -1899,12 +2404,12 @@
         <w:rPr>
           <w:b/>
         </w:rPr>
-        <w:t>[16] Vine, Redbelly Network developer portal: Identity and participation on the network</w:t>
-      </w:r>
-    </w:p>
-    <w:p>
-      <w:r>
-        <w:t>https://vine.redbelly.network/identity/</w:t>
+        <w:t>S16  Vine, Redbelly Network developer portal: Redbelly Network environments</w:t>
+      </w:r>
+    </w:p>
+    <w:p>
+      <w:r>
+        <w:t>https://vine.redbelly.network/environments/</w:t>
       </w:r>
     </w:p>
     <w:p>
@@ -1912,7 +2417,23 @@
         <w:pStyle w:val="ListBullet"/>
       </w:pPr>
       <w:r>
-        <w:t>“all network participants MUST prove they are who they say they are before gaining access”</w:t>
+        <w:t>“Network name: Redbelly Network Mainnet RPC URL: https://governors.mainnet.redbelly.network Chain ID: 151”</w:t>
+      </w:r>
+    </w:p>
+    <w:p>
+      <w:pPr>
+        <w:pStyle w:val="ListBullet"/>
+      </w:pPr>
+      <w:r>
+        <w:t>“Ankr https://rpc.ankr.com/redbelly_mainnet”</w:t>
+      </w:r>
+    </w:p>
+    <w:p>
+      <w:pPr>
+        <w:pStyle w:val="ListBullet"/>
+      </w:pPr>
+      <w:r>
+        <w:t>“RPC URL: https://governors.testnet.redbelly.network Chain ID: 153”</w:t>
       </w:r>
     </w:p>
     <w:p>
@@ -1920,12 +2441,12 @@
         <w:rPr>
           <w:b/>
         </w:rPr>
-        <w:t>[17] Vine, Redbelly Network developer portal: Accredited issuers</w:t>
-      </w:r>
-    </w:p>
-    <w:p>
-      <w:r>
-        <w:t>https://vine.redbelly.network/identity/accredited-issuers/</w:t>
+        <w:t>S17  Vine, Redbelly Network developer portal: Identity and participation on the network</w:t>
+      </w:r>
+    </w:p>
+    <w:p>
+      <w:r>
+        <w:t>https://vine.redbelly.network/identity/</w:t>
       </w:r>
     </w:p>
     <w:p>
@@ -1933,7 +2454,15 @@
         <w:pStyle w:val="ListBullet"/>
       </w:pPr>
       <w:r>
-        <w:t>“All accredited issuers are listed in an on chain registry.”</w:t>
+        <w:t>“all network participants MUST prove they are who they say they are before gaining access”</w:t>
+      </w:r>
+    </w:p>
+    <w:p>
+      <w:pPr>
+        <w:pStyle w:val="ListBullet"/>
+      </w:pPr>
+      <w:r>
+        <w:t>“business verification is also available on the network”</w:t>
       </w:r>
     </w:p>
     <w:p>
@@ -1941,12 +2470,12 @@
         <w:rPr>
           <w:b/>
         </w:rPr>
-        <w:t>[18] Vine, Redbelly Network developer portal: Business verification</w:t>
-      </w:r>
-    </w:p>
-    <w:p>
-      <w:r>
-        <w:t>https://vine.redbelly.network/business-verification/</w:t>
+        <w:t>S18  Vine, Redbelly Network developer portal: Accredited issuers</w:t>
+      </w:r>
+    </w:p>
+    <w:p>
+      <w:r>
+        <w:t>https://vine.redbelly.network/identity/accredited-issuers/</w:t>
       </w:r>
     </w:p>
     <w:p>
@@ -1954,7 +2483,7 @@
         <w:pStyle w:val="ListBullet"/>
       </w:pPr>
       <w:r>
-        <w:t>“To be verified, businesses need to prove they are an incorporated entity to a network accredited issuer.”</w:t>
+        <w:t>“All accredited issuers are listed in an on chain registry.”</w:t>
       </w:r>
     </w:p>
     <w:p>
@@ -1962,12 +2491,12 @@
         <w:rPr>
           <w:b/>
         </w:rPr>
-        <w:t>[19] Vine, Redbelly Network developer portal: Becoming a node operator</w:t>
-      </w:r>
-    </w:p>
-    <w:p>
-      <w:r>
-        <w:t>https://vine.redbelly.network/nodes/become-operator/</w:t>
+        <w:t>S19  Vine, Redbelly Network developer portal: Business verification</w:t>
+      </w:r>
+    </w:p>
+    <w:p>
+      <w:r>
+        <w:t>https://vine.redbelly.network/business-verification/</w:t>
       </w:r>
     </w:p>
     <w:p>
@@ -1975,7 +2504,7 @@
         <w:pStyle w:val="ListBullet"/>
       </w:pPr>
       <w:r>
-        <w:t>“Node operators MUST have network access for 2 accounts and provide their public address when applying to run a node.”</w:t>
+        <w:t>“To be verified, businesses need to prove they are an incorporated entity to a network accredited issuer.”</w:t>
       </w:r>
     </w:p>
     <w:p>
@@ -1983,12 +2512,12 @@
         <w:rPr>
           <w:b/>
         </w:rPr>
-        <w:t>[20] Redbelly Network technical documentation: Receptor overview</w:t>
-      </w:r>
-    </w:p>
-    <w:p>
-      <w:r>
-        <w:t>https://docs.redbelly.network/pages/receptor/</w:t>
+        <w:t>S20  Vine, Redbelly Network developer portal: Becoming a node operator</w:t>
+      </w:r>
+    </w:p>
+    <w:p>
+      <w:r>
+        <w:t>https://vine.redbelly.network/nodes/become-operator/</w:t>
       </w:r>
     </w:p>
     <w:p>
@@ -1996,15 +2525,7 @@
         <w:pStyle w:val="ListBullet"/>
       </w:pPr>
       <w:r>
-        <w:t>“Receptor is Redbelly's native digital identity and verifiable credential protocol.”</w:t>
-      </w:r>
-    </w:p>
-    <w:p>
-      <w:pPr>
-        <w:pStyle w:val="ListBullet"/>
-      </w:pPr>
-      <w:r>
-        <w:t>“Receptor is built on the W3C verifiable credential data model, providing a standardised and interoperable foundation for identity verification and eligibility criteria assurance.”</w:t>
+        <w:t>“Node operators MUST have network access for 2 accounts and provide their public address when applying to run a node.”</w:t>
       </w:r>
     </w:p>
     <w:p>
@@ -2012,12 +2533,12 @@
         <w:rPr>
           <w:b/>
         </w:rPr>
-        <w:t>[21] Vine, Redbelly Network developer portal: Eligibility</w:t>
-      </w:r>
-    </w:p>
-    <w:p>
-      <w:r>
-        <w:t>https://vine.redbelly.network/identity/eligibility/</w:t>
+        <w:t>S21  Vine, Redbelly Network developer portal: Bridged tokens: Celer cBridge</w:t>
+      </w:r>
+    </w:p>
+    <w:p>
+      <w:r>
+        <w:t>https://vine.redbelly.network/bridged-tokens/celer/</w:t>
       </w:r>
     </w:p>
     <w:p>
@@ -2025,7 +2546,15 @@
         <w:pStyle w:val="ListBullet"/>
       </w:pPr>
       <w:r>
-        <w:t>“Redbelly supports two distinct credential types, or methods, that can be used to perform eligibility criteria checks:”</w:t>
+        <w:t>“RBNT bridges out from Redbelly to Ethereum and BNB Chain, not back.”</w:t>
+      </w:r>
+    </w:p>
+    <w:p>
+      <w:pPr>
+        <w:pStyle w:val="ListBullet"/>
+      </w:pPr>
+      <w:r>
+        <w:t>“Ethereum 0x063a1D5BFEAb213c9c12f47b704fccf81D60983e wRBNT Wrapped RBNT 18”</w:t>
       </w:r>
     </w:p>
     <w:p>
@@ -2033,12 +2562,12 @@
         <w:rPr>
           <w:b/>
         </w:rPr>
-        <w:t>[22] Redbelly Network technical documentation: Selective Disclosure</w:t>
-      </w:r>
-    </w:p>
-    <w:p>
-      <w:r>
-        <w:t>https://docs.redbelly.network/pages/methods/selective-disclosure/</w:t>
+        <w:t>S22  Vine, Redbelly Network developer portal: Bridged tokens: LayerZero</w:t>
+      </w:r>
+    </w:p>
+    <w:p>
+      <w:r>
+        <w:t>https://vine.redbelly.network/bridged-tokens/layerzero/</w:t>
       </w:r>
     </w:p>
     <w:p>
@@ -2046,7 +2575,7 @@
         <w:pStyle w:val="ListBullet"/>
       </w:pPr>
       <w:r>
-        <w:t>“As selective disclosure involves disclosing information to the Verifier, it can only be used off-chain.”</w:t>
+        <w:t>“Tokens on Redbelly Network that can be bridged to other chains via LayerZero, using Stargate, and vice versa.”</w:t>
       </w:r>
     </w:p>
     <w:p>
@@ -2054,12 +2583,12 @@
         <w:rPr>
           <w:b/>
         </w:rPr>
-        <w:t>[23] Redbelly Network technical documentation: Eligibility SDK for Redbelly Network</w:t>
-      </w:r>
-    </w:p>
-    <w:p>
-      <w:r>
-        <w:t>https://docs.redbelly.network/pages/eligibility-sdk/eligibility-sdk/</w:t>
+        <w:t>S23  Vine, Redbelly Network developer portal: Bridged tokens: Lucid Labs</w:t>
+      </w:r>
+    </w:p>
+    <w:p>
+      <w:r>
+        <w:t>https://vine.redbelly.network/bridged-tokens/lucidlabs/</w:t>
       </w:r>
     </w:p>
     <w:p>
@@ -2067,7 +2596,15 @@
         <w:pStyle w:val="ListBullet"/>
       </w:pPr>
       <w:r>
-        <w:t>“Redbelly Mainnet did:receptor:redbelly:mainnet:31AAH8sSaGd6fpnG1TcB6yQ4UZnNeyHzTk5aM2P7rjv”</w:t>
+        <w:t>“Tokens on Redbelly Network that can be bridged to other chains via Lucid Labs, and vice versa. Powered by Polymer and LayerZero.”</w:t>
+      </w:r>
+    </w:p>
+    <w:p>
+      <w:pPr>
+        <w:pStyle w:val="ListBullet"/>
+      </w:pPr>
+      <w:r>
+        <w:t>“Ethereum 0xb45fFB51984d626Ee758b336C61Cf20990c6bF13 WRBNT Wrapped RBNT 18”</w:t>
       </w:r>
     </w:p>
     <w:p>
@@ -2075,12 +2612,12 @@
         <w:rPr>
           <w:b/>
         </w:rPr>
-        <w:t>[24] Vine, Redbelly Network developer portal: Eligibility checks (smart contracts)</w:t>
-      </w:r>
-    </w:p>
-    <w:p>
-      <w:r>
-        <w:t>https://vine.redbelly.network/smart-contracts/eligibility-checks/</w:t>
+        <w:t>S24  Redbelly Network technical documentation: Receptor overview</w:t>
+      </w:r>
+    </w:p>
+    <w:p>
+      <w:r>
+        <w:t>https://docs.redbelly.network/pages/receptor/</w:t>
       </w:r>
     </w:p>
     <w:p>
@@ -2088,7 +2625,15 @@
         <w:pStyle w:val="ListBullet"/>
       </w:pPr>
       <w:r>
-        <w:t>“Eligibility checks can be used to control access to your dApp or smart contract's functions or when specific smart contract functions are called to help meet your compliance requirements.”</w:t>
+        <w:t>“Receptor is Redbelly's native digital identity and verifiable credential protocol.”</w:t>
+      </w:r>
+    </w:p>
+    <w:p>
+      <w:pPr>
+        <w:pStyle w:val="ListBullet"/>
+      </w:pPr>
+      <w:r>
+        <w:t>“Receptor is built on the W3C verifiable credential data model, providing a standardised and interoperable foundation for identity verification and eligibility criteria assurance.”</w:t>
       </w:r>
     </w:p>
     <w:p>
@@ -2096,12 +2641,12 @@
         <w:rPr>
           <w:b/>
         </w:rPr>
-        <w:t>[25] Tokeniser: Automated compliance</w:t>
-      </w:r>
-    </w:p>
-    <w:p>
-      <w:r>
-        <w:t>https://tokeniser.com/product/superpowers/automated-compliance</w:t>
+        <w:t>S25  Vine, Redbelly Network developer portal: Eligibility</w:t>
+      </w:r>
+    </w:p>
+    <w:p>
+      <w:r>
+        <w:t>https://vine.redbelly.network/identity/eligibility/</w:t>
       </w:r>
     </w:p>
     <w:p>
@@ -2109,7 +2654,7 @@
         <w:pStyle w:val="ListBullet"/>
       </w:pPr>
       <w:r>
-        <w:t>“Before any trade proceeds, the investor's identity, eligibility (including wholesale or sophisticated status where required) and your limits are verified automatically.”</w:t>
+        <w:t>“Redbelly supports two distinct credential types, or methods, that can be used to perform eligibility criteria checks:”</w:t>
       </w:r>
     </w:p>
     <w:p>
@@ -2117,12 +2662,12 @@
         <w:rPr>
           <w:b/>
         </w:rPr>
-        <w:t>[26] Tokeniser: Secondary transfer</w:t>
-      </w:r>
-    </w:p>
-    <w:p>
-      <w:r>
-        <w:t>https://tokeniser.com/product/superpowers/secondary-transfer</w:t>
+        <w:t>S26  Redbelly Network technical documentation: Selective Disclosure</w:t>
+      </w:r>
+    </w:p>
+    <w:p>
+      <w:r>
+        <w:t>https://docs.redbelly.network/pages/methods/selective-disclosure/</w:t>
       </w:r>
     </w:p>
     <w:p>
@@ -2130,7 +2675,15 @@
         <w:pStyle w:val="ListBullet"/>
       </w:pPr>
       <w:r>
-        <w:t>“every transfer is recorded on your register in real time”</w:t>
+        <w:t>“As selective disclosure involves disclosing information to the Verifier, it can only be used off-chain.”</w:t>
+      </w:r>
+    </w:p>
+    <w:p>
+      <w:pPr>
+        <w:pStyle w:val="ListBullet"/>
+      </w:pPr>
+      <w:r>
+        <w:t>“Selective Disclosure involves using credentials that implement BBS+ signatures.”</w:t>
       </w:r>
     </w:p>
     <w:p>
@@ -2138,12 +2691,12 @@
         <w:rPr>
           <w:b/>
         </w:rPr>
-        <w:t>[27] Tokeniser: Collateral mobility</w:t>
-      </w:r>
-    </w:p>
-    <w:p>
-      <w:r>
-        <w:t>https://tokeniser.com/product/superpowers/collateral-mobility</w:t>
+        <w:t>S27  Redbelly Network technical documentation: Eligibility SDK for Redbelly Network</w:t>
+      </w:r>
+    </w:p>
+    <w:p>
+      <w:r>
+        <w:t>https://docs.redbelly.network/pages/eligibility-sdk/eligibility-sdk/</w:t>
       </w:r>
     </w:p>
     <w:p>
@@ -2151,7 +2704,7 @@
         <w:pStyle w:val="ListBullet"/>
       </w:pPr>
       <w:r>
-        <w:t>“Investors pledge units as security, and the units remain locked until the loan is repaid.”</w:t>
+        <w:t>“Redbelly Mainnet did:receptor:redbelly:mainnet:31AAH8sSaGd6fpnG1TcB6yQ4UZnNeyHzTk5aM2P7rjv”</w:t>
       </w:r>
     </w:p>
     <w:p>
@@ -2159,12 +2712,12 @@
         <w:rPr>
           <w:b/>
         </w:rPr>
-        <w:t>[28] Vine, Redbelly Network developer portal: Bridged tokens: Celer cBridge</w:t>
-      </w:r>
-    </w:p>
-    <w:p>
-      <w:r>
-        <w:t>https://vine.redbelly.network/bridged-tokens/celer/</w:t>
+        <w:t>S28  Vine, Redbelly Network developer portal: Eligibility checks (smart contracts)</w:t>
+      </w:r>
+    </w:p>
+    <w:p>
+      <w:r>
+        <w:t>https://vine.redbelly.network/smart-contracts/eligibility-checks/</w:t>
       </w:r>
     </w:p>
     <w:p>
@@ -2172,15 +2725,7 @@
         <w:pStyle w:val="ListBullet"/>
       </w:pPr>
       <w:r>
-        <w:t>“RBNT bridges out from Redbelly to Ethereum and BNB Chain, not back.”</w:t>
-      </w:r>
-    </w:p>
-    <w:p>
-      <w:pPr>
-        <w:pStyle w:val="ListBullet"/>
-      </w:pPr>
-      <w:r>
-        <w:t>“Ethereum 0x063a1D5BFEAb213c9c12f47b704fccf81D60983e wRBNT Wrapped RBNT 18”</w:t>
+        <w:t>“Eligibility checks can be used to control access to your dApp or smart contract's functions or when specific smart contract functions are called to help meet your compliance requirements.”</w:t>
       </w:r>
     </w:p>
     <w:p>
@@ -2188,12 +2733,12 @@
         <w:rPr>
           <w:b/>
         </w:rPr>
-        <w:t>[29] Vine, Redbelly Network developer portal: Bridged tokens: LayerZero</w:t>
-      </w:r>
-    </w:p>
-    <w:p>
-      <w:r>
-        <w:t>https://vine.redbelly.network/bridged-tokens/layerzero/</w:t>
+        <w:t>S29  Tokeniser: Automated compliance</w:t>
+      </w:r>
+    </w:p>
+    <w:p>
+      <w:r>
+        <w:t>https://tokeniser.com/product/superpowers/automated-compliance</w:t>
       </w:r>
     </w:p>
     <w:p>
@@ -2201,7 +2746,7 @@
         <w:pStyle w:val="ListBullet"/>
       </w:pPr>
       <w:r>
-        <w:t>“Tokens on Redbelly Network that can be bridged to other chains via LayerZero, using Stargate, and vice versa.”</w:t>
+        <w:t>“Before any trade proceeds, the investor's identity, eligibility (including wholesale or sophisticated status where required) and your limits are verified automatically.”</w:t>
       </w:r>
     </w:p>
     <w:p>
@@ -2209,12 +2754,12 @@
         <w:rPr>
           <w:b/>
         </w:rPr>
-        <w:t>[30] Vine, Redbelly Network developer portal: Bridged tokens: Lucid Labs</w:t>
-      </w:r>
-    </w:p>
-    <w:p>
-      <w:r>
-        <w:t>https://vine.redbelly.network/bridged-tokens/lucidlabs/</w:t>
+        <w:t>S30  Tokeniser: Secondary transfer</w:t>
+      </w:r>
+    </w:p>
+    <w:p>
+      <w:r>
+        <w:t>https://tokeniser.com/product/superpowers/secondary-transfer</w:t>
       </w:r>
     </w:p>
     <w:p>
@@ -2222,15 +2767,7 @@
         <w:pStyle w:val="ListBullet"/>
       </w:pPr>
       <w:r>
-        <w:t>“Tokens on Redbelly Network that can be bridged to other chains via Lucid Labs, and vice versa. Powered by Polymer and LayerZero.”</w:t>
-      </w:r>
-    </w:p>
-    <w:p>
-      <w:pPr>
-        <w:pStyle w:val="ListBullet"/>
-      </w:pPr>
-      <w:r>
-        <w:t>“Ethereum 0xb45fFB51984d626Ee758b336C61Cf20990c6bF13 WRBNT Wrapped RBNT 18”</w:t>
+        <w:t>“every transfer is recorded on your register in real time”</w:t>
       </w:r>
     </w:p>
     <w:p>
@@ -2238,12 +2775,12 @@
         <w:rPr>
           <w:b/>
         </w:rPr>
-        <w:t>[31] Celer Network blog: Celer Announces cBridge Support for Redbelly (1 August 2025)</w:t>
-      </w:r>
-    </w:p>
-    <w:p>
-      <w:r>
-        <w:t>https://blog.celer.network/2025/08/01/celer-announces-cbridge-support-for-redbelly/</w:t>
+        <w:t>S31  Tokeniser: Collateral mobility</w:t>
+      </w:r>
+    </w:p>
+    <w:p>
+      <w:r>
+        <w:t>https://tokeniser.com/product/superpowers/collateral-mobility</w:t>
       </w:r>
     </w:p>
     <w:p>
@@ -2251,7 +2788,7 @@
         <w:pStyle w:val="ListBullet"/>
       </w:pPr>
       <w:r>
-        <w:t>“Celer is supporting asset and token bridging initially via a pegged bridge method”</w:t>
+        <w:t>“Investors pledge units as security, and the units remain locked until the loan is repaid.”</w:t>
       </w:r>
     </w:p>
     <w:p>
@@ -2259,12 +2796,12 @@
         <w:rPr>
           <w:b/>
         </w:rPr>
-        <w:t>[32] Redbelly Network on X: Wrapped RBNT Token is now live on Ethereum Mainnet (14 February 2025)</w:t>
-      </w:r>
-    </w:p>
-    <w:p>
-      <w:r>
-        <w:t>https://x.com/RedbellyNetwork/status/1890340030197166112</w:t>
+        <w:t>S32  Celer Network blog: Celer Announces cBridge Support for Redbelly (1 August 2025)</w:t>
+      </w:r>
+    </w:p>
+    <w:p>
+      <w:r>
+        <w:t>https://blog.celer.network/2025/08/01/celer-announces-cbridge-support-for-redbelly/</w:t>
       </w:r>
     </w:p>
     <w:p>
@@ -2272,15 +2809,7 @@
         <w:pStyle w:val="ListBullet"/>
       </w:pPr>
       <w:r>
-        <w:t>“Wrapped RBNT Token is now live on Ethereum Mainnet.”</w:t>
-      </w:r>
-    </w:p>
-    <w:p>
-      <w:pPr>
-        <w:pStyle w:val="ListBullet"/>
-      </w:pPr>
-      <w:r>
-        <w:t>“0xb45ffb51984d626ee758b336c61cf20990c6bf13”</w:t>
+        <w:t>“Celer is supporting asset and token bridging initially via a pegged bridge method”</w:t>
       </w:r>
     </w:p>
     <w:p>
@@ -2288,12 +2817,12 @@
         <w:rPr>
           <w:b/>
         </w:rPr>
-        <w:t>[33] Redbelly DAO Community Task Board: TASK-08 bridge integration guide (selected entry)</w:t>
-      </w:r>
-    </w:p>
-    <w:p>
-      <w:r>
-        <w:t>https://github.com/Redbelly-DAO-Community-Taskboard/TASK-08-bridge-integration-guide</w:t>
+        <w:t>S33  Redbelly Network on X: Wrapped RBNT Token is now live on Ethereum Mainnet (14 February 2025)</w:t>
+      </w:r>
+    </w:p>
+    <w:p>
+      <w:r>
+        <w:t>https://x.com/RedbellyNetwork/status/1890340030197166112</w:t>
       </w:r>
     </w:p>
     <w:p>
@@ -2301,7 +2830,7 @@
         <w:pStyle w:val="ListBullet"/>
       </w:pPr>
       <w:r>
-        <w:t>“Redbridge is a lock-and-mint bridge”</w:t>
+        <w:t>“Wrapped RBNT Token is now live on Ethereum Mainnet.”</w:t>
       </w:r>
     </w:p>
     <w:p>
@@ -2309,7 +2838,7 @@
         <w:pStyle w:val="ListBullet"/>
       </w:pPr>
       <w:r>
-        <w:t>“Yes, on Mainnet dedicated "Redbelly Mainnet" deployment”</w:t>
+        <w:t>“0xb45ffb51984d626ee758b336c61cf20990c6bf13”</w:t>
       </w:r>
     </w:p>
     <w:p>
@@ -2317,12 +2846,12 @@
         <w:rPr>
           <w:b/>
         </w:rPr>
-        <w:t>[34] TASK-08 entry, public repository: Bridging Ethereum Sepolia to Redbelly Testnet: technical guide</w:t>
-      </w:r>
-    </w:p>
-    <w:p>
-      <w:r>
-        <w:t>https://github.com/tycayomide/redbelly-testnet-bridge/blob/main/TECHNICAL_GUIDE.md</w:t>
+        <w:t>S34  Redbelly DAO Community Task Board: TASK-08 bridge integration guide (selected entry)</w:t>
+      </w:r>
+    </w:p>
+    <w:p>
+      <w:r>
+        <w:t>https://github.com/Redbelly-DAO-Community-Taskboard/TASK-08-bridge-integration-guide</w:t>
       </w:r>
     </w:p>
     <w:p>
@@ -2330,7 +2859,15 @@
         <w:pStyle w:val="ListBullet"/>
       </w:pPr>
       <w:r>
-        <w:t>“no major interoperability protocol has deployed core messaging infrastructure (endpoints, gateways, or guardian sets) to”</w:t>
+        <w:t>“Redbridge is a lock-and-mint bridge”</w:t>
+      </w:r>
+    </w:p>
+    <w:p>
+      <w:pPr>
+        <w:pStyle w:val="ListBullet"/>
+      </w:pPr>
+      <w:r>
+        <w:t>“Yes, on Mainnet dedicated "Redbelly Mainnet" deployment”</w:t>
       </w:r>
     </w:p>
     <w:p>
@@ -2338,12 +2875,12 @@
         <w:rPr>
           <w:b/>
         </w:rPr>
-        <w:t>[35] Redbelly DAO Community Task Board: TASK-16 Cross-Chain Recovery Playbook (selected entry, PDF)</w:t>
-      </w:r>
-    </w:p>
-    <w:p>
-      <w:r>
-        <w:t>https://github.com/Redbelly-DAO-Community-Taskboard/TASK-16-cross-chain-recovery-playbook/blob/main/deliverable/Redbelly-task-16-revised.pdf</w:t>
+        <w:t>S35  TASK-08 entry, public repository: Bridging Ethereum Sepolia to Redbelly Testnet: technical guide</w:t>
+      </w:r>
+    </w:p>
+    <w:p>
+      <w:r>
+        <w:t>https://github.com/tycayomide/redbelly-testnet-bridge/blob/main/TECHNICAL_GUIDE.md</w:t>
       </w:r>
     </w:p>
     <w:p>
@@ -2351,7 +2888,7 @@
         <w:pStyle w:val="ListBullet"/>
       </w:pPr>
       <w:r>
-        <w:t>“Because the official Redbelly bridges (Reddex and Lucid) currently only support bridging USDC and USDT from BNB Chain”</w:t>
+        <w:t>“no major interoperability protocol has deployed core messaging infrastructure (endpoints, gateways, or guardian sets) to”</w:t>
       </w:r>
     </w:p>
     <w:p>
@@ -2359,12 +2896,12 @@
         <w:rPr>
           <w:b/>
         </w:rPr>
-        <w:t>[36] Quant, Overledger API reference: Overledger Server API reference</w:t>
-      </w:r>
-    </w:p>
-    <w:p>
-      <w:r>
-        <w:t>https://docs.overledger.dev/reference</w:t>
+        <w:t>S36  Redbelly DAO Community Task Board: TASK-16 Cross-Chain Recovery Playbook (selected entry, PDF)</w:t>
+      </w:r>
+    </w:p>
+    <w:p>
+      <w:r>
+        <w:t>https://github.com/Redbelly-DAO-Community-Taskboard/TASK-16-cross-chain-recovery-playbook/blob/main/deliverable/Redbelly-task-16-revised.pdf</w:t>
       </w:r>
     </w:p>
     <w:p>
@@ -2372,7 +2909,7 @@
         <w:pStyle w:val="ListBullet"/>
       </w:pPr>
       <w:r>
-        <w:t>“List Fusion Rollup connected networks”</w:t>
+        <w:t>“Because the official Redbelly bridges (Reddex and Lucid) currently only support bridging USDC and USDT from BNB Chain”</w:t>
       </w:r>
     </w:p>
     <w:p>
@@ -2380,12 +2917,12 @@
         <w:rPr>
           <w:b/>
         </w:rPr>
-        <w:t>[37] Test run for this report: Calls to the public Overledger server API without an account, 15 October 2026</w:t>
-      </w:r>
-    </w:p>
-    <w:p>
-      <w:r>
-        <w:t>evidence/tests/overledger-api-check.txt (in the project repository)</w:t>
+        <w:t>S37  Quant, Overledger documentation: Chapter 9: Overledger Firewall</w:t>
+      </w:r>
+    </w:p>
+    <w:p>
+      <w:r>
+        <w:t>https://docs.overledger.dev/docs/overledger-firewall</w:t>
       </w:r>
     </w:p>
     <w:p>
@@ -2393,7 +2930,15 @@
         <w:pStyle w:val="ListBullet"/>
       </w:pPr>
       <w:r>
-        <w:t>“GET https://fusion-rollup.quant.dev/networks/fusion -&gt; HTTP 401 {"status":401,"error":"Missing authorization header."”</w:t>
+        <w:t>“Overledger maintains the binding between each user and their authorised on-chain address(es) off-chain, so policies expressed against a user translate into on-chain address allowlists at the contracts that enforce them.”</w:t>
+      </w:r>
+    </w:p>
+    <w:p>
+      <w:pPr>
+        <w:pStyle w:val="ListBullet"/>
+      </w:pPr>
+      <w:r>
+        <w:t>“Token allowlist entries are governance-controlled (Quant Safe signers), not per-deployer, they apply to all users of the bridge.”</w:t>
       </w:r>
     </w:p>
     <w:p>
@@ -2401,12 +2946,12 @@
         <w:rPr>
           <w:b/>
         </w:rPr>
-        <w:t>[38] Quant, Overledger documentation: Chapter 9: Overledger Firewall</w:t>
-      </w:r>
-    </w:p>
-    <w:p>
-      <w:r>
-        <w:t>https://docs.overledger.dev/docs/overledger-firewall</w:t>
+        <w:t>S38  Quant, Overledger API reference: Overledger Server API reference</w:t>
+      </w:r>
+    </w:p>
+    <w:p>
+      <w:r>
+        <w:t>https://docs.overledger.dev/reference</w:t>
       </w:r>
     </w:p>
     <w:p>
@@ -2414,28 +2959,12 @@
         <w:pStyle w:val="ListBullet"/>
       </w:pPr>
       <w:r>
-        <w:t>“Overledger maintains the binding between each user and their authorised on-chain address(es) off-chain, so policies expressed against a user translate into on-chain address allowlists at the contracts that enforce them.”</w:t>
-      </w:r>
-    </w:p>
-    <w:p>
-      <w:pPr>
-        <w:pStyle w:val="ListBullet"/>
-      </w:pPr>
-      <w:r>
-        <w:t>“If permissioned, the user must appear in the network's allowlist.”</w:t>
-      </w:r>
-    </w:p>
-    <w:p>
-      <w:pPr>
-        <w:pStyle w:val="ListBullet"/>
-      </w:pPr>
-      <w:r>
-        <w:t>“Token allowlist entries are governance-controlled (Quant Safe signers), not per-deployer, they apply to all users of the bridge.”</w:t>
+        <w:t>“List Fusion Rollup connected networks”</w:t>
       </w:r>
     </w:p>
     <w:sectPr>
       <w:pgSz w:w="12240" w:h="15840"/>
-      <w:pgMar w:top="1440" w:right="1800" w:bottom="1440" w:left="1800" w:header="720" w:footer="720" w:gutter="0"/>
+      <w:pgMar w:top="1440" w:right="1134" w:bottom="1440" w:left="1134" w:header="720" w:footer="720" w:gutter="0"/>
       <w:cols w:space="720"/>
       <w:docGrid w:linePitch="360"/>
     </w:sectPr>

</xml_diff>

<commit_message>
Give every chapter its own page with clean addresses, move to Vercel, use the Task Board icon, follow the brand kit status style, and drop the typing effect
</commit_message>
<xml_diff>
--- a/public/downloads/redbelly-overledger-feasibility-report.docx
+++ b/public/downloads/redbelly-overledger-feasibility-report.docx
@@ -20,7 +20,7 @@
     </w:p>
     <w:p>
       <w:r>
-        <w:t>Redbelly DAO community research. Feasibility report, sources last verified 15 Oct 2026. Web version: https://overledger.test-hub.xyz</w:t>
+        <w:t>Redbelly DAO community research. Feasibility report, sources last verified 15 Oct 2026. Web version: https://overledger.vercel.app</w:t>
       </w:r>
     </w:p>
     <w:p>
@@ -1684,7 +1684,7 @@
         <w:pStyle w:val="ListNumber"/>
       </w:pPr>
       <w:r>
-        <w:t>6/ Still unknown: whether Overledger would treat Redbelly as self-serve, since writing needs a credential, which chains The Clearing House network will reach, and Redbelly's position on bridging. Full report with every source: https://overledger.test-hub.xyz</w:t>
+        <w:t>6/ Still unknown: whether Overledger would treat Redbelly as self-serve, since writing needs a credential, which chains The Clearing House network will reach, and Redbelly's position on bridging. Full report with every source: https://overledger.vercel.app</w:t>
       </w:r>
     </w:p>
     <w:p>

</xml_diff>

<commit_message>
Fix reviewer audit findings: claims matched to their sources, clickable source links in the PDF and Word file, plain words list, published evidence, diagram fixes, line length, print and no-JavaScript fixes
</commit_message>
<xml_diff>
--- a/public/downloads/redbelly-overledger-feasibility-report.docx
+++ b/public/downloads/redbelly-overledger-feasibility-report.docx
@@ -20,8 +20,17 @@
     </w:p>
     <w:p>
       <w:r>
-        <w:t>Redbelly DAO community research. Feasibility report, sources last verified 15 Oct 2026. Web version: https://overledger.vercel.app</w:t>
-      </w:r>
+        <w:t xml:space="preserve">Redbelly DAO community research. Feasibility report, sources last verified 15 Oct 2026. Web version: </w:t>
+      </w:r>
+      <w:hyperlink r:id="rId9">
+        <w:r>
+          <w:rPr>
+            <w:color w:val="B3272A"/>
+            <w:u w:val="single"/>
+          </w:rPr>
+          <w:t xml:space="preserve">https://overledger.vercel.app</w:t>
+        </w:r>
+      </w:hyperlink>
     </w:p>
     <w:p>
       <w:r>
@@ -90,6 +99,159 @@
       </w:r>
       <w:r>
         <w:t>Not answered by any public source we found. Treat as open.</w:t>
+      </w:r>
+    </w:p>
+    <w:p>
+      <w:pPr>
+        <w:pStyle w:val="Heading1"/>
+      </w:pPr>
+      <w:r>
+        <w:t>Plain words</w:t>
+      </w:r>
+    </w:p>
+    <w:p>
+      <w:r>
+        <w:t>The technical terms this report uses, in one or two lines each. Where a term is Overledger's or Redbelly's own, the source is cited.</w:t>
+      </w:r>
+    </w:p>
+    <w:p>
+      <w:pPr>
+        <w:pStyle w:val="ListBullet"/>
+      </w:pPr>
+      <w:r>
+        <w:rPr>
+          <w:b/>
+        </w:rPr>
+        <w:t xml:space="preserve">RPC: </w:t>
+      </w:r>
+      <w:r>
+        <w:t>The address and interface that apps and wallets use to read a blockchain and send transactions to it. Overledger's self-serve test is about how a chain's nodes answer RPC calls [S3].</w:t>
+      </w:r>
+    </w:p>
+    <w:p>
+      <w:pPr>
+        <w:pStyle w:val="ListBullet"/>
+      </w:pPr>
+      <w:r>
+        <w:rPr>
+          <w:b/>
+        </w:rPr>
+        <w:t xml:space="preserve">Node: </w:t>
+      </w:r>
+      <w:r>
+        <w:t>A computer that runs a blockchain's software and answers RPC calls. Overledger registers nodes as public or private [S3].</w:t>
+      </w:r>
+    </w:p>
+    <w:p>
+      <w:pPr>
+        <w:pStyle w:val="ListBullet"/>
+      </w:pPr>
+      <w:r>
+        <w:rPr>
+          <w:b/>
+        </w:rPr>
+        <w:t xml:space="preserve">EVM: </w:t>
+      </w:r>
+      <w:r>
+        <w:t>The Ethereum Virtual Machine, the engine that runs Ethereum-style smart contracts. Redbelly can run contracts written for it [S2].</w:t>
+      </w:r>
+    </w:p>
+    <w:p>
+      <w:pPr>
+        <w:pStyle w:val="ListBullet"/>
+      </w:pPr>
+      <w:r>
+        <w:rPr>
+          <w:b/>
+        </w:rPr>
+        <w:t xml:space="preserve">Self-serve and engagement: </w:t>
+      </w:r>
+      <w:r>
+        <w:t>Overledger's two ways to add a chain: self-serve, by one form or API call, or a managed project with Quant's team [S3, S13].</w:t>
+      </w:r>
+    </w:p>
+    <w:p>
+      <w:pPr>
+        <w:pStyle w:val="ListBullet"/>
+      </w:pPr>
+      <w:r>
+        <w:rPr>
+          <w:b/>
+        </w:rPr>
+        <w:t xml:space="preserve">Gateway and Connectors: </w:t>
+      </w:r>
+      <w:r>
+        <w:t>Overledger's single way in, and the parts behind it that speak each chain family's protocol [S13].</w:t>
+      </w:r>
+    </w:p>
+    <w:p>
+      <w:pPr>
+        <w:pStyle w:val="ListBullet"/>
+      </w:pPr>
+      <w:r>
+        <w:rPr>
+          <w:b/>
+        </w:rPr>
+        <w:t xml:space="preserve">Fusion Rollup: </w:t>
+      </w:r>
+      <w:r>
+        <w:t>Overledger's separate shared layer: deposits from connected chains become balances on it and can be withdrawn back [S13].</w:t>
+      </w:r>
+    </w:p>
+    <w:p>
+      <w:pPr>
+        <w:pStyle w:val="ListBullet"/>
+      </w:pPr>
+      <w:r>
+        <w:rPr>
+          <w:b/>
+        </w:rPr>
+        <w:t xml:space="preserve">State root: </w:t>
+      </w:r>
+      <w:r>
+        <w:t>A short fingerprint of the rollup's balances, posted to every connected chain [S6].</w:t>
+      </w:r>
+    </w:p>
+    <w:p>
+      <w:pPr>
+        <w:pStyle w:val="ListBullet"/>
+      </w:pPr>
+      <w:r>
+        <w:rPr>
+          <w:b/>
+        </w:rPr>
+        <w:t xml:space="preserve">Dispute window: </w:t>
+      </w:r>
+      <w:r>
+        <w:t>The wait before a rollup withdrawal is final, during which a challenger can prove the rollup's state invalid [S6].</w:t>
+      </w:r>
+    </w:p>
+    <w:p>
+      <w:pPr>
+        <w:pStyle w:val="ListBullet"/>
+      </w:pPr>
+      <w:r>
+        <w:rPr>
+          <w:b/>
+        </w:rPr>
+        <w:t xml:space="preserve">Allowlist: </w:t>
+      </w:r>
+      <w:r>
+        <w:t>A list of addresses a contract lets through. Overledger turns its rules about users into allowlists [S37].</w:t>
+      </w:r>
+    </w:p>
+    <w:p>
+      <w:pPr>
+        <w:pStyle w:val="ListBullet"/>
+      </w:pPr>
+      <w:r>
+        <w:rPr>
+          <w:b/>
+        </w:rPr>
+        <w:t xml:space="preserve">Verifiable credential: </w:t>
+      </w:r>
+      <w:r>
+        <w:t>A signed digital statement about a person, such as having passed identity checks, that the person holds. Receptor uses this W3C model [S24].</w:t>
       </w:r>
     </w:p>
     <w:p>
@@ -181,7 +343,7 @@
           </w:tcPr>
           <w:p>
             <w:r>
-              <w:t>Possibly, but unconfirmed. Redbelly is EVM compatible and its RPC fits Overledger's self-serve tests, but Overledger describes self-serve as for public permissionless networks, and writing to Redbelly needs a credential. Nobody has shown it working. [S2, S3, S4, S5]</w:t>
+              <w:t>Possibly, but unconfirmed. Redbelly runs Ethereum-style smart contracts, which is what EVM compatible means, and its public RPC, the address apps use to read the chain and send transactions, appears to fit Overledger's self-serve tests. But Overledger describes self-serve as for public permissionless networks, and writing to Redbelly needs a credential. We found no public test of this route, and we did not test inside Overledger. [S2, S3, S4, S5]</w:t>
             </w:r>
           </w:p>
         </w:tc>
@@ -223,7 +385,7 @@
           </w:tcPr>
           <w:p>
             <w:r>
-              <w:t>Not possible yet, as far as public sources show. Redbelly is not among the networks documented at testnet launch, and the docs describe no self-serve way to add one. [S6, S7]</w:t>
+              <w:t>Not possible yet, as far as public sources show. Redbelly is not among the networks documented at testnet launch, the live list needs an API key so we could not check it, and the docs describe no self-serve way to add a network. [S6, S7]</w:t>
             </w:r>
           </w:p>
         </w:tc>
@@ -265,7 +427,7 @@
           </w:tcPr>
           <w:p>
             <w:r>
-              <w:t>No, not by themselves. Redbelly's access credential and Proof by Query checks run on Redbelly, and Tokeniser enforces its rules at the point of transfer. A copy on another chain follows only that chain's own rules. [S5, S8, S9]</w:t>
+              <w:t>No, not by themselves. Redbelly's access credential and Proof by Query checks run on Redbelly, and Tokeniser enforces its rules at the point of transfer on Redbelly. No public source shows these checks reaching a copy of the asset on another chain. [S5, S8, S9]</w:t>
             </w:r>
           </w:p>
         </w:tc>
@@ -372,7 +534,7 @@
         <w:pStyle w:val="Heading1"/>
       </w:pPr>
       <w:r>
-        <w:t>2. What Overledger is</w:t>
+        <w:t>2. What is Overledger?</w:t>
       </w:r>
     </w:p>
     <w:p>
@@ -384,7 +546,7 @@
         <w:t xml:space="preserve">[Confirmed] </w:t>
       </w:r>
       <w:r>
-        <w:t>Overledger is Quant's platform for building applications that span more than one blockchain [S12]. It has three foundations: a Gateway that authenticates clients and routes requests [S13]; Connectors that put each chain's own RPC protocol behind one common interface [S13]; and the Fusion Rollup, a shared layer that anchors to several chains at once and supports deposits, withdrawals and cross-chain messages between them [S13].</w:t>
+        <w:t>Overledger is Quant's platform for building applications that span more than one blockchain [S12]. It has three foundations: a Gateway that authenticates clients, routes requests and is also the way in to the Fusion Rollup [S13]; Connectors, one for each chain family such as EVM or Solana [S13], that put that family's RPC protocol behind one common interface [S13]; and the Fusion Rollup, a shared layer that anchors to several chains at once and supports deposits, withdrawals and cross-chain messages between them [S13].</w:t>
       </w:r>
     </w:p>
     <w:p>
@@ -404,7 +566,7 @@
                     <pic:cNvPicPr/>
                   </pic:nvPicPr>
                   <pic:blipFill>
-                    <a:blip r:embed="rId9"/>
+                    <a:blip r:embed="rId10"/>
                     <a:stretch>
                       <a:fillRect/>
                     </a:stretch>
@@ -431,7 +593,7 @@
         <w:t xml:space="preserve">Figure 1. Overledger in one picture. </w:t>
       </w:r>
       <w:r>
-        <w:t>The Gateway, Connectors and Flow Apps are the switchboard [S12, S13]. The Fusion Rollup is a separate layer whose deposits, withdrawals and cross-chain messages run with the networks connected to it [S13], and Redbelly is not among the networks documented at testnet launch [S6].</w:t>
+        <w:t>The Gateway, Connectors and Flow Apps are the switchboard [S12, S13]. The Fusion Rollup is a separate layer, reached through the Gateway [S13], whose deposits, withdrawals and cross-chain messages run with the networks connected to it [S13], and Redbelly is not among the networks documented at testnet launch [S6].</w:t>
       </w:r>
     </w:p>
     <w:p>
@@ -455,7 +617,7 @@
         <w:t xml:space="preserve">[Confirmed] </w:t>
       </w:r>
       <w:r>
-        <w:t>Multi-step workflows such as signing or deploying a contract run as Flow Apps [S12]. Signing can be done with the user's own keys [S14], and the client never sees private key material [S14].</w:t>
+        <w:t>Multi-step workflows such as signing or deploying a contract run as Flow Apps [S12]. Signing can be done with the user's own keys [S14], and neither the calling Flow App nor the Gateway ever sees them [S14].</w:t>
       </w:r>
     </w:p>
     <w:p>
@@ -495,7 +657,7 @@
                     <pic:cNvPicPr/>
                   </pic:nvPicPr>
                   <pic:blipFill>
-                    <a:blip r:embed="rId10"/>
+                    <a:blip r:embed="rId11"/>
                     <a:stretch>
                       <a:fillRect/>
                     </a:stretch>
@@ -522,7 +684,7 @@
         <w:t xml:space="preserve">Figure 2. Two ways a chain reaches Overledger. </w:t>
       </w:r>
       <w:r>
-        <w:t>Self-serve covers six chain families and needs no talk with Quant's account team: one API call or form registers a node and, for a new network, the network itself [S3]. Networks where node identity matters, and new chain families, go through an engagement [S3, S13].</w:t>
+        <w:t>Self-serve covers public permissionless networks in six chain families and needs no talk with Quant's account team: one API call or form registers a node and, for a new network, the network itself [S3]. Networks where node identity matters, and new chain families, go through an engagement [S3, S13].</w:t>
       </w:r>
     </w:p>
     <w:p>
@@ -546,7 +708,7 @@
         <w:t xml:space="preserve">[Confirmed] </w:t>
       </w:r>
       <w:r>
-        <w:t>A chain that is not listed yet, but belongs to one of the six self-serve families, is added with the same registration call that adds a node [S3]. The first registration creates the network, and it then becomes available to other Overledger users [S3].</w:t>
+        <w:t>For public permissionless networks, a chain that is not listed yet but belongs to one of the six self-serve families is added with the same registration call that adds a node [S3]. The first registration creates the network, and it then becomes available to other Overledger users [S3].</w:t>
       </w:r>
     </w:p>
     <w:p>
@@ -602,7 +764,7 @@
         <w:t xml:space="preserve">[Tested] </w:t>
       </w:r>
       <w:r>
-        <w:t>On 15 October 2026 the official mainnet RPC and the Ankr RPC both answered with chain ID 151 (0x97) [S4], and the official mainnet RPC returned the latest block [S4]. The method net_version, which gives a network ID to wallets and tools that predate eth_chainId [S6], returned "the method net_version does not exist/is not available" [S4].</w:t>
+        <w:t>On 15 October 2026 the official mainnet RPC and the Ankr RPC both answered with chain ID 151 (0x97) [S4], and the official mainnet RPC returned block data [S4]. The method net_version, which gives a network ID to wallets and tools that predate eth_chainId [S6], returned "the method net_version does not exist/is not available" [S4].</w:t>
       </w:r>
     </w:p>
     <w:p>
@@ -634,7 +796,7 @@
                     <pic:cNvPicPr/>
                   </pic:nvPicPr>
                   <pic:blipFill>
-                    <a:blip r:embed="rId11"/>
+                    <a:blip r:embed="rId12"/>
                     <a:stretch>
                       <a:fillRect/>
                     </a:stretch>
@@ -673,7 +835,7 @@
         <w:t xml:space="preserve">[Confirmed] </w:t>
       </w:r>
       <w:r>
-        <w:t>Receptor is Redbelly's identity and verifiable credential protocol [S24], built on the W3C verifiable credential data model [S24]. It supports two methods [S25]. Proof by Query uses a zero knowledge verifier smart contract [S8] and publishes identity state to the chain [S8]. Selective Disclosure uses BBS+ signatures [S26], reveals chosen details to a verifier, and can only be used off-chain [S26]. The documented issuer identifiers for Redbelly environments take the form did:receptor:redbelly [S27], and apps can use eligibility checks to control who may call their contract functions [S28].</w:t>
+        <w:t>Receptor is Redbelly's identity and verifiable credential protocol [S24], built on the W3C verifiable credential data model [S24]. It supports two methods [S25]. Proof by Query uses a zero knowledge verifier smart contract [S8] and publishes identity state to the chain [S8]. Selective Disclosure uses BBS+ signatures [S26], reveals chosen details to a verifier, and can only be used off-chain [S26]. The documented identifiers of Averer, one authorised issuer, take the form did:receptor:redbelly [S27], and apps can use eligibility checks to control who may call their contract functions [S28].</w:t>
       </w:r>
     </w:p>
     <w:p>
@@ -685,7 +847,7 @@
         <w:t xml:space="preserve">[Confirmed] </w:t>
       </w:r>
       <w:r>
-        <w:t>Tokeniser runs on Redbelly [S9] and enforces eligibility, identity and target market rules at the point of transfer, every time [S9]. Before any trade proceeds, identity, eligibility and limits are checked [S29]; transfers are recorded on the register in real time [S30]; and pledged units stay locked until a loan is repaid [S31]. Redbelly settles a transaction in a single round [S9].</w:t>
+        <w:t>Tokeniser runs on Redbelly [S9] and enforces eligibility, identity and target market rules at the point of transfer, every time [S9]. Before any trade proceeds, identity, eligibility and limits are checked [S29]; transfers are recorded on the issuer's register in real time [S30]; and pledged units stay locked until a loan is repaid [S31]. Redbelly settles a transaction in a single round [S9].</w:t>
       </w:r>
     </w:p>
     <w:p>
@@ -697,7 +859,7 @@
         <w:t xml:space="preserve">[Confirmed] </w:t>
       </w:r>
       <w:r>
-        <w:t>Redbelly already has token bridges. Its developer portal lists three routes: Celer cBridge [S21], LayerZero with Stargate [S22] and Lucid Labs [S23]. Celer uses a pegged bridge method [S32], and its RBNT route goes out from Redbelly but not back [S21]. Redbelly announced Wrapped RBNT on Ethereum with the contract 0xb45f...bf13 [S33], which the portal lists under Lucid Labs [S23]. The portal lists a different Ethereum contract for the Celer route [S21].</w:t>
+        <w:t>Redbelly already has token bridges. Its developer portal lists three routes: Celer cBridge [S21], LayerZero with Stargate [S22] and Lucid Labs [S23]. Celer launched with a pegged bridge method [S32], and its RBNT route goes out from Redbelly but not back [S21]. Redbelly announced Wrapped RBNT on Ethereum with the contract 0xb45f...bf13 [S33], which the portal lists under Lucid Labs [S23]. The portal lists a different Ethereum contract for the Celer route [S21].</w:t>
       </w:r>
     </w:p>
     <w:p>
@@ -709,7 +871,7 @@
         <w:t xml:space="preserve">[Confirmed] </w:t>
       </w:r>
       <w:r>
-        <w:t>Community research for TASK-08 found LayerZero live on Redbelly mainnet [S34]. A second TASK-08 entry found that, when it was written, no major interoperability protocol had deployed core messaging infrastructure to Redbelly testnet [S35], and the selected entry built a lock-and-mint testnet bridge [S34]. The TASK-16 playbook says the bridges it calls official, Reddex and Lucid, then supported only bridging USDC and USDT from BNB Chain [S36].</w:t>
+        <w:t>Community research for TASK-08 found LayerZero live on Redbelly mainnet [S34, S35]. A second TASK-08 entry found that, when it was written, no major interoperability protocol had deployed core messaging infrastructure to Redbelly testnet [S35], and the selected entry built a lock-and-mint testnet bridge [S34]. The TASK-16 playbook says the bridges it calls official, Reddex and Lucid, then supported only bridging USDC and USDT from BNB Chain [S36].</w:t>
       </w:r>
     </w:p>
     <w:p>
@@ -742,7 +904,7 @@
                     <pic:cNvPicPr/>
                   </pic:nvPicPr>
                   <pic:blipFill>
-                    <a:blip r:embed="rId12"/>
+                    <a:blip r:embed="rId13"/>
                     <a:stretch>
                       <a:fillRect/>
                     </a:stretch>
@@ -769,7 +931,7 @@
         <w:t xml:space="preserve">Figure 4. Three meanings of 'connect', three answers. </w:t>
       </w:r>
       <w:r>
-        <w:t>Level 1 rests on Redbelly's EVM compatibility and Overledger's self-serve EVM route [S2, S3], with open points: whether self-serve applies to a network where writing needs a credential, the health check, a keyed provider endpoint and the live lists [S3, S4, S7, S13]. Level 2 cannot be checked from public sources [S14]. Level 3 is not possible yet as far as public sources show [S5, S6, S37].</w:t>
+        <w:t>Level 1 rests on Redbelly's EVM compatibility and Overledger's self-serve EVM route [S2, S3], with open points: whether self-serve applies to a network where writing needs a credential, the health check, a keyed provider endpoint and the live lists [S3, S4, S7, S13]. Level 2 cannot be checked from public sources, because the app catalogue is shown only to account holders [S14]. Level 3 is not possible yet as far as public sources show [S5, S6, S37].</w:t>
       </w:r>
     </w:p>
     <w:p>
@@ -813,7 +975,7 @@
         <w:t xml:space="preserve">[Unknown] </w:t>
       </w:r>
       <w:r>
-        <w:t>Four points are open. First, how Overledger would classify Redbelly. Self-serve is written for public, permissionless networks [S3], Overledger's own glossary calls a network where anyone can read but only allowlisted parties can write "public permissioned" [S13], and permissioned EVM networks are on the engagement route [S3]. Writing to Redbelly needs an access credential [S5], so Redbelly could be treated as an engagement network; the docs do not say. Second, the docs say only that the health check uses the chain's standard validation [S3] and that a checker does a chain identifier lookup [S3], not which call the EVM check uses. If it relies on net_version, Redbelly's answer [S4] could fail it. Third, a public node URL must carry a provider API key [S3], and we did not confirm that Ankr's keyed service covers Redbelly. Fourth, Overledger's live network list [S3] and the Fusion Rollup's list [S38] both answered "Missing authorization header" without an API key [S7], so we could not see whether Redbelly is already listed.</w:t>
+        <w:t>Four points are open. First, how Overledger would classify Redbelly. Self-serve is written for public, permissionless networks [S3], Overledger's own glossary calls a network where anyone can read but only allowlisted parties can write "public permissioned" [S13], and permissioned EVM networks are on the engagement route [S3]. The same docs send networks that need any other identity-bound configuration, and operator-gated public chains, to the engagement route [S3], and Redbelly selects its node operators by application [S20]. Writing to Redbelly needs an access credential [S5], so Redbelly could be treated as an engagement network; the docs do not say. Second, the docs say only that the health check uses the chain's standard validation [S3] and that a checker does a chain identifier lookup [S3], not which call the EVM check uses. If it relies on net_version, Redbelly's answer [S4] could fail it. Third, a public node URL must carry a provider API key [S3], and we did not confirm that Ankr's keyed service covers Redbelly. Fourth, Overledger's live network list [S3] and the Fusion Rollup's list [S38] both answered "Missing authorization header" without an API key [S7], so we could not see whether Redbelly is already listed.</w:t>
       </w:r>
     </w:p>
     <w:p>
@@ -833,7 +995,7 @@
         <w:t xml:space="preserve">[Analysis] </w:t>
       </w:r>
       <w:r>
-        <w:t>Flow Apps are multi-step workflows run through the Gateway [S12], and customers and partners can also host their own [S13]. The catalogue is not published [S14] and every shipped app is built by Quant [S14], so whether a given app accepts a self-serve EVM network such as Redbelly cannot be checked from public sources. The docs give an effort of about a day per app only for adding a brand-new chain family [S3]; they give no figure for a new network inside a family Overledger already supports.</w:t>
+        <w:t>Flow Apps are multi-step workflows run through the Gateway [S12], and customers and partners can also host their own [S13]. The catalogue is not listed in the public docs; only account holders can see which apps are available to them [S14], and every shipped app is built by Quant [S14], so whether a given app accepts a self-serve EVM network such as Redbelly cannot be checked from public sources. The docs give an effort of about a day per app only for adding a brand-new chain family [S3]; they give no figure for a new network inside a family Overledger already supports.</w:t>
       </w:r>
     </w:p>
     <w:p>
@@ -906,7 +1068,7 @@
                     <pic:cNvPicPr/>
                   </pic:nvPicPr>
                   <pic:blipFill>
-                    <a:blip r:embed="rId13"/>
+                    <a:blip r:embed="rId14"/>
                     <a:stretch>
                       <a:fillRect/>
                     </a:stretch>
@@ -933,7 +1095,7 @@
         <w:t xml:space="preserve">Figure 5. The work, step by step. </w:t>
       </w:r>
       <w:r>
-        <w:t>Level 1 uses the self-serve route, with no account-team conversation, if Redbelly passes the health check [S3, S5]. Level 3 depends on Quant, and no such work has been announced [S1, S6, S9, S37].</w:t>
+        <w:t>Level 1 would use the self-serve route, with no account-team conversation, only if Overledger treats Redbelly as a self-serve network, which its docs do not confirm, and the node passes the health check [S3, S5]. Level 3 depends on Quant, and no such work has been announced [S1, S6, S9, S37].</w:t>
       </w:r>
     </w:p>
     <w:p>
@@ -966,7 +1128,7 @@
         <w:pStyle w:val="ListNumber"/>
       </w:pPr>
       <w:r>
-        <w:t>Level 1, step 3: every address an institution sends from needs Redbelly write access, which its user enables after claiming an access credential from an accredited issuer [S5]. The organisation can also be verified as a business [S19]. They can sign with their own keys [S14].</w:t>
+        <w:t>Level 1, step 3: every address an institution sends from needs Redbelly write access, which its user enables after claiming an access credential from an accredited issuer [S5]. The organisation can also be verified as a business [S19]. They sign with their own keys and send the signed transaction, which the Gateway forwards unchanged [S3].</w:t>
       </w:r>
     </w:p>
     <w:p>
@@ -974,7 +1136,7 @@
         <w:pStyle w:val="ListNumber"/>
       </w:pPr>
       <w:r>
-        <w:t>Level 3, step 1: the rollup's standard bridge and dispute contracts are deployed on Redbelly [S6], from accounts that hold Redbelly access [S5].</w:t>
+        <w:t>Level 3, step 1: the rollup's standard bridge and dispute contracts are deployed on Redbelly [S6], from accounts that hold Redbelly access [S5]. These are the contracts that hold tokens sent to the rollup and let a challenger dispute its state during the dispute window [S6].</w:t>
       </w:r>
     </w:p>
     <w:p>
@@ -982,7 +1144,7 @@
         <w:pStyle w:val="ListNumber"/>
       </w:pPr>
       <w:r>
-        <w:t>Level 3, step 2: the rollup's services start posting rollup state roots to Redbelly for settlement [S6].</w:t>
+        <w:t>Level 3, step 2: the rollup's services start posting rollup state roots, short fingerprints of the rollup's balances, to Redbelly for settlement [S6].</w:t>
       </w:r>
     </w:p>
     <w:p>
@@ -1043,7 +1205,7 @@
         <w:pStyle w:val="ListBullet"/>
       </w:pPr>
       <w:r>
-        <w:t>One interface. An institution that already reaches other chains through Overledger [S12] could read Redbelly and send its own signed transactions through the same Gateway and firewall checks [S13], without managing its own Redbelly RPC providers or node failover [S12], once a Redbelly node is registered [S3].</w:t>
+        <w:t>One interface. An institution that already reaches other chains through Overledger [S12] could read Redbelly and send its own signed transactions through the same Gateway and firewall checks [S13], once a Redbelly node is registered [S3]. If an approved provider's public nodes were registered for Redbelly (not confirmed), it would not need to run its own Redbelly RPC or failover [S3, S12]; with only a private node, each institution would add and run its own [S3].</w:t>
       </w:r>
     </w:p>
     <w:p>
@@ -1115,7 +1277,7 @@
         <w:t xml:space="preserve">[Analysis] </w:t>
       </w:r>
       <w:r>
-        <w:t>A Receptor credential is a W3C verifiable credential held by the user [S24]. Its two methods travel differently. A Selective Disclosure proof is checked off-chain [S26], so in principle any verifier could check it, including an externally hosted Overledger Flow App [S13]; we found no such app, and every shipped app is built by Quant [S14]. A Proof by Query check runs in a verifier contract against identity state published on Redbelly [S8], so another chain cannot run the same check unless that setup is rebuilt there. The access credential that unlocks write access applies to Redbelly only [S5].</w:t>
+        <w:t>A Receptor credential is a W3C verifiable credential held by the user [S24]. Its two methods travel differently. A Selective Disclosure proof is checked off-chain [S26], so in principle any verifier could check it, including an externally hosted Overledger Flow App [S13]; the app catalogue is not public [S14], so whether such an app exists is unknown. A Proof by Query check runs in a verifier contract against identity state published on Redbelly [S8], so another chain cannot run the same check unless that setup is rebuilt there. The access credential unlocks write access on Redbelly, through a Redbelly network contract [S5]; no source shows another chain or Overledger reading it.</w:t>
       </w:r>
     </w:p>
     <w:p>
@@ -1135,7 +1297,7 @@
                     <pic:cNvPicPr/>
                   </pic:nvPicPr>
                   <pic:blipFill>
-                    <a:blip r:embed="rId14"/>
+                    <a:blip r:embed="rId15"/>
                     <a:stretch>
                       <a:fillRect/>
                     </a:stretch>
@@ -1162,7 +1324,7 @@
         <w:t xml:space="preserve">Figure 6. Which Receptor checks could work off Redbelly. </w:t>
       </w:r>
       <w:r>
-        <w:t>Receptor has two methods [S25]. Proof by Query runs in a verifier contract against identity state on Redbelly [S8]. Selective Disclosure uses BBS+ signatures and is checked off-chain [S26], so in principle it could be checked anywhere, but we found no Overledger app that does this; every shipped app is built by Quant [S13, S14]. The access credential applies to Redbelly only [S5].</w:t>
+        <w:t>Receptor has two methods [S25]. Proof by Query runs in a verifier contract against identity state on Redbelly [S8]. Selective Disclosure uses BBS+ signatures and is checked off-chain [S26], so in principle it could be checked anywhere, including by an externally hosted Overledger app [S13], but the app catalogue is not public, so whether one does this is unknown [S14]. The access credential unlocks write access on Redbelly, and no source shows another chain reading it [S5].</w:t>
       </w:r>
     </w:p>
     <w:p>
@@ -1182,7 +1344,7 @@
         <w:t xml:space="preserve">[Analysis] </w:t>
       </w:r>
       <w:r>
-        <w:t>Tokeniser enforces a Tokeniser asset's rules on Redbelly at every transfer [S9, S29]. A lock-and-mint bridge, the pattern of the TASK-08 testnet bridge [S34], locks the asset on one chain and issues a copy on the other. The copy obeys only the rules of the contracts and policies on the other chain. Overledger's firewall decides access from its own list of users and their addresses [S37], not from Receptor credentials.</w:t>
+        <w:t>Tokeniser enforces a Tokeniser asset's rules on Redbelly at every transfer [S9, S29]. A lock-and-mint bridge, the pattern of the TASK-08 testnet bridge [S34], locks the asset on one chain and issues a copy on the other. In our reading, the copy then obeys the rules of the contracts and policies on the other chain. Tokeniser says its reach to other networks can be permissioned as a mandate allows [S9], but publishes no detail of how its transfer checks would apply to such a copy. Overledger's firewall decides access from its own list of users and their addresses [S37], not from Receptor credentials.</w:t>
       </w:r>
     </w:p>
     <w:p>
@@ -1202,7 +1364,7 @@
                     <pic:cNvPicPr/>
                   </pic:nvPicPr>
                   <pic:blipFill>
-                    <a:blip r:embed="rId15"/>
+                    <a:blip r:embed="rId16"/>
                     <a:stretch>
                       <a:fillRect/>
                     </a:stretch>
@@ -1229,7 +1391,7 @@
         <w:t xml:space="preserve">Figure 7. Where compliance could break. </w:t>
       </w:r>
       <w:r>
-        <w:t>Tokeniser enforces its rules on Redbelly at every transfer [S9, S29]. A bridge locks the asset and issues a copy elsewhere [S34], and the copy follows only the rules on that chain [S37]. The numbers match the list below [S6, S9, S30, S31, S37].</w:t>
+        <w:t>Tokeniser enforces its rules on Redbelly at every transfer [S9, S29]. A bridge, such as the TASK-08 lock-and-mint pattern [S34] or the Fusion Rollup's bridge contracts [S6], locks the asset and issues a copy elsewhere; in our analysis the copy then follows the rules on that chain. Break points 5 and 7 apply to the Fusion Rollup [S6, S37]. The numbers match the list below.</w:t>
       </w:r>
     </w:p>
     <w:p>
@@ -1270,7 +1432,7 @@
         <w:pStyle w:val="ListNumber"/>
       </w:pPr>
       <w:r>
-        <w:t>A revoked credential on Redbelly [S5] does not reach a copy held elsewhere unless someone updates the other list [S37].</w:t>
+        <w:t>If a holder's credential stopped being valid on Redbelly [S5], nothing documented would pass that change to a copy held elsewhere or to Overledger's allowlists [S37].</w:t>
       </w:r>
     </w:p>
     <w:p>
@@ -1294,7 +1456,7 @@
         <w:pStyle w:val="ListNumber"/>
       </w:pPr>
       <w:r>
-        <w:t>The register is kept on Redbelly in real time [S30]. Units held on another chain, or locked in a bridge [S31], need clear treatment in that register.</w:t>
+        <w:t>Tokeniser records every transfer on the issuer's register in real time [S30], and already keeps units pledged for a loan locked until it is repaid [S31]. Units locked in a bridge contract, or held on another chain, would need similar clear treatment in that register.</w:t>
       </w:r>
     </w:p>
     <w:p>
@@ -1418,7 +1580,7 @@
           </w:tcPr>
           <w:p>
             <w:r>
-              <w:t>Not possible yet, only the destination's rules apply [S9, S34]</w:t>
+              <w:t>Unknown, Tokeniser says other networks can be reached with permissioned access but publishes no detail for copies [S9, S34]</w:t>
             </w:r>
           </w:p>
         </w:tc>
@@ -1506,7 +1668,7 @@
           </w:tcPr>
           <w:p>
             <w:r>
-              <w:t>Unknown, catalogue not public [S14]</w:t>
+              <w:t>Unknown, catalogue visible only to account holders [S14]</w:t>
             </w:r>
           </w:p>
         </w:tc>
@@ -1540,7 +1702,7 @@
           </w:tcPr>
           <w:p>
             <w:r>
-              <w:t>Redbelly's position on bridging or on Overledger</w:t>
+              <w:t>Redbelly's position on bridging</w:t>
             </w:r>
           </w:p>
         </w:tc>
@@ -1550,7 +1712,7 @@
           </w:tcPr>
           <w:p>
             <w:r>
-              <w:t>Unknown, nothing published [S1]</w:t>
+              <w:t>Unknown, no official position published [S1]</w:t>
             </w:r>
           </w:p>
         </w:tc>
@@ -1595,7 +1757,7 @@
         <w:t xml:space="preserve">[Method] </w:t>
       </w:r>
       <w:r>
-        <w:t>Every source page was saved as a text snapshot on 15 October 2026, with its address, capture time and SHA-256 hash in evidence/manifest.json. Each factual claim cites a fact, and each fact quotes its source word for word. The script scripts/check.py confirms that every quote is in its snapshot, that every Confirmed paragraph cites a source, and that the text has no partnership wording, no investment language, no dashes and no emoji. We ran the RPC and API calls ourselves, and kept the full output in evidence/tests. We did not create an Overledger account, so nothing here was tested inside Overledger.</w:t>
+        <w:t>Every source page was saved as a text snapshot on 15 October 2026, with its address, capture time and SHA-256 hash in evidence/manifest.json. The snapshots, the manifest and our test logs are published with the website under /evidence and in the project repository, https://github.com/hildecorp/overledger. Each factual claim cites a fact, and each fact quotes its source word for word. The script scripts/check.py in that repository confirms that every quote is in its snapshot, that every Confirmed paragraph cites a source, and that the text has no partnership wording, no investment language, no dashes and no emoji. We ran the RPC and API calls ourselves, and kept the full output in evidence/tests. We did not create an Overledger account, so nothing here was tested inside Overledger.</w:t>
       </w:r>
     </w:p>
     <w:p>
@@ -1623,12 +1785,12 @@
     </w:p>
     <w:p>
       <w:r>
-        <w:t>Receptor credentials and Tokeniser's eligibility rules are enforced on Redbelly. They do not travel with a token to another chain. Keeping regulated assets on Redbelly avoids that gap.</w:t>
-      </w:r>
-    </w:p>
-    <w:p>
-      <w:r>
-        <w:t>Open questions: whether Overledger would treat Redbelly as self-serve, whether Redbelly passes its network check, which chains The Clearing House network will reach, and Redbelly's own position on bridging. The full report and every source are linked below.</w:t>
+        <w:t>Receptor credentials and Tokeniser's eligibility rules are enforced on Redbelly. In our reading of the docs, they do not follow a token to another chain by themselves, and no public source shows how they would. Keeping regulated assets on Redbelly avoids that gap.</w:t>
+      </w:r>
+    </w:p>
+    <w:p>
+      <w:r>
+        <w:t>Open questions: whether Overledger would treat Redbelly as self-serve, whether Redbelly passes its network check, which chains The Clearing House network will reach, and Redbelly's own position on bridging. Full report with every source: https://overledger.vercel.app</w:t>
       </w:r>
     </w:p>
     <w:p>
@@ -1660,7 +1822,7 @@
         <w:pStyle w:val="ListNumber"/>
       </w:pPr>
       <w:r>
-        <w:t>3/ Redbelly's rules still apply on that route. Every account that sends a transaction needs a Redbelly access credential, and Tokeniser checks eligibility on every transfer.</w:t>
+        <w:t>3/ Redbelly's rules still apply on that route. Every account that sends a transaction needs a Redbelly access credential, and Tokeniser checks eligibility on every transfer of its assets.</w:t>
       </w:r>
     </w:p>
     <w:p>
@@ -1676,7 +1838,7 @@
         <w:pStyle w:val="ListNumber"/>
       </w:pPr>
       <w:r>
-        <w:t>5/ Receptor credentials and Tokeniser rules do not travel with a token to another chain. A copy elsewhere follows only that chain's rules. Keeping regulated assets on Redbelly avoids the gap.</w:t>
+        <w:t>5/ Our reading of the docs: Receptor credentials and Tokeniser rules do not travel with a token to another chain by themselves, so a copy elsewhere follows that chain's rules. Keeping regulated assets on Redbelly avoids the gap.</w:t>
       </w:r>
     </w:p>
     <w:p>
@@ -1699,6 +1861,34 @@
       <w:r>
         <w:t>Every factual claim cites one of these sources. Under each source are the exact words the report relies on.</w:t>
       </w:r>
+    </w:p>
+    <w:p>
+      <w:r>
+        <w:t xml:space="preserve">Saved copies of every source page, with SHA-256 hashes: </w:t>
+      </w:r>
+      <w:hyperlink r:id="rId17">
+        <w:r>
+          <w:rPr>
+            <w:color w:val="B3272A"/>
+            <w:u w:val="single"/>
+          </w:rPr>
+          <w:t xml:space="preserve">https://overledger.vercel.app/evidence/manifest.json</w:t>
+        </w:r>
+      </w:hyperlink>
+    </w:p>
+    <w:p>
+      <w:r>
+        <w:t xml:space="preserve">Project repository with the build and check scripts: </w:t>
+      </w:r>
+      <w:hyperlink r:id="rId18">
+        <w:r>
+          <w:rPr>
+            <w:color w:val="B3272A"/>
+            <w:u w:val="single"/>
+          </w:rPr>
+          <w:t xml:space="preserve">https://github.com/hildecorp/overledger</w:t>
+        </w:r>
+      </w:hyperlink>
     </w:p>
     <w:p>
       <w:r>
@@ -1709,9 +1899,15 @@
       </w:r>
     </w:p>
     <w:p>
-      <w:r>
-        <w:t>https://taskboard.redbellydao.network/tasks/TASK-29</w:t>
-      </w:r>
+      <w:hyperlink r:id="rId19">
+        <w:r>
+          <w:rPr>
+            <w:color w:val="B3272A"/>
+            <w:u w:val="single"/>
+          </w:rPr>
+          <w:t xml:space="preserve">https://taskboard.redbellydao.network/tasks/TASK-29</w:t>
+        </w:r>
+      </w:hyperlink>
     </w:p>
     <w:p>
       <w:pPr>
@@ -1738,9 +1934,15 @@
       </w:r>
     </w:p>
     <w:p>
-      <w:r>
-        <w:t>https://vine.redbelly.network/consensus/evm-compatibility/</w:t>
-      </w:r>
+      <w:hyperlink r:id="rId20">
+        <w:r>
+          <w:rPr>
+            <w:color w:val="B3272A"/>
+            <w:u w:val="single"/>
+          </w:rPr>
+          <w:t xml:space="preserve">https://vine.redbelly.network/consensus/evm-compatibility/</w:t>
+        </w:r>
+      </w:hyperlink>
     </w:p>
     <w:p>
       <w:pPr>
@@ -1759,9 +1961,15 @@
       </w:r>
     </w:p>
     <w:p>
-      <w:r>
-        <w:t>https://docs.overledger.dev/docs/connectors</w:t>
-      </w:r>
+      <w:hyperlink r:id="rId21">
+        <w:r>
+          <w:rPr>
+            <w:color w:val="B3272A"/>
+            <w:u w:val="single"/>
+          </w:rPr>
+          <w:t xml:space="preserve">https://docs.overledger.dev/docs/connectors</w:t>
+        </w:r>
+      </w:hyperlink>
     </w:p>
     <w:p>
       <w:pPr>
@@ -1904,7 +2112,7 @@
         <w:pStyle w:val="ListBullet"/>
       </w:pPr>
       <w:r>
-        <w:t>“Overledger lets you register a managed-provider node URL via a single API call. The network then becomes immediately reachable through the Overledger Gateway.”</w:t>
+        <w:t>“For networks where it does not matter which node a client connects to, i.e. public permissionless networks, Quant Connect lets you register a managed-provider node URL via a single UI form and Overledger lets you register a managed-provider node URL via a single API call. The network then becomes immediately reachable through the Overledger Gateway.”</w:t>
       </w:r>
     </w:p>
     <w:p>
@@ -1921,6 +2129,14 @@
       </w:pPr>
       <w:r>
         <w:t>“the node is scoped to your user identity”</w:t>
+      </w:r>
+    </w:p>
+    <w:p>
+      <w:pPr>
+        <w:pStyle w:val="ListBullet"/>
+      </w:pPr>
+      <w:r>
+        <w:t>“DLTs that need consortium membership, MSP enrolment, channel agreement, notary trust, privacy-group setup, or any other identity-bound configuration are onboarded through the engagement path”</w:t>
       </w:r>
     </w:p>
     <w:p>
@@ -1932,9 +2148,15 @@
       </w:r>
     </w:p>
     <w:p>
-      <w:r>
-        <w:t>evidence/tests/rpc-check.txt (project repository)</w:t>
-      </w:r>
+      <w:hyperlink r:id="rId22">
+        <w:r>
+          <w:rPr>
+            <w:color w:val="B3272A"/>
+            <w:u w:val="single"/>
+          </w:rPr>
+          <w:t xml:space="preserve">https://overledger.vercel.app/evidence/tests/rpc-check.txt</w:t>
+        </w:r>
+      </w:hyperlink>
     </w:p>
     <w:p>
       <w:pPr>
@@ -1977,9 +2199,15 @@
       </w:r>
     </w:p>
     <w:p>
-      <w:r>
-        <w:t>https://vine.redbelly.network/identity/user-access/</w:t>
-      </w:r>
+      <w:hyperlink r:id="rId23">
+        <w:r>
+          <w:rPr>
+            <w:color w:val="B3272A"/>
+            <w:u w:val="single"/>
+          </w:rPr>
+          <w:t xml:space="preserve">https://vine.redbelly.network/identity/user-access/</w:t>
+        </w:r>
+      </w:hyperlink>
     </w:p>
     <w:p>
       <w:pPr>
@@ -1998,9 +2226,15 @@
       </w:r>
     </w:p>
     <w:p>
-      <w:r>
-        <w:t>https://docs.overledger.dev/docs/fusion-rollup</w:t>
-      </w:r>
+      <w:hyperlink r:id="rId24">
+        <w:r>
+          <w:rPr>
+            <w:color w:val="B3272A"/>
+            <w:u w:val="single"/>
+          </w:rPr>
+          <w:t xml:space="preserve">https://docs.overledger.dev/docs/fusion-rollup</w:t>
+        </w:r>
+      </w:hyperlink>
     </w:p>
     <w:p>
       <w:pPr>
@@ -2059,9 +2293,15 @@
       </w:r>
     </w:p>
     <w:p>
-      <w:r>
-        <w:t>evidence/tests/overledger-api-check.txt (project repository)</w:t>
-      </w:r>
+      <w:hyperlink r:id="rId25">
+        <w:r>
+          <w:rPr>
+            <w:color w:val="B3272A"/>
+            <w:u w:val="single"/>
+          </w:rPr>
+          <w:t xml:space="preserve">https://overledger.vercel.app/evidence/tests/overledger-api-check.txt</w:t>
+        </w:r>
+      </w:hyperlink>
     </w:p>
     <w:p>
       <w:pPr>
@@ -2088,9 +2328,15 @@
       </w:r>
     </w:p>
     <w:p>
-      <w:r>
-        <w:t>https://docs.redbelly.network/pages/methods/proof-by-query/</w:t>
-      </w:r>
+      <w:hyperlink r:id="rId26">
+        <w:r>
+          <w:rPr>
+            <w:color w:val="B3272A"/>
+            <w:u w:val="single"/>
+          </w:rPr>
+          <w:t xml:space="preserve">https://docs.redbelly.network/pages/methods/proof-by-query/</w:t>
+        </w:r>
+      </w:hyperlink>
     </w:p>
     <w:p>
       <w:pPr>
@@ -2117,9 +2363,15 @@
       </w:r>
     </w:p>
     <w:p>
-      <w:r>
-        <w:t>https://tokeniser.com/technology</w:t>
-      </w:r>
+      <w:hyperlink r:id="rId27">
+        <w:r>
+          <w:rPr>
+            <w:color w:val="B3272A"/>
+            <w:u w:val="single"/>
+          </w:rPr>
+          <w:t xml:space="preserve">https://tokeniser.com/technology</w:t>
+        </w:r>
+      </w:hyperlink>
     </w:p>
     <w:p>
       <w:pPr>
@@ -2151,6 +2403,14 @@
       </w:pPr>
       <w:r>
         <w:t>“Underneath it runs Redbelly Network”</w:t>
+      </w:r>
+    </w:p>
+    <w:p>
+      <w:pPr>
+        <w:pStyle w:val="ListBullet"/>
+      </w:pPr>
+      <w:r>
+        <w:t>“Full EVM compatibility gives connection to more than 150 networks out of the box, with permissioned or permissionless access as your mandate allows.”</w:t>
       </w:r>
     </w:p>
     <w:p>
@@ -2162,9 +2422,15 @@
       </w:r>
     </w:p>
     <w:p>
-      <w:r>
-        <w:t>https://www.theclearinghouse.org/payment-systems/Articles/2026/09/The-Clearing-House-Partners-with-Quant-to-Advance-the--On-Chain-Money-Initiative</w:t>
-      </w:r>
+      <w:hyperlink r:id="rId28">
+        <w:r>
+          <w:rPr>
+            <w:color w:val="B3272A"/>
+            <w:u w:val="single"/>
+          </w:rPr>
+          <w:t xml:space="preserve">https://www.theclearinghouse.org/payment-systems/Articles/2026/09/The-Clearing-House-Partners-with-Quant-to-Advance-the--On-Chain-Money-Initiative</w:t>
+        </w:r>
+      </w:hyperlink>
     </w:p>
     <w:p>
       <w:pPr>
@@ -2207,9 +2473,15 @@
       </w:r>
     </w:p>
     <w:p>
-      <w:r>
-        <w:t>https://quant.network/press-releases/the-clearing-house-partners-with-quant-to-advance-the-on-chain-money-initiative/</w:t>
-      </w:r>
+      <w:hyperlink r:id="rId29">
+        <w:r>
+          <w:rPr>
+            <w:color w:val="B3272A"/>
+            <w:u w:val="single"/>
+          </w:rPr>
+          <w:t xml:space="preserve">https://quant.network/press-releases/the-clearing-house-partners-with-quant-to-advance-the-on-chain-money-initiative/</w:t>
+        </w:r>
+      </w:hyperlink>
     </w:p>
     <w:p>
       <w:pPr>
@@ -2228,9 +2500,15 @@
       </w:r>
     </w:p>
     <w:p>
-      <w:r>
-        <w:t>https://docs.overledger.dev/docs/start-here</w:t>
-      </w:r>
+      <w:hyperlink r:id="rId30">
+        <w:r>
+          <w:rPr>
+            <w:color w:val="B3272A"/>
+            <w:u w:val="single"/>
+          </w:rPr>
+          <w:t xml:space="preserve">https://docs.overledger.dev/docs/start-here</w:t>
+        </w:r>
+      </w:hyperlink>
     </w:p>
     <w:p>
       <w:pPr>
@@ -2265,9 +2543,15 @@
       </w:r>
     </w:p>
     <w:p>
-      <w:r>
-        <w:t>https://docs.overledger.dev/docs/overview</w:t>
-      </w:r>
+      <w:hyperlink r:id="rId31">
+        <w:r>
+          <w:rPr>
+            <w:color w:val="B3272A"/>
+            <w:u w:val="single"/>
+          </w:rPr>
+          <w:t xml:space="preserve">https://docs.overledger.dev/docs/overview</w:t>
+        </w:r>
+      </w:hyperlink>
     </w:p>
     <w:p>
       <w:pPr>
@@ -2331,6 +2615,22 @@
       </w:pPr>
       <w:r>
         <w:t>“It applies to every public or permissioned DLT network that the Gateway reaches”</w:t>
+      </w:r>
+    </w:p>
+    <w:p>
+      <w:pPr>
+        <w:pStyle w:val="ListBullet"/>
+      </w:pPr>
+      <w:r>
+        <w:t>“Single entry point. Authenticates, routes traffic, hosts Orchestration, fronts the Fusion Rollup.”</w:t>
+      </w:r>
+    </w:p>
+    <w:p>
+      <w:pPr>
+        <w:pStyle w:val="ListBullet"/>
+      </w:pPr>
+      <w:r>
+        <w:t>“There is one Connector per DLT family”</w:t>
       </w:r>
     </w:p>
     <w:p>
@@ -2342,9 +2642,15 @@
       </w:r>
     </w:p>
     <w:p>
-      <w:r>
-        <w:t>https://docs.overledger.dev/docs/flow-apps</w:t>
-      </w:r>
+      <w:hyperlink r:id="rId32">
+        <w:r>
+          <w:rPr>
+            <w:color w:val="B3272A"/>
+            <w:u w:val="single"/>
+          </w:rPr>
+          <w:t xml:space="preserve">https://docs.overledger.dev/docs/flow-apps</w:t>
+        </w:r>
+      </w:hyperlink>
     </w:p>
     <w:p>
       <w:pPr>
@@ -2367,7 +2673,7 @@
         <w:pStyle w:val="ListBullet"/>
       </w:pPr>
       <w:r>
-        <w:t>“Three phases between Client, Gateway, Flow App, and Signer Flow App. The Sign phase hands off via a sub-flow; the Client never sees private-key material.”</w:t>
+        <w:t>“The calling Flow App and the Gateway routing the sub-flow never see private keys. Key material is always under your control.”</w:t>
       </w:r>
     </w:p>
     <w:p>
@@ -2376,6 +2682,14 @@
       </w:pPr>
       <w:r>
         <w:t>“You hold the keys (BYO signing, see chapter 7.2).”</w:t>
+      </w:r>
+    </w:p>
+    <w:p>
+      <w:pPr>
+        <w:pStyle w:val="ListBullet"/>
+      </w:pPr>
+      <w:r>
+        <w:t>“Discover what's available for your account through one of two channels”</w:t>
       </w:r>
     </w:p>
     <w:p>
@@ -2387,9 +2701,15 @@
       </w:r>
     </w:p>
     <w:p>
-      <w:r>
-        <w:t>https://docs.redbelly.network</w:t>
-      </w:r>
+      <w:hyperlink r:id="rId33">
+        <w:r>
+          <w:rPr>
+            <w:color w:val="B3272A"/>
+            <w:u w:val="single"/>
+          </w:rPr>
+          <w:t xml:space="preserve">https://docs.redbelly.network</w:t>
+        </w:r>
+      </w:hyperlink>
     </w:p>
     <w:p>
       <w:pPr>
@@ -2408,9 +2728,15 @@
       </w:r>
     </w:p>
     <w:p>
-      <w:r>
-        <w:t>https://vine.redbelly.network/environments/</w:t>
-      </w:r>
+      <w:hyperlink r:id="rId34">
+        <w:r>
+          <w:rPr>
+            <w:color w:val="B3272A"/>
+            <w:u w:val="single"/>
+          </w:rPr>
+          <w:t xml:space="preserve">https://vine.redbelly.network/environments/</w:t>
+        </w:r>
+      </w:hyperlink>
     </w:p>
     <w:p>
       <w:pPr>
@@ -2445,9 +2771,15 @@
       </w:r>
     </w:p>
     <w:p>
-      <w:r>
-        <w:t>https://vine.redbelly.network/identity/</w:t>
-      </w:r>
+      <w:hyperlink r:id="rId35">
+        <w:r>
+          <w:rPr>
+            <w:color w:val="B3272A"/>
+            <w:u w:val="single"/>
+          </w:rPr>
+          <w:t xml:space="preserve">https://vine.redbelly.network/identity/</w:t>
+        </w:r>
+      </w:hyperlink>
     </w:p>
     <w:p>
       <w:pPr>
@@ -2474,9 +2806,15 @@
       </w:r>
     </w:p>
     <w:p>
-      <w:r>
-        <w:t>https://vine.redbelly.network/identity/accredited-issuers/</w:t>
-      </w:r>
+      <w:hyperlink r:id="rId36">
+        <w:r>
+          <w:rPr>
+            <w:color w:val="B3272A"/>
+            <w:u w:val="single"/>
+          </w:rPr>
+          <w:t xml:space="preserve">https://vine.redbelly.network/identity/accredited-issuers/</w:t>
+        </w:r>
+      </w:hyperlink>
     </w:p>
     <w:p>
       <w:pPr>
@@ -2495,9 +2833,15 @@
       </w:r>
     </w:p>
     <w:p>
-      <w:r>
-        <w:t>https://vine.redbelly.network/business-verification/</w:t>
-      </w:r>
+      <w:hyperlink r:id="rId37">
+        <w:r>
+          <w:rPr>
+            <w:color w:val="B3272A"/>
+            <w:u w:val="single"/>
+          </w:rPr>
+          <w:t xml:space="preserve">https://vine.redbelly.network/business-verification/</w:t>
+        </w:r>
+      </w:hyperlink>
     </w:p>
     <w:p>
       <w:pPr>
@@ -2516,9 +2860,15 @@
       </w:r>
     </w:p>
     <w:p>
-      <w:r>
-        <w:t>https://vine.redbelly.network/nodes/become-operator/</w:t>
-      </w:r>
+      <w:hyperlink r:id="rId38">
+        <w:r>
+          <w:rPr>
+            <w:color w:val="B3272A"/>
+            <w:u w:val="single"/>
+          </w:rPr>
+          <w:t xml:space="preserve">https://vine.redbelly.network/nodes/become-operator/</w:t>
+        </w:r>
+      </w:hyperlink>
     </w:p>
     <w:p>
       <w:pPr>
@@ -2526,6 +2876,14 @@
       </w:pPr>
       <w:r>
         <w:t>“Node operators MUST have network access for 2 accounts and provide their public address when applying to run a node.”</w:t>
+      </w:r>
+    </w:p>
+    <w:p>
+      <w:pPr>
+        <w:pStyle w:val="ListBullet"/>
+      </w:pPr>
+      <w:r>
+        <w:t>“Applicants will be selected based upon their previous experience, location and commitment to the Redbelly Project.”</w:t>
       </w:r>
     </w:p>
     <w:p>
@@ -2537,9 +2895,15 @@
       </w:r>
     </w:p>
     <w:p>
-      <w:r>
-        <w:t>https://vine.redbelly.network/bridged-tokens/celer/</w:t>
-      </w:r>
+      <w:hyperlink r:id="rId39">
+        <w:r>
+          <w:rPr>
+            <w:color w:val="B3272A"/>
+            <w:u w:val="single"/>
+          </w:rPr>
+          <w:t xml:space="preserve">https://vine.redbelly.network/bridged-tokens/celer/</w:t>
+        </w:r>
+      </w:hyperlink>
     </w:p>
     <w:p>
       <w:pPr>
@@ -2566,9 +2930,15 @@
       </w:r>
     </w:p>
     <w:p>
-      <w:r>
-        <w:t>https://vine.redbelly.network/bridged-tokens/layerzero/</w:t>
-      </w:r>
+      <w:hyperlink r:id="rId40">
+        <w:r>
+          <w:rPr>
+            <w:color w:val="B3272A"/>
+            <w:u w:val="single"/>
+          </w:rPr>
+          <w:t xml:space="preserve">https://vine.redbelly.network/bridged-tokens/layerzero/</w:t>
+        </w:r>
+      </w:hyperlink>
     </w:p>
     <w:p>
       <w:pPr>
@@ -2587,9 +2957,15 @@
       </w:r>
     </w:p>
     <w:p>
-      <w:r>
-        <w:t>https://vine.redbelly.network/bridged-tokens/lucidlabs/</w:t>
-      </w:r>
+      <w:hyperlink r:id="rId41">
+        <w:r>
+          <w:rPr>
+            <w:color w:val="B3272A"/>
+            <w:u w:val="single"/>
+          </w:rPr>
+          <w:t xml:space="preserve">https://vine.redbelly.network/bridged-tokens/lucidlabs/</w:t>
+        </w:r>
+      </w:hyperlink>
     </w:p>
     <w:p>
       <w:pPr>
@@ -2616,9 +2992,15 @@
       </w:r>
     </w:p>
     <w:p>
-      <w:r>
-        <w:t>https://docs.redbelly.network/pages/receptor/</w:t>
-      </w:r>
+      <w:hyperlink r:id="rId42">
+        <w:r>
+          <w:rPr>
+            <w:color w:val="B3272A"/>
+            <w:u w:val="single"/>
+          </w:rPr>
+          <w:t xml:space="preserve">https://docs.redbelly.network/pages/receptor/</w:t>
+        </w:r>
+      </w:hyperlink>
     </w:p>
     <w:p>
       <w:pPr>
@@ -2645,9 +3027,15 @@
       </w:r>
     </w:p>
     <w:p>
-      <w:r>
-        <w:t>https://vine.redbelly.network/identity/eligibility/</w:t>
-      </w:r>
+      <w:hyperlink r:id="rId43">
+        <w:r>
+          <w:rPr>
+            <w:color w:val="B3272A"/>
+            <w:u w:val="single"/>
+          </w:rPr>
+          <w:t xml:space="preserve">https://vine.redbelly.network/identity/eligibility/</w:t>
+        </w:r>
+      </w:hyperlink>
     </w:p>
     <w:p>
       <w:pPr>
@@ -2666,9 +3054,15 @@
       </w:r>
     </w:p>
     <w:p>
-      <w:r>
-        <w:t>https://docs.redbelly.network/pages/methods/selective-disclosure/</w:t>
-      </w:r>
+      <w:hyperlink r:id="rId44">
+        <w:r>
+          <w:rPr>
+            <w:color w:val="B3272A"/>
+            <w:u w:val="single"/>
+          </w:rPr>
+          <w:t xml:space="preserve">https://docs.redbelly.network/pages/methods/selective-disclosure/</w:t>
+        </w:r>
+      </w:hyperlink>
     </w:p>
     <w:p>
       <w:pPr>
@@ -2695,9 +3089,15 @@
       </w:r>
     </w:p>
     <w:p>
-      <w:r>
-        <w:t>https://docs.redbelly.network/pages/eligibility-sdk/eligibility-sdk/</w:t>
-      </w:r>
+      <w:hyperlink r:id="rId45">
+        <w:r>
+          <w:rPr>
+            <w:color w:val="B3272A"/>
+            <w:u w:val="single"/>
+          </w:rPr>
+          <w:t xml:space="preserve">https://docs.redbelly.network/pages/eligibility-sdk/eligibility-sdk/</w:t>
+        </w:r>
+      </w:hyperlink>
     </w:p>
     <w:p>
       <w:pPr>
@@ -2716,9 +3116,15 @@
       </w:r>
     </w:p>
     <w:p>
-      <w:r>
-        <w:t>https://vine.redbelly.network/smart-contracts/eligibility-checks/</w:t>
-      </w:r>
+      <w:hyperlink r:id="rId46">
+        <w:r>
+          <w:rPr>
+            <w:color w:val="B3272A"/>
+            <w:u w:val="single"/>
+          </w:rPr>
+          <w:t xml:space="preserve">https://vine.redbelly.network/smart-contracts/eligibility-checks/</w:t>
+        </w:r>
+      </w:hyperlink>
     </w:p>
     <w:p>
       <w:pPr>
@@ -2737,9 +3143,15 @@
       </w:r>
     </w:p>
     <w:p>
-      <w:r>
-        <w:t>https://tokeniser.com/product/superpowers/automated-compliance</w:t>
-      </w:r>
+      <w:hyperlink r:id="rId47">
+        <w:r>
+          <w:rPr>
+            <w:color w:val="B3272A"/>
+            <w:u w:val="single"/>
+          </w:rPr>
+          <w:t xml:space="preserve">https://tokeniser.com/product/superpowers/automated-compliance</w:t>
+        </w:r>
+      </w:hyperlink>
     </w:p>
     <w:p>
       <w:pPr>
@@ -2758,9 +3170,15 @@
       </w:r>
     </w:p>
     <w:p>
-      <w:r>
-        <w:t>https://tokeniser.com/product/superpowers/secondary-transfer</w:t>
-      </w:r>
+      <w:hyperlink r:id="rId48">
+        <w:r>
+          <w:rPr>
+            <w:color w:val="B3272A"/>
+            <w:u w:val="single"/>
+          </w:rPr>
+          <w:t xml:space="preserve">https://tokeniser.com/product/superpowers/secondary-transfer</w:t>
+        </w:r>
+      </w:hyperlink>
     </w:p>
     <w:p>
       <w:pPr>
@@ -2779,9 +3197,15 @@
       </w:r>
     </w:p>
     <w:p>
-      <w:r>
-        <w:t>https://tokeniser.com/product/superpowers/collateral-mobility</w:t>
-      </w:r>
+      <w:hyperlink r:id="rId49">
+        <w:r>
+          <w:rPr>
+            <w:color w:val="B3272A"/>
+            <w:u w:val="single"/>
+          </w:rPr>
+          <w:t xml:space="preserve">https://tokeniser.com/product/superpowers/collateral-mobility</w:t>
+        </w:r>
+      </w:hyperlink>
     </w:p>
     <w:p>
       <w:pPr>
@@ -2800,9 +3224,15 @@
       </w:r>
     </w:p>
     <w:p>
-      <w:r>
-        <w:t>https://blog.celer.network/2025/08/01/celer-announces-cbridge-support-for-redbelly/</w:t>
-      </w:r>
+      <w:hyperlink r:id="rId50">
+        <w:r>
+          <w:rPr>
+            <w:color w:val="B3272A"/>
+            <w:u w:val="single"/>
+          </w:rPr>
+          <w:t xml:space="preserve">https://blog.celer.network/2025/08/01/celer-announces-cbridge-support-for-redbelly/</w:t>
+        </w:r>
+      </w:hyperlink>
     </w:p>
     <w:p>
       <w:pPr>
@@ -2821,9 +3251,15 @@
       </w:r>
     </w:p>
     <w:p>
-      <w:r>
-        <w:t>https://x.com/RedbellyNetwork/status/1890340030197166112</w:t>
-      </w:r>
+      <w:hyperlink r:id="rId51">
+        <w:r>
+          <w:rPr>
+            <w:color w:val="B3272A"/>
+            <w:u w:val="single"/>
+          </w:rPr>
+          <w:t xml:space="preserve">https://x.com/RedbellyNetwork/status/1890340030197166112</w:t>
+        </w:r>
+      </w:hyperlink>
     </w:p>
     <w:p>
       <w:pPr>
@@ -2850,9 +3286,15 @@
       </w:r>
     </w:p>
     <w:p>
-      <w:r>
-        <w:t>https://github.com/Redbelly-DAO-Community-Taskboard/TASK-08-bridge-integration-guide</w:t>
-      </w:r>
+      <w:hyperlink r:id="rId52">
+        <w:r>
+          <w:rPr>
+            <w:color w:val="B3272A"/>
+            <w:u w:val="single"/>
+          </w:rPr>
+          <w:t xml:space="preserve">https://github.com/Redbelly-DAO-Community-Taskboard/TASK-08-bridge-integration-guide</w:t>
+        </w:r>
+      </w:hyperlink>
     </w:p>
     <w:p>
       <w:pPr>
@@ -2879,16 +3321,30 @@
       </w:r>
     </w:p>
     <w:p>
-      <w:r>
-        <w:t>https://github.com/tycayomide/redbelly-testnet-bridge/blob/main/TECHNICAL_GUIDE.md</w:t>
-      </w:r>
+      <w:hyperlink r:id="rId53">
+        <w:r>
+          <w:rPr>
+            <w:color w:val="B3272A"/>
+            <w:u w:val="single"/>
+          </w:rPr>
+          <w:t xml:space="preserve">https://github.com/tycayomide/redbelly-testnet-bridge/blob/main/TECHNICAL_GUIDE.md</w:t>
+        </w:r>
+      </w:hyperlink>
     </w:p>
     <w:p>
       <w:pPr>
         <w:pStyle w:val="ListBullet"/>
       </w:pPr>
       <w:r>
-        <w:t>“no major interoperability protocol has deployed core messaging infrastructure (endpoints, gateways, or guardian sets) to”</w:t>
+        <w:t>“as of this writing no major interoperability protocol has deployed core messaging infrastructure (endpoints, gateways, or guardian sets) to Redbelly Testnet specifically”</w:t>
+      </w:r>
+    </w:p>
+    <w:p>
+      <w:pPr>
+        <w:pStyle w:val="ListBullet"/>
+      </w:pPr>
+      <w:r>
+        <w:t>“LayerZero went live on Redbelly Mainnet”</w:t>
       </w:r>
     </w:p>
     <w:p>
@@ -2900,9 +3356,15 @@
       </w:r>
     </w:p>
     <w:p>
-      <w:r>
-        <w:t>https://github.com/Redbelly-DAO-Community-Taskboard/TASK-16-cross-chain-recovery-playbook/blob/main/deliverable/Redbelly-task-16-revised.pdf</w:t>
-      </w:r>
+      <w:hyperlink r:id="rId54">
+        <w:r>
+          <w:rPr>
+            <w:color w:val="B3272A"/>
+            <w:u w:val="single"/>
+          </w:rPr>
+          <w:t xml:space="preserve">https://github.com/Redbelly-DAO-Community-Taskboard/TASK-16-cross-chain-recovery-playbook/blob/main/deliverable/Redbelly-task-16-revised.pdf</w:t>
+        </w:r>
+      </w:hyperlink>
     </w:p>
     <w:p>
       <w:pPr>
@@ -2921,9 +3383,15 @@
       </w:r>
     </w:p>
     <w:p>
-      <w:r>
-        <w:t>https://docs.overledger.dev/docs/overledger-firewall</w:t>
-      </w:r>
+      <w:hyperlink r:id="rId55">
+        <w:r>
+          <w:rPr>
+            <w:color w:val="B3272A"/>
+            <w:u w:val="single"/>
+          </w:rPr>
+          <w:t xml:space="preserve">https://docs.overledger.dev/docs/overledger-firewall</w:t>
+        </w:r>
+      </w:hyperlink>
     </w:p>
     <w:p>
       <w:pPr>
@@ -2950,9 +3418,15 @@
       </w:r>
     </w:p>
     <w:p>
-      <w:r>
-        <w:t>https://docs.overledger.dev/reference</w:t>
-      </w:r>
+      <w:hyperlink r:id="rId56">
+        <w:r>
+          <w:rPr>
+            <w:color w:val="B3272A"/>
+            <w:u w:val="single"/>
+          </w:rPr>
+          <w:t xml:space="preserve">https://docs.overledger.dev/reference</w:t>
+        </w:r>
+      </w:hyperlink>
     </w:p>
     <w:p>
       <w:pPr>

</xml_diff>

<commit_message>
Second round of audit fixes: Word numbering, A4 and alt text, PDF bookmarks and labels, plainer wording, clearer summary and thread, contributor links removed from snapshots
</commit_message>
<xml_diff>
--- a/public/downloads/redbelly-overledger-feasibility-report.docx
+++ b/public/downloads/redbelly-overledger-feasibility-report.docx
@@ -269,15 +269,15 @@
         <w:tblLook w:firstColumn="1" w:firstRow="1" w:lastColumn="0" w:lastRow="0" w:noHBand="0" w:noVBand="1" w:val="04A0"/>
       </w:tblPr>
       <w:tblGrid>
-        <w:gridCol w:w="2493"/>
-        <w:gridCol w:w="2493"/>
-        <w:gridCol w:w="2493"/>
-        <w:gridCol w:w="2493"/>
+        <w:gridCol w:w="2296"/>
+        <w:gridCol w:w="2296"/>
+        <w:gridCol w:w="2296"/>
+        <w:gridCol w:w="2296"/>
       </w:tblGrid>
       <w:tr>
         <w:tc>
           <w:tcPr>
-            <w:tcW w:type="dxa" w:w="2493"/>
+            <w:tcW w:type="dxa" w:w="2296"/>
           </w:tcPr>
           <w:p>
             <w:r>
@@ -287,7 +287,7 @@
         </w:tc>
         <w:tc>
           <w:tcPr>
-            <w:tcW w:type="dxa" w:w="2493"/>
+            <w:tcW w:type="dxa" w:w="2296"/>
           </w:tcPr>
           <w:p>
             <w:r>
@@ -297,7 +297,7 @@
         </w:tc>
         <w:tc>
           <w:tcPr>
-            <w:tcW w:type="dxa" w:w="2493"/>
+            <w:tcW w:type="dxa" w:w="2296"/>
           </w:tcPr>
           <w:p>
             <w:r>
@@ -307,7 +307,7 @@
         </w:tc>
         <w:tc>
           <w:tcPr>
-            <w:tcW w:type="dxa" w:w="2493"/>
+            <w:tcW w:type="dxa" w:w="2296"/>
           </w:tcPr>
           <w:p>
             <w:r>
@@ -319,7 +319,7 @@
       <w:tr>
         <w:tc>
           <w:tcPr>
-            <w:tcW w:type="dxa" w:w="2493"/>
+            <w:tcW w:type="dxa" w:w="2296"/>
           </w:tcPr>
           <w:p>
             <w:r>
@@ -329,7 +329,7 @@
         </w:tc>
         <w:tc>
           <w:tcPr>
-            <w:tcW w:type="dxa" w:w="2493"/>
+            <w:tcW w:type="dxa" w:w="2296"/>
           </w:tcPr>
           <w:p>
             <w:r>
@@ -339,7 +339,7 @@
         </w:tc>
         <w:tc>
           <w:tcPr>
-            <w:tcW w:type="dxa" w:w="2493"/>
+            <w:tcW w:type="dxa" w:w="2296"/>
           </w:tcPr>
           <w:p>
             <w:r>
@@ -349,7 +349,7 @@
         </w:tc>
         <w:tc>
           <w:tcPr>
-            <w:tcW w:type="dxa" w:w="2493"/>
+            <w:tcW w:type="dxa" w:w="2296"/>
           </w:tcPr>
           <w:p>
             <w:r>
@@ -361,7 +361,7 @@
       <w:tr>
         <w:tc>
           <w:tcPr>
-            <w:tcW w:type="dxa" w:w="2493"/>
+            <w:tcW w:type="dxa" w:w="2296"/>
           </w:tcPr>
           <w:p>
             <w:r>
@@ -371,7 +371,7 @@
         </w:tc>
         <w:tc>
           <w:tcPr>
-            <w:tcW w:type="dxa" w:w="2493"/>
+            <w:tcW w:type="dxa" w:w="2296"/>
           </w:tcPr>
           <w:p>
             <w:r>
@@ -381,7 +381,7 @@
         </w:tc>
         <w:tc>
           <w:tcPr>
-            <w:tcW w:type="dxa" w:w="2493"/>
+            <w:tcW w:type="dxa" w:w="2296"/>
           </w:tcPr>
           <w:p>
             <w:r>
@@ -391,7 +391,7 @@
         </w:tc>
         <w:tc>
           <w:tcPr>
-            <w:tcW w:type="dxa" w:w="2493"/>
+            <w:tcW w:type="dxa" w:w="2296"/>
           </w:tcPr>
           <w:p>
             <w:r>
@@ -403,7 +403,7 @@
       <w:tr>
         <w:tc>
           <w:tcPr>
-            <w:tcW w:type="dxa" w:w="2493"/>
+            <w:tcW w:type="dxa" w:w="2296"/>
           </w:tcPr>
           <w:p>
             <w:r>
@@ -413,7 +413,7 @@
         </w:tc>
         <w:tc>
           <w:tcPr>
-            <w:tcW w:type="dxa" w:w="2493"/>
+            <w:tcW w:type="dxa" w:w="2296"/>
           </w:tcPr>
           <w:p>
             <w:r>
@@ -423,7 +423,7 @@
         </w:tc>
         <w:tc>
           <w:tcPr>
-            <w:tcW w:type="dxa" w:w="2493"/>
+            <w:tcW w:type="dxa" w:w="2296"/>
           </w:tcPr>
           <w:p>
             <w:r>
@@ -433,7 +433,7 @@
         </w:tc>
         <w:tc>
           <w:tcPr>
-            <w:tcW w:type="dxa" w:w="2493"/>
+            <w:tcW w:type="dxa" w:w="2296"/>
           </w:tcPr>
           <w:p>
             <w:r>
@@ -445,7 +445,7 @@
       <w:tr>
         <w:tc>
           <w:tcPr>
-            <w:tcW w:type="dxa" w:w="2493"/>
+            <w:tcW w:type="dxa" w:w="2296"/>
           </w:tcPr>
           <w:p>
             <w:r>
@@ -455,7 +455,7 @@
         </w:tc>
         <w:tc>
           <w:tcPr>
-            <w:tcW w:type="dxa" w:w="2493"/>
+            <w:tcW w:type="dxa" w:w="2296"/>
           </w:tcPr>
           <w:p>
             <w:r>
@@ -465,7 +465,7 @@
         </w:tc>
         <w:tc>
           <w:tcPr>
-            <w:tcW w:type="dxa" w:w="2493"/>
+            <w:tcW w:type="dxa" w:w="2296"/>
           </w:tcPr>
           <w:p>
             <w:r>
@@ -475,7 +475,7 @@
         </w:tc>
         <w:tc>
           <w:tcPr>
-            <w:tcW w:type="dxa" w:w="2493"/>
+            <w:tcW w:type="dxa" w:w="2296"/>
           </w:tcPr>
           <w:p>
             <w:r>
@@ -553,8 +553,8 @@
       <w:r>
         <w:drawing>
           <wp:inline xmlns:a="http://schemas.openxmlformats.org/drawingml/2006/main" xmlns:pic="http://schemas.openxmlformats.org/drawingml/2006/picture">
-            <wp:extent cx="6120000" cy="4577760"/>
-            <wp:docPr id="1" name="Picture 1"/>
+            <wp:extent cx="5760000" cy="4308480"/>
+            <wp:docPr id="1" name="Picture 1" descr="Figure 1. Overledger in one picture. The Gateway, Connectors and Flow Apps are the switchboard [S12, S13]. The Fusion Rollup is a separate layer, reached through the Gateway [S13], whose deposits, withdrawals and cross-chain messages run with the networks connected to it [S13], and Redbelly is not among the networks documented at testnet launch [S6]."/>
             <wp:cNvGraphicFramePr>
               <a:graphicFrameLocks noChangeAspect="1"/>
             </wp:cNvGraphicFramePr>
@@ -574,7 +574,7 @@
                   <pic:spPr>
                     <a:xfrm>
                       <a:off x="0" y="0"/>
-                      <a:ext cx="6120000" cy="4577760"/>
+                      <a:ext cx="5760000" cy="4308480"/>
                     </a:xfrm>
                     <a:prstGeom prst="rect"/>
                   </pic:spPr>
@@ -644,8 +644,8 @@
       <w:r>
         <w:drawing>
           <wp:inline xmlns:a="http://schemas.openxmlformats.org/drawingml/2006/main" xmlns:pic="http://schemas.openxmlformats.org/drawingml/2006/picture">
-            <wp:extent cx="6120000" cy="5654880"/>
-            <wp:docPr id="2" name="Picture 2"/>
+            <wp:extent cx="5760000" cy="5322240"/>
+            <wp:docPr id="2" name="Picture 2" descr="Figure 2. Two ways a chain reaches Overledger. Self-serve covers public permissionless networks in six chain families and needs no talk with Quant's account team: one API call or form registers a node and, for a new network, the network itself [S3]. Networks where node identity matters, and new chain families, go through an engagement [S3, S13]."/>
             <wp:cNvGraphicFramePr>
               <a:graphicFrameLocks noChangeAspect="1"/>
             </wp:cNvGraphicFramePr>
@@ -665,7 +665,7 @@
                   <pic:spPr>
                     <a:xfrm>
                       <a:off x="0" y="0"/>
-                      <a:ext cx="6120000" cy="5654880"/>
+                      <a:ext cx="5760000" cy="5322240"/>
                     </a:xfrm>
                     <a:prstGeom prst="rect"/>
                   </pic:spPr>
@@ -783,8 +783,8 @@
       <w:r>
         <w:drawing>
           <wp:inline xmlns:a="http://schemas.openxmlformats.org/drawingml/2006/main" xmlns:pic="http://schemas.openxmlformats.org/drawingml/2006/picture">
-            <wp:extent cx="6120000" cy="4002480"/>
-            <wp:docPr id="3" name="Picture 3"/>
+            <wp:extent cx="5760000" cy="3767040"/>
+            <wp:docPr id="3" name="Picture 3" descr="Figure 3. Reading Redbelly is open, writing needs an access credential. Every account must claim an access credential from an accredited issuer before it can write [S5, S18]. Reading through the public RPC needs no key, and both RPC addresses answered with chain ID 151 in our test [S4, S16]. Redbelly's developer portal lists three bridge routes [S21, S22, S23]."/>
             <wp:cNvGraphicFramePr>
               <a:graphicFrameLocks noChangeAspect="1"/>
             </wp:cNvGraphicFramePr>
@@ -804,7 +804,7 @@
                   <pic:spPr>
                     <a:xfrm>
                       <a:off x="0" y="0"/>
-                      <a:ext cx="6120000" cy="4002480"/>
+                      <a:ext cx="5760000" cy="3767040"/>
                     </a:xfrm>
                     <a:prstGeom prst="rect"/>
                   </pic:spPr>
@@ -859,7 +859,7 @@
         <w:t xml:space="preserve">[Confirmed] </w:t>
       </w:r>
       <w:r>
-        <w:t>Redbelly already has token bridges. Its developer portal lists three routes: Celer cBridge [S21], LayerZero with Stargate [S22] and Lucid Labs [S23]. Celer launched with a pegged bridge method [S32], and its RBNT route goes out from Redbelly but not back [S21]. Redbelly announced Wrapped RBNT on Ethereum with the contract 0xb45f...bf13 [S33], which the portal lists under Lucid Labs [S23]. The portal lists a different Ethereum contract for the Celer route [S21].</w:t>
+        <w:t>Redbelly already has token bridges. Its developer portal lists three routes: Celer cBridge [S21], LayerZero with Stargate [S22] and Lucid Labs [S23]. Celer launched with a pegged bridge method [S32], and its RBNT route goes out from Redbelly but not back [S21]. Redbelly announced Wrapped RBNT on Ethereum with the contract 0xb45f...bf13 [S33], which the portal lists under Lucid Labs [S23]. The portal lists a different Ethereum contract for the Celer route [S21]. Listing these routes is not an official position: Redbelly has not published one on bridging [S1].</w:t>
       </w:r>
     </w:p>
     <w:p>
@@ -871,7 +871,7 @@
         <w:t xml:space="preserve">[Confirmed] </w:t>
       </w:r>
       <w:r>
-        <w:t>Community research for TASK-08 found LayerZero live on Redbelly mainnet [S34, S35]. A second TASK-08 entry found that, when it was written, no major interoperability protocol had deployed core messaging infrastructure to Redbelly testnet [S35], and the selected entry built a lock-and-mint testnet bridge [S34]. The TASK-16 playbook says the bridges it calls official, Reddex and Lucid, then supported only bridging USDC and USDT from BNB Chain [S36].</w:t>
+        <w:t>Earlier Task Board research adds detail. The selected TASK-08 entry reported LayerZero live on Redbelly mainnet [S34, S35] and built its own lock-and-mint bridge on testnet [S34]. A second TASK-08 entry found that, when it was written, no major interoperability protocol had deployed its core messaging setup to Redbelly testnet [S35]. When the TASK-16 playbook was written, the bridges it called official, Reddex and Lucid, supported only bridging USDC and USDT from BNB Chain [S36].</w:t>
       </w:r>
     </w:p>
     <w:p>
@@ -891,8 +891,8 @@
       <w:r>
         <w:drawing>
           <wp:inline xmlns:a="http://schemas.openxmlformats.org/drawingml/2006/main" xmlns:pic="http://schemas.openxmlformats.org/drawingml/2006/picture">
-            <wp:extent cx="6120000" cy="5055120"/>
-            <wp:docPr id="4" name="Picture 4"/>
+            <wp:extent cx="5760000" cy="4757760"/>
+            <wp:docPr id="4" name="Picture 4" descr="Figure 4. Three meanings of 'connect', three answers. Level 1 rests on Redbelly's EVM compatibility and Overledger's self-serve EVM route [S2, S3], with open points: whether self-serve applies to a network where writing needs a credential, the health check, a keyed provider endpoint and the live lists [S3, S4, S7, S13]. Level 2 cannot be checked from public sources, because the app catalogue is shown only to account holders [S14]. Level 3 is not possible yet as far as public sources show [S5, S6, S37]."/>
             <wp:cNvGraphicFramePr>
               <a:graphicFrameLocks noChangeAspect="1"/>
             </wp:cNvGraphicFramePr>
@@ -912,7 +912,7 @@
                   <pic:spPr>
                     <a:xfrm>
                       <a:off x="0" y="0"/>
-                      <a:ext cx="6120000" cy="5055120"/>
+                      <a:ext cx="5760000" cy="4757760"/>
                     </a:xfrm>
                     <a:prstGeom prst="rect"/>
                   </pic:spPr>
@@ -967,15 +967,52 @@
       </w:r>
     </w:p>
     <w:p>
+      <w:pPr>
+        <w:pStyle w:val="Heading2"/>
+      </w:pPr>
+      <w:r>
+        <w:t>Four points are open</w:t>
+      </w:r>
+    </w:p>
+    <w:p>
       <w:r>
         <w:rPr>
           <w:b/>
           <w:color w:val="C62828"/>
         </w:rPr>
-        <w:t xml:space="preserve">[Unknown] </w:t>
-      </w:r>
-      <w:r>
-        <w:t>Four points are open. First, how Overledger would classify Redbelly. Self-serve is written for public, permissionless networks [S3], Overledger's own glossary calls a network where anyone can read but only allowlisted parties can write "public permissioned" [S13], and permissioned EVM networks are on the engagement route [S3]. The same docs send networks that need any other identity-bound configuration, and operator-gated public chains, to the engagement route [S3], and Redbelly selects its node operators by application [S20]. Writing to Redbelly needs an access credential [S5], so Redbelly could be treated as an engagement network; the docs do not say. Second, the docs say only that the health check uses the chain's standard validation [S3] and that a checker does a chain identifier lookup [S3], not which call the EVM check uses. If it relies on net_version, Redbelly's answer [S4] could fail it. Third, a public node URL must carry a provider API key [S3], and we did not confirm that Ankr's keyed service covers Redbelly. Fourth, Overledger's live network list [S3] and the Fusion Rollup's list [S38] both answered "Missing authorization header" without an API key [S7], so we could not see whether Redbelly is already listed.</w:t>
+        <w:t>[Unknown]</w:t>
+      </w:r>
+    </w:p>
+    <w:p>
+      <w:pPr>
+        <w:pStyle w:val="ListBullet"/>
+      </w:pPr>
+      <w:r>
+        <w:t>How Overledger would classify Redbelly. Self-serve is written for public, permissionless networks [S3], Overledger's own glossary calls a network where anyone can read but only allowlisted parties can write "public permissioned" [S13], and permissioned EVM networks are on the engagement route [S3]. The same docs send networks that need any other identity-bound configuration, and operator-gated public chains, to the engagement route [S3], and Redbelly selects its node operators by application [S20]. Writing to Redbelly needs an access credential [S5], so Redbelly could be treated as an engagement network; the docs do not say.</w:t>
+      </w:r>
+    </w:p>
+    <w:p>
+      <w:pPr>
+        <w:pStyle w:val="ListBullet"/>
+      </w:pPr>
+      <w:r>
+        <w:t>Which call the health check uses. The docs say only that it uses the chain's standard validation [S3] and that a checker does a chain identifier lookup [S3]. If it relies on net_version, Redbelly's answer [S4] could fail it.</w:t>
+      </w:r>
+    </w:p>
+    <w:p>
+      <w:pPr>
+        <w:pStyle w:val="ListBullet"/>
+      </w:pPr>
+      <w:r>
+        <w:t>Whether a provider's keyed service covers Redbelly. A public node URL must carry a provider API key [S3], and we did not confirm that Ankr's keyed service covers Redbelly.</w:t>
+      </w:r>
+    </w:p>
+    <w:p>
+      <w:pPr>
+        <w:pStyle w:val="ListBullet"/>
+      </w:pPr>
+      <w:r>
+        <w:t>Whether Redbelly is already listed. Overledger's live network list [S3] and the Fusion Rollup's list [S38] both answered "Missing authorization header" without an API key [S7], so we could not see it.</w:t>
       </w:r>
     </w:p>
     <w:p>
@@ -1048,15 +1085,15 @@
     </w:p>
     <w:p>
       <w:r>
-        <w:t>Written for a non engineer. Steps marked Level 1 are small. Steps marked Level 3 depend on Quant, because Redbelly is not among the documented Fusion Rollup networks [S6] and bridge tokens are added by Quant's governance [S37]; the accounts involved would also need Redbelly access [S5]. No such work has been announced [S1].</w:t>
+        <w:t>Written for a non engineer. Steps marked Level 1 are small, but only if Overledger treats Redbelly as a self-serve network, which its docs do not confirm [S3]. Steps marked Level 3 depend on Quant, because Redbelly is not among the documented Fusion Rollup networks [S6] and bridge tokens are added by Quant's governance [S37]; the accounts involved would also need Redbelly access [S5]. No such work has been announced [S1].</w:t>
       </w:r>
     </w:p>
     <w:p>
       <w:r>
         <w:drawing>
           <wp:inline xmlns:a="http://schemas.openxmlformats.org/drawingml/2006/main" xmlns:pic="http://schemas.openxmlformats.org/drawingml/2006/picture">
-            <wp:extent cx="6120000" cy="3647520"/>
-            <wp:docPr id="5" name="Picture 5"/>
+            <wp:extent cx="5760000" cy="3432960"/>
+            <wp:docPr id="5" name="Picture 5" descr="Figure 5. The work, step by step. Level 1 would use the self-serve route, with no account-team conversation, only if Overledger treats Redbelly as a self-serve network, which its docs do not confirm, and the node passes the health check [S3, S5]. Level 3 depends on Quant, and no such work has been announced [S1, S6, S9, S37]."/>
             <wp:cNvGraphicFramePr>
               <a:graphicFrameLocks noChangeAspect="1"/>
             </wp:cNvGraphicFramePr>
@@ -1076,7 +1113,7 @@
                   <pic:spPr>
                     <a:xfrm>
                       <a:off x="0" y="0"/>
-                      <a:ext cx="6120000" cy="3647520"/>
+                      <a:ext cx="5760000" cy="3432960"/>
                     </a:xfrm>
                     <a:prstGeom prst="rect"/>
                   </pic:spPr>
@@ -1109,15 +1146,15 @@
     </w:p>
     <w:p>
       <w:pPr>
-        <w:pStyle w:val="ListNumber"/>
-      </w:pPr>
-      <w:r>
-        <w:t>Level 1, step 1: someone with an Overledger account registers a Redbelly node: the official RPC as a private node [S3] or, if an approved provider's keyed service covers Redbelly (not confirmed), that provider's endpoint as a public node [S3]. The first registration also adds the network [S3]. This is one form or one API call [S3].</w:t>
-      </w:r>
-    </w:p>
-    <w:p>
-      <w:pPr>
-        <w:pStyle w:val="ListNumber"/>
+        <w:pStyle w:val="ListBullet"/>
+      </w:pPr>
+      <w:r>
+        <w:t>Level 1, step 1: someone with an Overledger account registers a Redbelly node, the server Overledger would send requests to [S3]: the official RPC as a private node [S3] or, if an approved provider's keyed service covers Redbelly (not confirmed), that provider's endpoint as a public node [S3]. The first registration also adds the network [S3]. This is one form or one API call [S3].</w:t>
+      </w:r>
+    </w:p>
+    <w:p>
+      <w:pPr>
+        <w:pStyle w:val="ListBullet"/>
       </w:pPr>
       <w:r>
         <w:t>Level 1, step 2: the node has to pass Overledger's health check [S3]. If the check fails, the node is not added, and the docs do not say what would happen next. For scale, a checker for a brand-new chain family is documented at about 2 days [S3].</w:t>
@@ -1125,7 +1162,7 @@
     </w:p>
     <w:p>
       <w:pPr>
-        <w:pStyle w:val="ListNumber"/>
+        <w:pStyle w:val="ListBullet"/>
       </w:pPr>
       <w:r>
         <w:t>Level 1, step 3: every address an institution sends from needs Redbelly write access, which its user enables after claiming an access credential from an accredited issuer [S5]. The organisation can also be verified as a business [S19]. They sign with their own keys and send the signed transaction, which the Gateway forwards unchanged [S3].</w:t>
@@ -1133,7 +1170,7 @@
     </w:p>
     <w:p>
       <w:pPr>
-        <w:pStyle w:val="ListNumber"/>
+        <w:pStyle w:val="ListBullet"/>
       </w:pPr>
       <w:r>
         <w:t>Level 3, step 1: the rollup's standard bridge and dispute contracts are deployed on Redbelly [S6], from accounts that hold Redbelly access [S5]. These are the contracts that hold tokens sent to the rollup and let a challenger dispute its state during the dispute window [S6].</w:t>
@@ -1141,7 +1178,7 @@
     </w:p>
     <w:p>
       <w:pPr>
-        <w:pStyle w:val="ListNumber"/>
+        <w:pStyle w:val="ListBullet"/>
       </w:pPr>
       <w:r>
         <w:t>Level 3, step 2: the rollup's services start posting rollup state roots, short fingerprints of the rollup's balances, to Redbelly for settlement [S6].</w:t>
@@ -1149,7 +1186,7 @@
     </w:p>
     <w:p>
       <w:pPr>
-        <w:pStyle w:val="ListNumber"/>
+        <w:pStyle w:val="ListBullet"/>
       </w:pPr>
       <w:r>
         <w:t>Level 3, step 3: each token that should move is added to the bridge token list by Quant's governance [S37].</w:t>
@@ -1157,7 +1194,7 @@
     </w:p>
     <w:p>
       <w:pPr>
-        <w:pStyle w:val="ListNumber"/>
+        <w:pStyle w:val="ListBullet"/>
       </w:pPr>
       <w:r>
         <w:t>Level 3, step 4: issuers decide whether their asset contracts may hold or release tokens to the bridge contract, because Tokeniser checks eligibility on every transfer [S9].</w:t>
@@ -1165,7 +1202,7 @@
     </w:p>
     <w:p>
       <w:pPr>
-        <w:pStyle w:val="ListNumber"/>
+        <w:pStyle w:val="ListBullet"/>
       </w:pPr>
       <w:r>
         <w:t>Level 3, step 5: someone would have to keep Overledger's own allowlists [S37] in step with Receptor credentials [S5], because neither system's documentation describes a link to the other.</w:t>
@@ -1237,7 +1274,7 @@
         <w:pStyle w:val="ListBullet"/>
       </w:pPr>
       <w:r>
-        <w:t>No known route to tokenised deposit networks yet. The Clearing House network will use Quant's technology for its interoperability layer [S10], but the announcements do not say which chains it will use. Whether it will ever reach Redbelly, or any public chain, is unknown [S10].</w:t>
+        <w:t>No known route to tokenised deposit networks. The Clearing House network will use Quant's technology for its interoperability layer [S10], but neither announcement names the chains it will use or mentions Redbelly. Whether it will ever reach Redbelly, or any public chain, is unknown [S10].</w:t>
       </w:r>
     </w:p>
     <w:p>
@@ -1284,8 +1321,8 @@
       <w:r>
         <w:drawing>
           <wp:inline xmlns:a="http://schemas.openxmlformats.org/drawingml/2006/main" xmlns:pic="http://schemas.openxmlformats.org/drawingml/2006/picture">
-            <wp:extent cx="6120000" cy="4284000"/>
-            <wp:docPr id="6" name="Picture 6"/>
+            <wp:extent cx="5760000" cy="4032000"/>
+            <wp:docPr id="6" name="Picture 6" descr="Figure 6. Which Receptor checks could work off Redbelly. Receptor has two methods [S25]. Proof by Query runs in a verifier contract against identity state on Redbelly [S8]. Selective Disclosure uses BBS+ signatures and is checked off-chain [S26], so in principle it could be checked anywhere, including by an externally hosted Overledger app [S13], but the app catalogue is not public, so whether one does this is unknown [S14]. The access credential unlocks write access on Redbelly, and no source shows another chain reading it [S5]."/>
             <wp:cNvGraphicFramePr>
               <a:graphicFrameLocks noChangeAspect="1"/>
             </wp:cNvGraphicFramePr>
@@ -1305,7 +1342,7 @@
                   <pic:spPr>
                     <a:xfrm>
                       <a:off x="0" y="0"/>
-                      <a:ext cx="6120000" cy="4284000"/>
+                      <a:ext cx="5760000" cy="4032000"/>
                     </a:xfrm>
                     <a:prstGeom prst="rect"/>
                   </pic:spPr>
@@ -1351,8 +1388,8 @@
       <w:r>
         <w:drawing>
           <wp:inline xmlns:a="http://schemas.openxmlformats.org/drawingml/2006/main" xmlns:pic="http://schemas.openxmlformats.org/drawingml/2006/picture">
-            <wp:extent cx="6120000" cy="4063680"/>
-            <wp:docPr id="7" name="Picture 7"/>
+            <wp:extent cx="5760000" cy="3824640"/>
+            <wp:docPr id="7" name="Picture 7" descr="Figure 7. Where compliance could break. Tokeniser enforces its rules on Redbelly at every transfer [S9, S29]. A bridge, such as the TASK-08 lock-and-mint pattern [S34] or the Fusion Rollup's bridge contracts [S6], locks the asset and issues a copy elsewhere; in our analysis the copy then follows the rules on that chain. Break points 5 and 7 apply to the Fusion Rollup [S6, S37]. The numbers match the list below."/>
             <wp:cNvGraphicFramePr>
               <a:graphicFrameLocks noChangeAspect="1"/>
             </wp:cNvGraphicFramePr>
@@ -1372,7 +1409,7 @@
                   <pic:spPr>
                     <a:xfrm>
                       <a:off x="0" y="0"/>
-                      <a:ext cx="6120000" cy="4063680"/>
+                      <a:ext cx="5760000" cy="3824640"/>
                     </a:xfrm>
                     <a:prstGeom prst="rect"/>
                   </pic:spPr>
@@ -1413,58 +1450,58 @@
     </w:p>
     <w:p>
       <w:pPr>
-        <w:pStyle w:val="ListNumber"/>
-      </w:pPr>
-      <w:r>
-        <w:t>A copy on another chain without eligibility checks could be passed to someone who never proved eligibility on Redbelly [S9].</w:t>
-      </w:r>
-    </w:p>
-    <w:p>
-      <w:pPr>
-        <w:pStyle w:val="ListNumber"/>
-      </w:pPr>
-      <w:r>
-        <w:t>Two lists of who is allowed: Receptor credentials on Redbelly [S5] and Overledger's allowlists [S37]. If they drift apart, one system allows what the other refuses.</w:t>
-      </w:r>
-    </w:p>
-    <w:p>
-      <w:pPr>
-        <w:pStyle w:val="ListNumber"/>
-      </w:pPr>
-      <w:r>
-        <w:t>If a holder's credential stopped being valid on Redbelly [S5], nothing documented would pass that change to a copy held elsewhere or to Overledger's allowlists [S37].</w:t>
-      </w:r>
-    </w:p>
-    <w:p>
-      <w:pPr>
-        <w:pStyle w:val="ListNumber"/>
-      </w:pPr>
-      <w:r>
-        <w:t>Merged balances [S6] could mix a restricted asset with an unrestricted copy of the same asset.</w:t>
-      </w:r>
-    </w:p>
-    <w:p>
-      <w:pPr>
-        <w:pStyle w:val="ListNumber"/>
-      </w:pPr>
-      <w:r>
-        <w:t>The list of tokens that may cross the Fusion bridge is set by Quant's governance [S37], not by the issuer.</w:t>
-      </w:r>
-    </w:p>
-    <w:p>
-      <w:pPr>
-        <w:pStyle w:val="ListNumber"/>
-      </w:pPr>
-      <w:r>
-        <w:t>Tokeniser records every transfer on the issuer's register in real time [S30], and already keeps units pledged for a loan locked until it is repaid [S31]. Units locked in a bridge contract, or held on another chain, would need similar clear treatment in that register.</w:t>
-      </w:r>
-    </w:p>
-    <w:p>
-      <w:pPr>
-        <w:pStyle w:val="ListNumber"/>
-      </w:pPr>
-      <w:r>
-        <w:t>Settlement timing changes: rollup withdrawals wait for a dispute window [S6], while Redbelly is final in one round [S9].</w:t>
+        <w:ind w:left="340" w:hanging="340"/>
+      </w:pPr>
+      <w:r>
+        <w:t>1. A copy on another chain without eligibility checks could be passed to someone who never proved eligibility on Redbelly [S9].</w:t>
+      </w:r>
+    </w:p>
+    <w:p>
+      <w:pPr>
+        <w:ind w:left="340" w:hanging="340"/>
+      </w:pPr>
+      <w:r>
+        <w:t>2. Two lists of who is allowed: Receptor credentials on Redbelly [S5] and Overledger's allowlists [S37]. If they drift apart, one system allows what the other refuses.</w:t>
+      </w:r>
+    </w:p>
+    <w:p>
+      <w:pPr>
+        <w:ind w:left="340" w:hanging="340"/>
+      </w:pPr>
+      <w:r>
+        <w:t>3. If a holder's credential stopped being valid on Redbelly [S5], nothing documented would pass that change to a copy held elsewhere or to Overledger's allowlists [S37].</w:t>
+      </w:r>
+    </w:p>
+    <w:p>
+      <w:pPr>
+        <w:ind w:left="340" w:hanging="340"/>
+      </w:pPr>
+      <w:r>
+        <w:t>4. Merged balances [S6] could mix a restricted asset with an unrestricted copy of the same asset.</w:t>
+      </w:r>
+    </w:p>
+    <w:p>
+      <w:pPr>
+        <w:ind w:left="340" w:hanging="340"/>
+      </w:pPr>
+      <w:r>
+        <w:t>5. The list of tokens that may cross the Fusion bridge is set by Quant's governance [S37], not by the issuer.</w:t>
+      </w:r>
+    </w:p>
+    <w:p>
+      <w:pPr>
+        <w:ind w:left="340" w:hanging="340"/>
+      </w:pPr>
+      <w:r>
+        <w:t>6. Tokeniser records every transfer on the issuer's register in real time [S30], and already keeps units pledged for a loan locked until it is repaid [S31]. Units locked in a bridge contract, or held on another chain, would need similar clear treatment in that register.</w:t>
+      </w:r>
+    </w:p>
+    <w:p>
+      <w:pPr>
+        <w:ind w:left="340" w:hanging="340"/>
+      </w:pPr>
+      <w:r>
+        <w:t>7. Settlement timing changes: rollup withdrawals wait for a dispute window [S6], while Redbelly is final in one round [S9].</w:t>
       </w:r>
     </w:p>
     <w:p>
@@ -1494,13 +1531,13 @@
         <w:tblLook w:firstColumn="1" w:firstRow="1" w:lastColumn="0" w:lastRow="0" w:noHBand="0" w:noVBand="1" w:val="04A0"/>
       </w:tblPr>
       <w:tblGrid>
-        <w:gridCol w:w="4986"/>
-        <w:gridCol w:w="4986"/>
+        <w:gridCol w:w="4592"/>
+        <w:gridCol w:w="4592"/>
       </w:tblGrid>
       <w:tr>
         <w:tc>
           <w:tcPr>
-            <w:tcW w:type="dxa" w:w="4986"/>
+            <w:tcW w:type="dxa" w:w="4592"/>
           </w:tcPr>
           <w:p>
             <w:r>
@@ -1510,7 +1547,7 @@
         </w:tc>
         <w:tc>
           <w:tcPr>
-            <w:tcW w:type="dxa" w:w="4986"/>
+            <w:tcW w:type="dxa" w:w="4592"/>
           </w:tcPr>
           <w:p>
             <w:r>
@@ -1522,7 +1559,7 @@
       <w:tr>
         <w:tc>
           <w:tcPr>
-            <w:tcW w:type="dxa" w:w="4986"/>
+            <w:tcW w:type="dxa" w:w="4592"/>
           </w:tcPr>
           <w:p>
             <w:r>
@@ -1532,7 +1569,7 @@
         </w:tc>
         <w:tc>
           <w:tcPr>
-            <w:tcW w:type="dxa" w:w="4986"/>
+            <w:tcW w:type="dxa" w:w="4592"/>
           </w:tcPr>
           <w:p>
             <w:r>
@@ -1544,7 +1581,7 @@
       <w:tr>
         <w:tc>
           <w:tcPr>
-            <w:tcW w:type="dxa" w:w="4986"/>
+            <w:tcW w:type="dxa" w:w="4592"/>
           </w:tcPr>
           <w:p>
             <w:r>
@@ -1554,7 +1591,7 @@
         </w:tc>
         <w:tc>
           <w:tcPr>
-            <w:tcW w:type="dxa" w:w="4986"/>
+            <w:tcW w:type="dxa" w:w="4592"/>
           </w:tcPr>
           <w:p>
             <w:r>
@@ -1566,7 +1603,7 @@
       <w:tr>
         <w:tc>
           <w:tcPr>
-            <w:tcW w:type="dxa" w:w="4986"/>
+            <w:tcW w:type="dxa" w:w="4592"/>
           </w:tcPr>
           <w:p>
             <w:r>
@@ -1576,7 +1613,7 @@
         </w:tc>
         <w:tc>
           <w:tcPr>
-            <w:tcW w:type="dxa" w:w="4986"/>
+            <w:tcW w:type="dxa" w:w="4592"/>
           </w:tcPr>
           <w:p>
             <w:r>
@@ -1588,7 +1625,7 @@
       <w:tr>
         <w:tc>
           <w:tcPr>
-            <w:tcW w:type="dxa" w:w="4986"/>
+            <w:tcW w:type="dxa" w:w="4592"/>
           </w:tcPr>
           <w:p>
             <w:r>
@@ -1598,7 +1635,7 @@
         </w:tc>
         <w:tc>
           <w:tcPr>
-            <w:tcW w:type="dxa" w:w="4986"/>
+            <w:tcW w:type="dxa" w:w="4592"/>
           </w:tcPr>
           <w:p>
             <w:r>
@@ -1610,7 +1647,7 @@
       <w:tr>
         <w:tc>
           <w:tcPr>
-            <w:tcW w:type="dxa" w:w="4986"/>
+            <w:tcW w:type="dxa" w:w="4592"/>
           </w:tcPr>
           <w:p>
             <w:r>
@@ -1620,7 +1657,7 @@
         </w:tc>
         <w:tc>
           <w:tcPr>
-            <w:tcW w:type="dxa" w:w="4986"/>
+            <w:tcW w:type="dxa" w:w="4592"/>
           </w:tcPr>
           <w:p>
             <w:r>
@@ -1632,7 +1669,7 @@
       <w:tr>
         <w:tc>
           <w:tcPr>
-            <w:tcW w:type="dxa" w:w="4986"/>
+            <w:tcW w:type="dxa" w:w="4592"/>
           </w:tcPr>
           <w:p>
             <w:r>
@@ -1642,7 +1679,7 @@
         </w:tc>
         <w:tc>
           <w:tcPr>
-            <w:tcW w:type="dxa" w:w="4986"/>
+            <w:tcW w:type="dxa" w:w="4592"/>
           </w:tcPr>
           <w:p>
             <w:r>
@@ -1654,7 +1691,7 @@
       <w:tr>
         <w:tc>
           <w:tcPr>
-            <w:tcW w:type="dxa" w:w="4986"/>
+            <w:tcW w:type="dxa" w:w="4592"/>
           </w:tcPr>
           <w:p>
             <w:r>
@@ -1664,7 +1701,7 @@
         </w:tc>
         <w:tc>
           <w:tcPr>
-            <w:tcW w:type="dxa" w:w="4986"/>
+            <w:tcW w:type="dxa" w:w="4592"/>
           </w:tcPr>
           <w:p>
             <w:r>
@@ -1676,7 +1713,7 @@
       <w:tr>
         <w:tc>
           <w:tcPr>
-            <w:tcW w:type="dxa" w:w="4986"/>
+            <w:tcW w:type="dxa" w:w="4592"/>
           </w:tcPr>
           <w:p>
             <w:r>
@@ -1686,7 +1723,7 @@
         </w:tc>
         <w:tc>
           <w:tcPr>
-            <w:tcW w:type="dxa" w:w="4986"/>
+            <w:tcW w:type="dxa" w:w="4592"/>
           </w:tcPr>
           <w:p>
             <w:r>
@@ -1698,7 +1735,7 @@
       <w:tr>
         <w:tc>
           <w:tcPr>
-            <w:tcW w:type="dxa" w:w="4986"/>
+            <w:tcW w:type="dxa" w:w="4592"/>
           </w:tcPr>
           <w:p>
             <w:r>
@@ -1708,7 +1745,7 @@
         </w:tc>
         <w:tc>
           <w:tcPr>
-            <w:tcW w:type="dxa" w:w="4986"/>
+            <w:tcW w:type="dxa" w:w="4592"/>
           </w:tcPr>
           <w:p>
             <w:r>
@@ -1720,7 +1757,7 @@
       <w:tr>
         <w:tc>
           <w:tcPr>
-            <w:tcW w:type="dxa" w:w="4986"/>
+            <w:tcW w:type="dxa" w:w="4592"/>
           </w:tcPr>
           <w:p>
             <w:r>
@@ -1730,7 +1767,7 @@
         </w:tc>
         <w:tc>
           <w:tcPr>
-            <w:tcW w:type="dxa" w:w="4986"/>
+            <w:tcW w:type="dxa" w:w="4592"/>
           </w:tcPr>
           <w:p>
             <w:r>
@@ -1780,7 +1817,7 @@
     </w:p>
     <w:p>
       <w:r>
-        <w:t>Overledger's Fusion Rollup, its shared layer for moving tokens between chains, does not list Redbelly among its connected networks, and the docs describe no self-serve way to add a chain. As far as public sources show, that part is not possible today.</w:t>
+        <w:t>Overledger's Fusion Rollup, its shared layer for moving tokens between chains, did not list Redbelly among the networks connected at its testnet launch, and the docs describe no self-serve way to add a chain. As far as public sources show, that part is not possible yet.</w:t>
       </w:r>
     </w:p>
     <w:p>
@@ -1790,7 +1827,7 @@
     </w:p>
     <w:p>
       <w:r>
-        <w:t>Open questions: whether Overledger would treat Redbelly as self-serve, whether Redbelly passes its network check, which chains The Clearing House network will reach, and Redbelly's own position on bridging. Full report with every source: https://overledger.vercel.app</w:t>
+        <w:t>Open questions: whether Overledger would treat Redbelly as self-serve, whether Redbelly passes its health check, which chains The Clearing House network will reach, and Redbelly's own position on bridging. Full report with every source: https://overledger.vercel.app</w:t>
       </w:r>
     </w:p>
     <w:p>
@@ -1802,51 +1839,33 @@
       </w:r>
     </w:p>
     <w:p>
-      <w:pPr>
-        <w:pStyle w:val="ListNumber"/>
-      </w:pPr>
-      <w:r>
-        <w:t>1/ The Clearing House picked Quant to power its tokenised deposit network, so people are asking: could Redbelly connect to Quant's Overledger? We read the public docs. No partnership or talks between Redbelly and Quant have been announced.</w:t>
-      </w:r>
-    </w:p>
-    <w:p>
-      <w:pPr>
-        <w:pStyle w:val="ListNumber"/>
-      </w:pPr>
-      <w:r>
-        <w:t>2/ Overledger reaches many chains through one interface. Its self-serve route covers EVM chains, and Redbelly is EVM compatible. A basic connection for reading data and sending signed transactions looks possible, but it is untested.</w:t>
-      </w:r>
-    </w:p>
-    <w:p>
-      <w:pPr>
-        <w:pStyle w:val="ListNumber"/>
-      </w:pPr>
+      <w:r>
+        <w:t>1/ The Clearing House picked Quant to power its tokenised deposit network, so people are asking: could Redbelly connect to Quant's Overledger? We read the public docs. Neither announcement mentions Redbelly, and no partnership or talks have been announced.</w:t>
+      </w:r>
+    </w:p>
+    <w:p>
+      <w:r>
+        <w:t>2/ Overledger reaches many chains through one interface. Its self-serve route covers EVM chains, and Redbelly is EVM compatible. A basic connection for reading data and sending signed transactions looks possible, but it is unconfirmed and untested.</w:t>
+      </w:r>
+    </w:p>
+    <w:p>
       <w:r>
         <w:t>3/ Redbelly's rules still apply on that route. Every account that sends a transaction needs a Redbelly access credential, and Tokeniser checks eligibility on every transfer of its assets.</w:t>
       </w:r>
     </w:p>
     <w:p>
-      <w:pPr>
-        <w:pStyle w:val="ListNumber"/>
-      </w:pPr>
-      <w:r>
-        <w:t>4/ Overledger's Fusion Rollup, which moves tokens between connected chains, does not list Redbelly, and the docs describe no self-serve way to add a chain. As far as public sources show, not possible today.</w:t>
-      </w:r>
-    </w:p>
-    <w:p>
-      <w:pPr>
-        <w:pStyle w:val="ListNumber"/>
-      </w:pPr>
+      <w:r>
+        <w:t>4/ Overledger's Fusion Rollup, which moves tokens between connected chains, did not list Redbelly at its testnet launch, and the docs describe no self-serve way to add a chain. As far as public sources show, that is not possible yet.</w:t>
+      </w:r>
+    </w:p>
+    <w:p>
       <w:r>
         <w:t>5/ Our reading of the docs: Receptor credentials and Tokeniser rules do not travel with a token to another chain by themselves, so a copy elsewhere follows that chain's rules. Keeping regulated assets on Redbelly avoids the gap.</w:t>
       </w:r>
     </w:p>
     <w:p>
-      <w:pPr>
-        <w:pStyle w:val="ListNumber"/>
-      </w:pPr>
-      <w:r>
-        <w:t>6/ Still unknown: whether Overledger would treat Redbelly as self-serve, since writing needs a credential, which chains The Clearing House network will reach, and Redbelly's position on bridging. Full report with every source: https://overledger.vercel.app</w:t>
+      <w:r>
+        <w:t>6/ Still unknown: whether Overledger would treat Redbelly as self-serve, since writing needs a credential; which chains The Clearing House network will reach; and Redbelly's position on bridging. Full report with every source: https://overledger.vercel.app</w:t>
       </w:r>
     </w:p>
     <w:p>
@@ -1891,6 +1910,9 @@
       </w:hyperlink>
     </w:p>
     <w:p>
+      <w:pPr>
+        <w:keepNext/>
+      </w:pPr>
       <w:r>
         <w:rPr>
           <w:b/>
@@ -1899,6 +1921,9 @@
       </w:r>
     </w:p>
     <w:p>
+      <w:pPr>
+        <w:keepNext/>
+      </w:pPr>
       <w:hyperlink r:id="rId19">
         <w:r>
           <w:rPr>
@@ -1926,6 +1951,9 @@
       </w:r>
     </w:p>
     <w:p>
+      <w:pPr>
+        <w:keepNext/>
+      </w:pPr>
       <w:r>
         <w:rPr>
           <w:b/>
@@ -1934,6 +1962,9 @@
       </w:r>
     </w:p>
     <w:p>
+      <w:pPr>
+        <w:keepNext/>
+      </w:pPr>
       <w:hyperlink r:id="rId20">
         <w:r>
           <w:rPr>
@@ -1953,6 +1984,9 @@
       </w:r>
     </w:p>
     <w:p>
+      <w:pPr>
+        <w:keepNext/>
+      </w:pPr>
       <w:r>
         <w:rPr>
           <w:b/>
@@ -1961,6 +1995,9 @@
       </w:r>
     </w:p>
     <w:p>
+      <w:pPr>
+        <w:keepNext/>
+      </w:pPr>
       <w:hyperlink r:id="rId21">
         <w:r>
           <w:rPr>
@@ -2140,6 +2177,9 @@
       </w:r>
     </w:p>
     <w:p>
+      <w:pPr>
+        <w:keepNext/>
+      </w:pPr>
       <w:r>
         <w:rPr>
           <w:b/>
@@ -2148,6 +2188,9 @@
       </w:r>
     </w:p>
     <w:p>
+      <w:pPr>
+        <w:keepNext/>
+      </w:pPr>
       <w:hyperlink r:id="rId22">
         <w:r>
           <w:rPr>
@@ -2187,10 +2230,13 @@
         <w:pStyle w:val="ListBullet"/>
       </w:pPr>
       <w:r>
-        <w:t>“eth_getBlockByNumber -&gt; {"jsonrpc":"2.0","id":1,"result":{”</w:t>
-      </w:r>
-    </w:p>
-    <w:p>
+        <w:t>“eth_getBlockByNumber -&gt; {"jsonrpc":"2.0","id":1,"result":{"baseFeePerGas":"0xe0fbb4df40c0"”</w:t>
+      </w:r>
+    </w:p>
+    <w:p>
+      <w:pPr>
+        <w:keepNext/>
+      </w:pPr>
       <w:r>
         <w:rPr>
           <w:b/>
@@ -2199,6 +2245,9 @@
       </w:r>
     </w:p>
     <w:p>
+      <w:pPr>
+        <w:keepNext/>
+      </w:pPr>
       <w:hyperlink r:id="rId23">
         <w:r>
           <w:rPr>
@@ -2218,6 +2267,9 @@
       </w:r>
     </w:p>
     <w:p>
+      <w:pPr>
+        <w:keepNext/>
+      </w:pPr>
       <w:r>
         <w:rPr>
           <w:b/>
@@ -2226,6 +2278,9 @@
       </w:r>
     </w:p>
     <w:p>
+      <w:pPr>
+        <w:keepNext/>
+      </w:pPr>
       <w:hyperlink r:id="rId24">
         <w:r>
           <w:rPr>
@@ -2285,6 +2340,9 @@
       </w:r>
     </w:p>
     <w:p>
+      <w:pPr>
+        <w:keepNext/>
+      </w:pPr>
       <w:r>
         <w:rPr>
           <w:b/>
@@ -2293,6 +2351,9 @@
       </w:r>
     </w:p>
     <w:p>
+      <w:pPr>
+        <w:keepNext/>
+      </w:pPr>
       <w:hyperlink r:id="rId25">
         <w:r>
           <w:rPr>
@@ -2320,6 +2381,9 @@
       </w:r>
     </w:p>
     <w:p>
+      <w:pPr>
+        <w:keepNext/>
+      </w:pPr>
       <w:r>
         <w:rPr>
           <w:b/>
@@ -2328,6 +2392,9 @@
       </w:r>
     </w:p>
     <w:p>
+      <w:pPr>
+        <w:keepNext/>
+      </w:pPr>
       <w:hyperlink r:id="rId26">
         <w:r>
           <w:rPr>
@@ -2355,6 +2422,9 @@
       </w:r>
     </w:p>
     <w:p>
+      <w:pPr>
+        <w:keepNext/>
+      </w:pPr>
       <w:r>
         <w:rPr>
           <w:b/>
@@ -2363,6 +2433,9 @@
       </w:r>
     </w:p>
     <w:p>
+      <w:pPr>
+        <w:keepNext/>
+      </w:pPr>
       <w:hyperlink r:id="rId27">
         <w:r>
           <w:rPr>
@@ -2414,6 +2487,9 @@
       </w:r>
     </w:p>
     <w:p>
+      <w:pPr>
+        <w:keepNext/>
+      </w:pPr>
       <w:r>
         <w:rPr>
           <w:b/>
@@ -2422,6 +2498,9 @@
       </w:r>
     </w:p>
     <w:p>
+      <w:pPr>
+        <w:keepNext/>
+      </w:pPr>
       <w:hyperlink r:id="rId28">
         <w:r>
           <w:rPr>
@@ -2465,6 +2544,9 @@
       </w:r>
     </w:p>
     <w:p>
+      <w:pPr>
+        <w:keepNext/>
+      </w:pPr>
       <w:r>
         <w:rPr>
           <w:b/>
@@ -2473,6 +2555,9 @@
       </w:r>
     </w:p>
     <w:p>
+      <w:pPr>
+        <w:keepNext/>
+      </w:pPr>
       <w:hyperlink r:id="rId29">
         <w:r>
           <w:rPr>
@@ -2492,6 +2577,9 @@
       </w:r>
     </w:p>
     <w:p>
+      <w:pPr>
+        <w:keepNext/>
+      </w:pPr>
       <w:r>
         <w:rPr>
           <w:b/>
@@ -2500,6 +2588,9 @@
       </w:r>
     </w:p>
     <w:p>
+      <w:pPr>
+        <w:keepNext/>
+      </w:pPr>
       <w:hyperlink r:id="rId30">
         <w:r>
           <w:rPr>
@@ -2535,6 +2626,9 @@
       </w:r>
     </w:p>
     <w:p>
+      <w:pPr>
+        <w:keepNext/>
+      </w:pPr>
       <w:r>
         <w:rPr>
           <w:b/>
@@ -2543,6 +2637,9 @@
       </w:r>
     </w:p>
     <w:p>
+      <w:pPr>
+        <w:keepNext/>
+      </w:pPr>
       <w:hyperlink r:id="rId31">
         <w:r>
           <w:rPr>
@@ -2634,6 +2731,9 @@
       </w:r>
     </w:p>
     <w:p>
+      <w:pPr>
+        <w:keepNext/>
+      </w:pPr>
       <w:r>
         <w:rPr>
           <w:b/>
@@ -2642,6 +2742,9 @@
       </w:r>
     </w:p>
     <w:p>
+      <w:pPr>
+        <w:keepNext/>
+      </w:pPr>
       <w:hyperlink r:id="rId32">
         <w:r>
           <w:rPr>
@@ -2693,6 +2796,9 @@
       </w:r>
     </w:p>
     <w:p>
+      <w:pPr>
+        <w:keepNext/>
+      </w:pPr>
       <w:r>
         <w:rPr>
           <w:b/>
@@ -2701,6 +2807,9 @@
       </w:r>
     </w:p>
     <w:p>
+      <w:pPr>
+        <w:keepNext/>
+      </w:pPr>
       <w:hyperlink r:id="rId33">
         <w:r>
           <w:rPr>
@@ -2720,6 +2829,9 @@
       </w:r>
     </w:p>
     <w:p>
+      <w:pPr>
+        <w:keepNext/>
+      </w:pPr>
       <w:r>
         <w:rPr>
           <w:b/>
@@ -2728,6 +2840,9 @@
       </w:r>
     </w:p>
     <w:p>
+      <w:pPr>
+        <w:keepNext/>
+      </w:pPr>
       <w:hyperlink r:id="rId34">
         <w:r>
           <w:rPr>
@@ -2763,6 +2878,9 @@
       </w:r>
     </w:p>
     <w:p>
+      <w:pPr>
+        <w:keepNext/>
+      </w:pPr>
       <w:r>
         <w:rPr>
           <w:b/>
@@ -2771,6 +2889,9 @@
       </w:r>
     </w:p>
     <w:p>
+      <w:pPr>
+        <w:keepNext/>
+      </w:pPr>
       <w:hyperlink r:id="rId35">
         <w:r>
           <w:rPr>
@@ -2798,6 +2919,9 @@
       </w:r>
     </w:p>
     <w:p>
+      <w:pPr>
+        <w:keepNext/>
+      </w:pPr>
       <w:r>
         <w:rPr>
           <w:b/>
@@ -2806,6 +2930,9 @@
       </w:r>
     </w:p>
     <w:p>
+      <w:pPr>
+        <w:keepNext/>
+      </w:pPr>
       <w:hyperlink r:id="rId36">
         <w:r>
           <w:rPr>
@@ -2825,6 +2952,9 @@
       </w:r>
     </w:p>
     <w:p>
+      <w:pPr>
+        <w:keepNext/>
+      </w:pPr>
       <w:r>
         <w:rPr>
           <w:b/>
@@ -2833,6 +2963,9 @@
       </w:r>
     </w:p>
     <w:p>
+      <w:pPr>
+        <w:keepNext/>
+      </w:pPr>
       <w:hyperlink r:id="rId37">
         <w:r>
           <w:rPr>
@@ -2852,6 +2985,9 @@
       </w:r>
     </w:p>
     <w:p>
+      <w:pPr>
+        <w:keepNext/>
+      </w:pPr>
       <w:r>
         <w:rPr>
           <w:b/>
@@ -2860,6 +2996,9 @@
       </w:r>
     </w:p>
     <w:p>
+      <w:pPr>
+        <w:keepNext/>
+      </w:pPr>
       <w:hyperlink r:id="rId38">
         <w:r>
           <w:rPr>
@@ -2887,6 +3026,9 @@
       </w:r>
     </w:p>
     <w:p>
+      <w:pPr>
+        <w:keepNext/>
+      </w:pPr>
       <w:r>
         <w:rPr>
           <w:b/>
@@ -2895,6 +3037,9 @@
       </w:r>
     </w:p>
     <w:p>
+      <w:pPr>
+        <w:keepNext/>
+      </w:pPr>
       <w:hyperlink r:id="rId39">
         <w:r>
           <w:rPr>
@@ -2922,6 +3067,9 @@
       </w:r>
     </w:p>
     <w:p>
+      <w:pPr>
+        <w:keepNext/>
+      </w:pPr>
       <w:r>
         <w:rPr>
           <w:b/>
@@ -2930,6 +3078,9 @@
       </w:r>
     </w:p>
     <w:p>
+      <w:pPr>
+        <w:keepNext/>
+      </w:pPr>
       <w:hyperlink r:id="rId40">
         <w:r>
           <w:rPr>
@@ -2949,6 +3100,9 @@
       </w:r>
     </w:p>
     <w:p>
+      <w:pPr>
+        <w:keepNext/>
+      </w:pPr>
       <w:r>
         <w:rPr>
           <w:b/>
@@ -2957,6 +3111,9 @@
       </w:r>
     </w:p>
     <w:p>
+      <w:pPr>
+        <w:keepNext/>
+      </w:pPr>
       <w:hyperlink r:id="rId41">
         <w:r>
           <w:rPr>
@@ -2984,6 +3141,9 @@
       </w:r>
     </w:p>
     <w:p>
+      <w:pPr>
+        <w:keepNext/>
+      </w:pPr>
       <w:r>
         <w:rPr>
           <w:b/>
@@ -2992,6 +3152,9 @@
       </w:r>
     </w:p>
     <w:p>
+      <w:pPr>
+        <w:keepNext/>
+      </w:pPr>
       <w:hyperlink r:id="rId42">
         <w:r>
           <w:rPr>
@@ -3019,6 +3182,9 @@
       </w:r>
     </w:p>
     <w:p>
+      <w:pPr>
+        <w:keepNext/>
+      </w:pPr>
       <w:r>
         <w:rPr>
           <w:b/>
@@ -3027,6 +3193,9 @@
       </w:r>
     </w:p>
     <w:p>
+      <w:pPr>
+        <w:keepNext/>
+      </w:pPr>
       <w:hyperlink r:id="rId43">
         <w:r>
           <w:rPr>
@@ -3046,6 +3215,9 @@
       </w:r>
     </w:p>
     <w:p>
+      <w:pPr>
+        <w:keepNext/>
+      </w:pPr>
       <w:r>
         <w:rPr>
           <w:b/>
@@ -3054,6 +3226,9 @@
       </w:r>
     </w:p>
     <w:p>
+      <w:pPr>
+        <w:keepNext/>
+      </w:pPr>
       <w:hyperlink r:id="rId44">
         <w:r>
           <w:rPr>
@@ -3081,6 +3256,9 @@
       </w:r>
     </w:p>
     <w:p>
+      <w:pPr>
+        <w:keepNext/>
+      </w:pPr>
       <w:r>
         <w:rPr>
           <w:b/>
@@ -3089,6 +3267,9 @@
       </w:r>
     </w:p>
     <w:p>
+      <w:pPr>
+        <w:keepNext/>
+      </w:pPr>
       <w:hyperlink r:id="rId45">
         <w:r>
           <w:rPr>
@@ -3108,6 +3289,9 @@
       </w:r>
     </w:p>
     <w:p>
+      <w:pPr>
+        <w:keepNext/>
+      </w:pPr>
       <w:r>
         <w:rPr>
           <w:b/>
@@ -3116,6 +3300,9 @@
       </w:r>
     </w:p>
     <w:p>
+      <w:pPr>
+        <w:keepNext/>
+      </w:pPr>
       <w:hyperlink r:id="rId46">
         <w:r>
           <w:rPr>
@@ -3135,6 +3322,9 @@
       </w:r>
     </w:p>
     <w:p>
+      <w:pPr>
+        <w:keepNext/>
+      </w:pPr>
       <w:r>
         <w:rPr>
           <w:b/>
@@ -3143,6 +3333,9 @@
       </w:r>
     </w:p>
     <w:p>
+      <w:pPr>
+        <w:keepNext/>
+      </w:pPr>
       <w:hyperlink r:id="rId47">
         <w:r>
           <w:rPr>
@@ -3162,6 +3355,9 @@
       </w:r>
     </w:p>
     <w:p>
+      <w:pPr>
+        <w:keepNext/>
+      </w:pPr>
       <w:r>
         <w:rPr>
           <w:b/>
@@ -3170,6 +3366,9 @@
       </w:r>
     </w:p>
     <w:p>
+      <w:pPr>
+        <w:keepNext/>
+      </w:pPr>
       <w:hyperlink r:id="rId48">
         <w:r>
           <w:rPr>
@@ -3189,6 +3388,9 @@
       </w:r>
     </w:p>
     <w:p>
+      <w:pPr>
+        <w:keepNext/>
+      </w:pPr>
       <w:r>
         <w:rPr>
           <w:b/>
@@ -3197,6 +3399,9 @@
       </w:r>
     </w:p>
     <w:p>
+      <w:pPr>
+        <w:keepNext/>
+      </w:pPr>
       <w:hyperlink r:id="rId49">
         <w:r>
           <w:rPr>
@@ -3216,6 +3421,9 @@
       </w:r>
     </w:p>
     <w:p>
+      <w:pPr>
+        <w:keepNext/>
+      </w:pPr>
       <w:r>
         <w:rPr>
           <w:b/>
@@ -3224,6 +3432,9 @@
       </w:r>
     </w:p>
     <w:p>
+      <w:pPr>
+        <w:keepNext/>
+      </w:pPr>
       <w:hyperlink r:id="rId50">
         <w:r>
           <w:rPr>
@@ -3243,6 +3454,9 @@
       </w:r>
     </w:p>
     <w:p>
+      <w:pPr>
+        <w:keepNext/>
+      </w:pPr>
       <w:r>
         <w:rPr>
           <w:b/>
@@ -3251,6 +3465,9 @@
       </w:r>
     </w:p>
     <w:p>
+      <w:pPr>
+        <w:keepNext/>
+      </w:pPr>
       <w:hyperlink r:id="rId51">
         <w:r>
           <w:rPr>
@@ -3278,6 +3495,9 @@
       </w:r>
     </w:p>
     <w:p>
+      <w:pPr>
+        <w:keepNext/>
+      </w:pPr>
       <w:r>
         <w:rPr>
           <w:b/>
@@ -3286,6 +3506,9 @@
       </w:r>
     </w:p>
     <w:p>
+      <w:pPr>
+        <w:keepNext/>
+      </w:pPr>
       <w:hyperlink r:id="rId52">
         <w:r>
           <w:rPr>
@@ -3313,6 +3536,9 @@
       </w:r>
     </w:p>
     <w:p>
+      <w:pPr>
+        <w:keepNext/>
+      </w:pPr>
       <w:r>
         <w:rPr>
           <w:b/>
@@ -3321,6 +3547,9 @@
       </w:r>
     </w:p>
     <w:p>
+      <w:pPr>
+        <w:keepNext/>
+      </w:pPr>
       <w:hyperlink r:id="rId53">
         <w:r>
           <w:rPr>
@@ -3348,6 +3577,9 @@
       </w:r>
     </w:p>
     <w:p>
+      <w:pPr>
+        <w:keepNext/>
+      </w:pPr>
       <w:r>
         <w:rPr>
           <w:b/>
@@ -3356,6 +3588,9 @@
       </w:r>
     </w:p>
     <w:p>
+      <w:pPr>
+        <w:keepNext/>
+      </w:pPr>
       <w:hyperlink r:id="rId54">
         <w:r>
           <w:rPr>
@@ -3375,6 +3610,9 @@
       </w:r>
     </w:p>
     <w:p>
+      <w:pPr>
+        <w:keepNext/>
+      </w:pPr>
       <w:r>
         <w:rPr>
           <w:b/>
@@ -3383,6 +3621,9 @@
       </w:r>
     </w:p>
     <w:p>
+      <w:pPr>
+        <w:keepNext/>
+      </w:pPr>
       <w:hyperlink r:id="rId55">
         <w:r>
           <w:rPr>
@@ -3410,6 +3651,9 @@
       </w:r>
     </w:p>
     <w:p>
+      <w:pPr>
+        <w:keepNext/>
+      </w:pPr>
       <w:r>
         <w:rPr>
           <w:b/>
@@ -3418,6 +3662,9 @@
       </w:r>
     </w:p>
     <w:p>
+      <w:pPr>
+        <w:keepNext/>
+      </w:pPr>
       <w:hyperlink r:id="rId56">
         <w:r>
           <w:rPr>
@@ -3437,8 +3684,8 @@
       </w:r>
     </w:p>
     <w:sectPr>
-      <w:pgSz w:w="12240" w:h="15840"/>
-      <w:pgMar w:top="1440" w:right="1134" w:bottom="1440" w:left="1134" w:header="720" w:footer="720" w:gutter="0"/>
+      <w:pgSz w:w="11906" w:h="16838"/>
+      <w:pgMar w:top="1440" w:right="1361" w:bottom="1440" w:left="1361" w:header="720" w:footer="720" w:gutter="0"/>
       <w:cols w:space="720"/>
       <w:docGrid w:linePitch="360"/>
     </w:sectPr>
@@ -3811,7 +4058,7 @@
     <w:rsid w:val="00FC693F"/>
     <w:rPr>
       <w:rFonts w:ascii="Calibri" w:hAnsi="Calibri"/>
-      <w:sz w:val="21"/>
+      <w:sz w:val="22"/>
     </w:rPr>
   </w:style>
   <w:style w:type="paragraph" w:styleId="Header">
@@ -3876,7 +4123,7 @@
       <w:rFonts w:asciiTheme="majorHAnsi" w:eastAsiaTheme="majorEastAsia" w:hAnsiTheme="majorHAnsi" w:cstheme="majorBidi"/>
       <w:b/>
       <w:bCs/>
-      <w:color w:val="365F91" w:themeColor="accent1" w:themeShade="BF"/>
+      <w:color w:val="0F1A22"/>
       <w:sz w:val="28"/>
       <w:szCs w:val="28"/>
     </w:rPr>
@@ -3900,7 +4147,7 @@
       <w:rFonts w:asciiTheme="majorHAnsi" w:eastAsiaTheme="majorEastAsia" w:hAnsiTheme="majorHAnsi" w:cstheme="majorBidi"/>
       <w:b/>
       <w:bCs/>
-      <w:color w:val="4F81BD" w:themeColor="accent1"/>
+      <w:color w:val="0F1A22"/>
       <w:sz w:val="26"/>
       <w:szCs w:val="26"/>
     </w:rPr>
@@ -4163,7 +4410,7 @@
     </w:pPr>
     <w:rPr>
       <w:rFonts w:asciiTheme="majorHAnsi" w:eastAsiaTheme="majorEastAsia" w:hAnsiTheme="majorHAnsi" w:cstheme="majorBidi"/>
-      <w:color w:val="17365D" w:themeColor="text2" w:themeShade="BF"/>
+      <w:color w:val="0F1A22"/>
       <w:spacing w:val="5"/>
       <w:kern w:val="28"/>
       <w:sz w:val="52"/>

</xml_diff>

<commit_message>
Point repository links to hildecorp/redbelly-dao-overledger
</commit_message>
<xml_diff>
--- a/public/downloads/redbelly-overledger-feasibility-report.docx
+++ b/public/downloads/redbelly-overledger-feasibility-report.docx
@@ -1794,7 +1794,7 @@
         <w:t xml:space="preserve">[Method] </w:t>
       </w:r>
       <w:r>
-        <w:t>Every source page was saved as a text snapshot on 15 October 2026, with its address, capture time and SHA-256 hash in evidence/manifest.json. The snapshots, the manifest and our test logs are published with the website under /evidence and in the project repository, https://github.com/hildecorp/overledger. Each factual claim cites a fact, and each fact quotes its source word for word. The script scripts/check.py in that repository confirms that every quote is in its snapshot, that every Confirmed paragraph cites a source, and that the text has no partnership wording, no investment language, no dashes and no emoji. We ran the RPC and API calls ourselves, and kept the full output in evidence/tests. We did not create an Overledger account, so nothing here was tested inside Overledger.</w:t>
+        <w:t>Every source page was saved as a text snapshot on 15 October 2026, with its address, capture time and SHA-256 hash in evidence/manifest.json. The snapshots, the manifest and our test logs are published with the website under /evidence and in the project repository, https://github.com/hildecorp/redbelly-dao-overledger. Each factual claim cites a fact, and each fact quotes its source word for word. The script scripts/check.py in that repository confirms that every quote is in its snapshot, that every Confirmed paragraph cites a source, and that the text has no partnership wording, no investment language, no dashes and no emoji. We ran the RPC and API calls ourselves, and kept the full output in evidence/tests. We did not create an Overledger account, so nothing here was tested inside Overledger.</w:t>
       </w:r>
     </w:p>
     <w:p>
@@ -1905,7 +1905,7 @@
             <w:color w:val="B3272A"/>
             <w:u w:val="single"/>
           </w:rPr>
-          <w:t xml:space="preserve">https://github.com/hildecorp/overledger</w:t>
+          <w:t xml:space="preserve">https://github.com/hildecorp/redbelly-dao-overledger</w:t>
         </w:r>
       </w:hyperlink>
     </w:p>

</xml_diff>